<commit_message>
Geodezia 1 Zadanie 2: doplnene namerane hodnoty zo zapisnika
Co-Authored-By: Claude Opus 5.5 (1M context) <noreply@anthropic.com>
</commit_message>
<xml_diff>
--- a/ZS_2026-27/Geodezia_1/Zadania/MOLNAR_GEODEZIA/MOLNAR_Zadanie_2_Meranie_vodorovnych_smerov.docx
+++ b/ZS_2026-27/Geodezia_1/Zadania/MOLNAR_GEODEZIA/MOLNAR_Zadanie_2_Meranie_vodorovnych_smerov.docx
@@ -824,7 +824,7 @@
       </w:pPr>
       <w:r>
         <w:rPr/>
-        <w:t xml:space="preserve">Elaborát bol vypracovaný na základe zadania č. 2 z predmetu Geodézia 1, ktoré zadal doc. Ing. Marián Marčiš, PhD. dňa 28. 9. 2026. Cieľom úlohy bolo odmerať 2 vodorovné smery v troch skupinách v dvoch polohách ďalekohľadu prístrojmi Zeiss THEO 010A a Nivel System DT-2 a vypočítať zápisník meraných vodorovných smerov.</w:t>
+        <w:t xml:space="preserve">Elaborát bol vypracovaný na základe zadania č. 2 z predmetu Geodézia 1, ktoré zadal doc. Ing. Marián Marčiš, PhD. dňa 28. 9. 2026. Cieľom úlohy bolo odmerať 2 vodorovné smery v troch skupinách v dvoch polohách ďalekohľadu prístrojmi Nivel System DT-2 a Zeiss THEO 010A a vypočítať zápisník meraných vodorovných smerov.</w:t>
       </w:r>
     </w:p>
     <w:p>
@@ -1327,27 +1327,47 @@
       </w:pPr>
       <w:r>
         <w:rPr/>
-        <w:t xml:space="preserve">Z troch skupín prístrojom Zeiss THEO 010A sme určili vodorovný uhol ω = </w:t>
+        <w:t xml:space="preserve">Z troch skupín prístrojom Nivel System DT-2 sme určili vodorovný uhol ω = 11,4884</w:t>
       </w:r>
       <w:r>
         <w:rPr>
-          <w:highlight w:val="yellow"/>
+          <w:vertAlign w:val="superscript"/>
         </w:rPr>
-        <w:t xml:space="preserve">[doplniť]</w:t>
+        <w:t xml:space="preserve">g</w:t>
       </w:r>
       <w:r>
         <w:rPr/>
-        <w:t xml:space="preserve">; prístrojom Nivel System DT-2 sme určili vodorovný uhol ω = </w:t>
+        <w:t xml:space="preserve"> (rozdiel redukovaných smerov medzi skupinami najviac 17</w:t>
       </w:r>
       <w:r>
         <w:rPr>
-          <w:highlight w:val="yellow"/>
+          <w:vertAlign w:val="superscript"/>
         </w:rPr>
-        <w:t xml:space="preserve">[doplniť]</w:t>
+        <w:t xml:space="preserve">cc</w:t>
       </w:r>
       <w:r>
         <w:rPr/>
-        <w:t xml:space="preserve">.</w:t>
+        <w:t xml:space="preserve">); prístrojom Zeiss THEO 010A sme určili vodorovný uhol ω = 11,5090</w:t>
+      </w:r>
+      <w:r>
+        <w:rPr>
+          <w:vertAlign w:val="superscript"/>
+        </w:rPr>
+        <w:t xml:space="preserve">g</w:t>
+      </w:r>
+      <w:r>
+        <w:rPr/>
+        <w:t xml:space="preserve"> (rozdiel redukovaných smerov medzi skupinami najviac 175</w:t>
+      </w:r>
+      <w:r>
+        <w:rPr>
+          <w:vertAlign w:val="superscript"/>
+        </w:rPr>
+        <w:t xml:space="preserve">cc</w:t>
+      </w:r>
+      <w:r>
+        <w:rPr/>
+        <w:t xml:space="preserve">).</w:t>
       </w:r>
     </w:p>
     <w:p>
@@ -1355,10 +1375,18 @@
         <w:spacing w:after="120"/>
       </w:pPr>
       <w:r>
+        <w:rPr/>
+        <w:t xml:space="preserve">Rozdiel uhlov z oboch prístrojov je 206</w:t>
+      </w:r>
+      <w:r>
         <w:rPr>
-          <w:highlight w:val="yellow"/>
+          <w:vertAlign w:val="superscript"/>
         </w:rPr>
-        <w:t xml:space="preserve">[porovnanie prístrojov a skupín doplním po zadaní nameraných hodnôt]</w:t>
+        <w:t xml:space="preserve">cc</w:t>
+      </w:r>
+      <w:r>
+        <w:rPr/>
+        <w:t xml:space="preserve">. Meraním v dvoch polohách ďalekohľadu sa vylúčil vplyv kolimačnej chyby a chyby horizontálnej osi, posunom nulového čítania medzi skupinami sa zmenšil vplyv chýb delenia vodorovného kruhu.</w:t>
       </w:r>
     </w:p>
     <w:p>
@@ -1517,7 +1545,7 @@
           <w:b/>
           <w:bCs/>
         </w:rPr>
-        <w:t xml:space="preserve">Prístroj: Zeiss THEO 010A</w:t>
+        <w:t xml:space="preserve">Prístroj: Nivel System DT-2</w:t>
       </w:r>
     </w:p>
     <w:tbl>
@@ -2240,11 +2268,10 @@
             </w:pPr>
             <w:r>
               <w:rPr>
-                <w:highlight w:val="yellow"/>
-                <w:sz w:val="18"/>
-                <w:szCs w:val="18"/>
-              </w:rPr>
-              <w:t xml:space="preserve">[ ]</w:t>
+                <w:sz w:val="18"/>
+                <w:szCs w:val="18"/>
+              </w:rPr>
+              <w:t xml:space="preserve">S</w:t>
             </w:r>
           </w:p>
         </w:tc>
@@ -2261,11 +2288,10 @@
             </w:pPr>
             <w:r>
               <w:rPr>
-                <w:highlight w:val="yellow"/>
-                <w:sz w:val="18"/>
-                <w:szCs w:val="18"/>
-              </w:rPr>
-              <w:t xml:space="preserve">[ ]</w:t>
+                <w:sz w:val="18"/>
+                <w:szCs w:val="18"/>
+              </w:rPr>
+              <w:t xml:space="preserve">1</w:t>
             </w:r>
           </w:p>
         </w:tc>
@@ -2298,6 +2324,13 @@
               <w:spacing w:before="20" w:after="20"/>
               <w:jc w:val="center"/>
             </w:pPr>
+            <w:r>
+              <w:rPr>
+                <w:sz w:val="18"/>
+                <w:szCs w:val="18"/>
+              </w:rPr>
+              <w:t xml:space="preserve">0</w:t>
+            </w:r>
           </w:p>
         </w:tc>
         <w:tc>
@@ -2310,6 +2343,13 @@
               <w:spacing w:before="20" w:after="20"/>
               <w:jc w:val="center"/>
             </w:pPr>
+            <w:r>
+              <w:rPr>
+                <w:sz w:val="18"/>
+                <w:szCs w:val="18"/>
+              </w:rPr>
+              <w:t xml:space="preserve">06</w:t>
+            </w:r>
           </w:p>
         </w:tc>
         <w:tc>
@@ -2322,6 +2362,13 @@
               <w:spacing w:before="20" w:after="20"/>
               <w:jc w:val="center"/>
             </w:pPr>
+            <w:r>
+              <w:rPr>
+                <w:sz w:val="18"/>
+                <w:szCs w:val="18"/>
+              </w:rPr>
+              <w:t xml:space="preserve">84</w:t>
+            </w:r>
           </w:p>
         </w:tc>
         <w:tc>
@@ -2335,6 +2382,13 @@
               <w:spacing w:before="20" w:after="20"/>
               <w:jc w:val="center"/>
             </w:pPr>
+            <w:r>
+              <w:rPr>
+                <w:sz w:val="18"/>
+                <w:szCs w:val="18"/>
+              </w:rPr>
+              <w:t xml:space="preserve">06</w:t>
+            </w:r>
           </w:p>
         </w:tc>
         <w:tc>
@@ -2348,6 +2402,13 @@
               <w:spacing w:before="20" w:after="20"/>
               <w:jc w:val="center"/>
             </w:pPr>
+            <w:r>
+              <w:rPr>
+                <w:sz w:val="18"/>
+                <w:szCs w:val="18"/>
+              </w:rPr>
+              <w:t xml:space="preserve">56</w:t>
+            </w:r>
           </w:p>
         </w:tc>
         <w:tc>
@@ -2360,6 +2421,13 @@
               <w:spacing w:before="20" w:after="20"/>
               <w:jc w:val="center"/>
             </w:pPr>
+            <w:r>
+              <w:rPr>
+                <w:sz w:val="18"/>
+                <w:szCs w:val="18"/>
+              </w:rPr>
+              <w:t xml:space="preserve">70</w:t>
+            </w:r>
           </w:p>
         </w:tc>
         <w:tc>
@@ -2372,6 +2440,13 @@
               <w:spacing w:before="20" w:after="20"/>
               <w:jc w:val="center"/>
             </w:pPr>
+            <w:r>
+              <w:rPr>
+                <w:sz w:val="18"/>
+                <w:szCs w:val="18"/>
+              </w:rPr>
+              <w:t xml:space="preserve">01</w:t>
+            </w:r>
           </w:p>
         </w:tc>
         <w:tc>
@@ -2384,6 +2459,13 @@
               <w:spacing w:before="20" w:after="20"/>
               <w:jc w:val="center"/>
             </w:pPr>
+            <w:r>
+              <w:rPr>
+                <w:sz w:val="18"/>
+                <w:szCs w:val="18"/>
+              </w:rPr>
+              <w:t xml:space="preserve">40</w:t>
+            </w:r>
           </w:p>
         </w:tc>
         <w:tc>
@@ -2397,6 +2479,13 @@
               <w:spacing w:before="20" w:after="20"/>
               <w:jc w:val="center"/>
             </w:pPr>
+            <w:r>
+              <w:rPr>
+                <w:sz w:val="18"/>
+                <w:szCs w:val="18"/>
+              </w:rPr>
+              <w:t xml:space="preserve">01</w:t>
+            </w:r>
           </w:p>
         </w:tc>
         <w:tc>
@@ -2410,6 +2499,13 @@
               <w:spacing w:before="20" w:after="20"/>
               <w:jc w:val="center"/>
             </w:pPr>
+            <w:r>
+              <w:rPr>
+                <w:sz w:val="18"/>
+                <w:szCs w:val="18"/>
+              </w:rPr>
+              <w:t xml:space="preserve">88</w:t>
+            </w:r>
           </w:p>
         </w:tc>
         <w:tc>
@@ -2422,6 +2518,13 @@
               <w:spacing w:before="20" w:after="20"/>
               <w:jc w:val="center"/>
             </w:pPr>
+            <w:r>
+              <w:rPr>
+                <w:sz w:val="18"/>
+                <w:szCs w:val="18"/>
+              </w:rPr>
+              <w:t xml:space="preserve">140</w:t>
+            </w:r>
           </w:p>
         </w:tc>
         <w:tc>
@@ -2434,6 +2537,13 @@
               <w:spacing w:before="20" w:after="20"/>
               <w:jc w:val="center"/>
             </w:pPr>
+            <w:r>
+              <w:rPr>
+                <w:sz w:val="18"/>
+                <w:szCs w:val="18"/>
+              </w:rPr>
+              <w:t xml:space="preserve">05</w:t>
+            </w:r>
           </w:p>
         </w:tc>
         <w:tc>
@@ -2446,6 +2556,13 @@
               <w:spacing w:before="20" w:after="20"/>
               <w:jc w:val="center"/>
             </w:pPr>
+            <w:r>
+              <w:rPr>
+                <w:sz w:val="18"/>
+                <w:szCs w:val="18"/>
+              </w:rPr>
+              <w:t xml:space="preserve">08</w:t>
+            </w:r>
           </w:p>
         </w:tc>
         <w:tc>
@@ -2459,6 +2576,13 @@
               <w:spacing w:before="20" w:after="20"/>
               <w:jc w:val="center"/>
             </w:pPr>
+            <w:r>
+              <w:rPr>
+                <w:sz w:val="18"/>
+                <w:szCs w:val="18"/>
+              </w:rPr>
+              <w:t xml:space="preserve">04</w:t>
+            </w:r>
           </w:p>
         </w:tc>
         <w:tc>
@@ -2472,6 +2596,13 @@
               <w:spacing w:before="20" w:after="20"/>
               <w:jc w:val="center"/>
             </w:pPr>
+            <w:r>
+              <w:rPr>
+                <w:sz w:val="18"/>
+                <w:szCs w:val="18"/>
+              </w:rPr>
+              <w:t xml:space="preserve">69</w:t>
+            </w:r>
           </w:p>
         </w:tc>
         <w:tc>
@@ -2570,6 +2701,13 @@
               <w:spacing w:before="20" w:after="20"/>
               <w:jc w:val="center"/>
             </w:pPr>
+            <w:r>
+              <w:rPr>
+                <w:sz w:val="18"/>
+                <w:szCs w:val="18"/>
+              </w:rPr>
+              <w:t xml:space="preserve">200</w:t>
+            </w:r>
           </w:p>
         </w:tc>
         <w:tc>
@@ -2582,6 +2720,13 @@
               <w:spacing w:before="20" w:after="20"/>
               <w:jc w:val="center"/>
             </w:pPr>
+            <w:r>
+              <w:rPr>
+                <w:sz w:val="18"/>
+                <w:szCs w:val="18"/>
+              </w:rPr>
+              <w:t xml:space="preserve">06</w:t>
+            </w:r>
           </w:p>
         </w:tc>
         <w:tc>
@@ -2594,6 +2739,13 @@
               <w:spacing w:before="20" w:after="20"/>
               <w:jc w:val="center"/>
             </w:pPr>
+            <w:r>
+              <w:rPr>
+                <w:sz w:val="18"/>
+                <w:szCs w:val="18"/>
+              </w:rPr>
+              <w:t xml:space="preserve">28</w:t>
+            </w:r>
           </w:p>
         </w:tc>
         <w:tc>
@@ -2607,6 +2759,13 @@
               <w:spacing w:before="20" w:after="20"/>
               <w:jc w:val="center"/>
             </w:pPr>
+            <w:r>
+              <w:rPr>
+                <w:sz w:val="18"/>
+                <w:szCs w:val="18"/>
+              </w:rPr>
+              <w:t xml:space="preserve">00</w:t>
+            </w:r>
           </w:p>
         </w:tc>
         <w:tc>
@@ -2620,6 +2779,13 @@
               <w:spacing w:before="20" w:after="20"/>
               <w:jc w:val="center"/>
             </w:pPr>
+            <w:r>
+              <w:rPr>
+                <w:sz w:val="18"/>
+                <w:szCs w:val="18"/>
+              </w:rPr>
+              <w:t xml:space="preserve">00</w:t>
+            </w:r>
           </w:p>
         </w:tc>
         <w:tc>
@@ -2632,6 +2798,13 @@
               <w:spacing w:before="20" w:after="20"/>
               <w:jc w:val="center"/>
             </w:pPr>
+            <w:r>
+              <w:rPr>
+                <w:sz w:val="18"/>
+                <w:szCs w:val="18"/>
+              </w:rPr>
+              <w:t xml:space="preserve">270</w:t>
+            </w:r>
           </w:p>
         </w:tc>
         <w:tc>
@@ -2644,6 +2817,13 @@
               <w:spacing w:before="20" w:after="20"/>
               <w:jc w:val="center"/>
             </w:pPr>
+            <w:r>
+              <w:rPr>
+                <w:sz w:val="18"/>
+                <w:szCs w:val="18"/>
+              </w:rPr>
+              <w:t xml:space="preserve">02</w:t>
+            </w:r>
           </w:p>
         </w:tc>
         <w:tc>
@@ -2656,6 +2836,13 @@
               <w:spacing w:before="20" w:after="20"/>
               <w:jc w:val="center"/>
             </w:pPr>
+            <w:r>
+              <w:rPr>
+                <w:sz w:val="18"/>
+                <w:szCs w:val="18"/>
+              </w:rPr>
+              <w:t xml:space="preserve">36</w:t>
+            </w:r>
           </w:p>
         </w:tc>
         <w:tc>
@@ -2669,6 +2856,13 @@
               <w:spacing w:before="20" w:after="20"/>
               <w:jc w:val="center"/>
             </w:pPr>
+            <w:r>
+              <w:rPr>
+                <w:sz w:val="18"/>
+                <w:szCs w:val="18"/>
+              </w:rPr>
+              <w:t xml:space="preserve">00</w:t>
+            </w:r>
           </w:p>
         </w:tc>
         <w:tc>
@@ -2682,6 +2876,13 @@
               <w:spacing w:before="20" w:after="20"/>
               <w:jc w:val="center"/>
             </w:pPr>
+            <w:r>
+              <w:rPr>
+                <w:sz w:val="18"/>
+                <w:szCs w:val="18"/>
+              </w:rPr>
+              <w:t xml:space="preserve">00</w:t>
+            </w:r>
           </w:p>
         </w:tc>
         <w:tc>
@@ -2694,6 +2895,13 @@
               <w:spacing w:before="20" w:after="20"/>
               <w:jc w:val="center"/>
             </w:pPr>
+            <w:r>
+              <w:rPr>
+                <w:sz w:val="18"/>
+                <w:szCs w:val="18"/>
+              </w:rPr>
+              <w:t xml:space="preserve">340</w:t>
+            </w:r>
           </w:p>
         </w:tc>
         <w:tc>
@@ -2706,6 +2914,13 @@
               <w:spacing w:before="20" w:after="20"/>
               <w:jc w:val="center"/>
             </w:pPr>
+            <w:r>
+              <w:rPr>
+                <w:sz w:val="18"/>
+                <w:szCs w:val="18"/>
+              </w:rPr>
+              <w:t xml:space="preserve">04</w:t>
+            </w:r>
           </w:p>
         </w:tc>
         <w:tc>
@@ -2718,6 +2933,13 @@
               <w:spacing w:before="20" w:after="20"/>
               <w:jc w:val="center"/>
             </w:pPr>
+            <w:r>
+              <w:rPr>
+                <w:sz w:val="18"/>
+                <w:szCs w:val="18"/>
+              </w:rPr>
+              <w:t xml:space="preserve">29</w:t>
+            </w:r>
           </w:p>
         </w:tc>
         <w:tc>
@@ -2731,6 +2953,13 @@
               <w:spacing w:before="20" w:after="20"/>
               <w:jc w:val="center"/>
             </w:pPr>
+            <w:r>
+              <w:rPr>
+                <w:sz w:val="18"/>
+                <w:szCs w:val="18"/>
+              </w:rPr>
+              <w:t xml:space="preserve">00</w:t>
+            </w:r>
           </w:p>
         </w:tc>
         <w:tc>
@@ -2744,6 +2973,13 @@
               <w:spacing w:before="20" w:after="20"/>
               <w:jc w:val="center"/>
             </w:pPr>
+            <w:r>
+              <w:rPr>
+                <w:sz w:val="18"/>
+                <w:szCs w:val="18"/>
+              </w:rPr>
+              <w:t xml:space="preserve">00</w:t>
+            </w:r>
           </w:p>
         </w:tc>
         <w:tc>
@@ -2757,6 +2993,15 @@
               <w:spacing w:before="20" w:after="20"/>
               <w:jc w:val="center"/>
             </w:pPr>
+            <w:r>
+              <w:rPr>
+                <w:b/>
+                <w:bCs/>
+                <w:sz w:val="18"/>
+                <w:szCs w:val="18"/>
+              </w:rPr>
+              <w:t xml:space="preserve">0</w:t>
+            </w:r>
           </w:p>
         </w:tc>
         <w:tc>
@@ -2770,6 +3015,15 @@
               <w:spacing w:before="20" w:after="20"/>
               <w:jc w:val="center"/>
             </w:pPr>
+            <w:r>
+              <w:rPr>
+                <w:b/>
+                <w:bCs/>
+                <w:sz w:val="18"/>
+                <w:szCs w:val="18"/>
+              </w:rPr>
+              <w:t xml:space="preserve">00</w:t>
+            </w:r>
           </w:p>
         </w:tc>
         <w:tc>
@@ -2783,6 +3037,15 @@
               <w:spacing w:before="20" w:after="20"/>
               <w:jc w:val="center"/>
             </w:pPr>
+            <w:r>
+              <w:rPr>
+                <w:b/>
+                <w:bCs/>
+                <w:sz w:val="18"/>
+                <w:szCs w:val="18"/>
+              </w:rPr>
+              <w:t xml:space="preserve">00</w:t>
+            </w:r>
           </w:p>
         </w:tc>
       </w:tr>
@@ -2816,11 +3079,10 @@
             </w:pPr>
             <w:r>
               <w:rPr>
-                <w:highlight w:val="yellow"/>
-                <w:sz w:val="18"/>
-                <w:szCs w:val="18"/>
-              </w:rPr>
-              <w:t xml:space="preserve">[ ]</w:t>
+                <w:sz w:val="18"/>
+                <w:szCs w:val="18"/>
+              </w:rPr>
+              <w:t xml:space="preserve">2</w:t>
             </w:r>
           </w:p>
         </w:tc>
@@ -2853,6 +3115,13 @@
               <w:spacing w:before="20" w:after="20"/>
               <w:jc w:val="center"/>
             </w:pPr>
+            <w:r>
+              <w:rPr>
+                <w:sz w:val="18"/>
+                <w:szCs w:val="18"/>
+              </w:rPr>
+              <w:t xml:space="preserve">11</w:t>
+            </w:r>
           </w:p>
         </w:tc>
         <w:tc>
@@ -2865,6 +3134,13 @@
               <w:spacing w:before="20" w:after="20"/>
               <w:jc w:val="center"/>
             </w:pPr>
+            <w:r>
+              <w:rPr>
+                <w:sz w:val="18"/>
+                <w:szCs w:val="18"/>
+              </w:rPr>
+              <w:t xml:space="preserve">55</w:t>
+            </w:r>
           </w:p>
         </w:tc>
         <w:tc>
@@ -2877,6 +3153,13 @@
               <w:spacing w:before="20" w:after="20"/>
               <w:jc w:val="center"/>
             </w:pPr>
+            <w:r>
+              <w:rPr>
+                <w:sz w:val="18"/>
+                <w:szCs w:val="18"/>
+              </w:rPr>
+              <w:t xml:space="preserve">18</w:t>
+            </w:r>
           </w:p>
         </w:tc>
         <w:tc>
@@ -2890,6 +3173,13 @@
               <w:spacing w:before="20" w:after="20"/>
               <w:jc w:val="center"/>
             </w:pPr>
+            <w:r>
+              <w:rPr>
+                <w:sz w:val="18"/>
+                <w:szCs w:val="18"/>
+              </w:rPr>
+              <w:t xml:space="preserve">55</w:t>
+            </w:r>
           </w:p>
         </w:tc>
         <w:tc>
@@ -2903,6 +3193,13 @@
               <w:spacing w:before="20" w:after="20"/>
               <w:jc w:val="center"/>
             </w:pPr>
+            <w:r>
+              <w:rPr>
+                <w:sz w:val="18"/>
+                <w:szCs w:val="18"/>
+              </w:rPr>
+              <w:t xml:space="preserve">30</w:t>
+            </w:r>
           </w:p>
         </w:tc>
         <w:tc>
@@ -2915,6 +3212,13 @@
               <w:spacing w:before="20" w:after="20"/>
               <w:jc w:val="center"/>
             </w:pPr>
+            <w:r>
+              <w:rPr>
+                <w:sz w:val="18"/>
+                <w:szCs w:val="18"/>
+              </w:rPr>
+              <w:t xml:space="preserve">81</w:t>
+            </w:r>
           </w:p>
         </w:tc>
         <w:tc>
@@ -2927,6 +3231,13 @@
               <w:spacing w:before="20" w:after="20"/>
               <w:jc w:val="center"/>
             </w:pPr>
+            <w:r>
+              <w:rPr>
+                <w:sz w:val="18"/>
+                <w:szCs w:val="18"/>
+              </w:rPr>
+              <w:t xml:space="preserve">51</w:t>
+            </w:r>
           </w:p>
         </w:tc>
         <w:tc>
@@ -2939,6 +3250,13 @@
               <w:spacing w:before="20" w:after="20"/>
               <w:jc w:val="center"/>
             </w:pPr>
+            <w:r>
+              <w:rPr>
+                <w:sz w:val="18"/>
+                <w:szCs w:val="18"/>
+              </w:rPr>
+              <w:t xml:space="preserve">04</w:t>
+            </w:r>
           </w:p>
         </w:tc>
         <w:tc>
@@ -2952,6 +3270,13 @@
               <w:spacing w:before="20" w:after="20"/>
               <w:jc w:val="center"/>
             </w:pPr>
+            <w:r>
+              <w:rPr>
+                <w:sz w:val="18"/>
+                <w:szCs w:val="18"/>
+              </w:rPr>
+              <w:t xml:space="preserve">50</w:t>
+            </w:r>
           </w:p>
         </w:tc>
         <w:tc>
@@ -2965,6 +3290,13 @@
               <w:spacing w:before="20" w:after="20"/>
               <w:jc w:val="center"/>
             </w:pPr>
+            <w:r>
+              <w:rPr>
+                <w:sz w:val="18"/>
+                <w:szCs w:val="18"/>
+              </w:rPr>
+              <w:t xml:space="preserve">75</w:t>
+            </w:r>
           </w:p>
         </w:tc>
         <w:tc>
@@ -2977,6 +3309,13 @@
               <w:spacing w:before="20" w:after="20"/>
               <w:jc w:val="center"/>
             </w:pPr>
+            <w:r>
+              <w:rPr>
+                <w:sz w:val="18"/>
+                <w:szCs w:val="18"/>
+              </w:rPr>
+              <w:t xml:space="preserve">151</w:t>
+            </w:r>
           </w:p>
         </w:tc>
         <w:tc>
@@ -2989,6 +3328,13 @@
               <w:spacing w:before="20" w:after="20"/>
               <w:jc w:val="center"/>
             </w:pPr>
+            <w:r>
+              <w:rPr>
+                <w:sz w:val="18"/>
+                <w:szCs w:val="18"/>
+              </w:rPr>
+              <w:t xml:space="preserve">53</w:t>
+            </w:r>
           </w:p>
         </w:tc>
         <w:tc>
@@ -3001,6 +3347,13 @@
               <w:spacing w:before="20" w:after="20"/>
               <w:jc w:val="center"/>
             </w:pPr>
+            <w:r>
+              <w:rPr>
+                <w:sz w:val="18"/>
+                <w:szCs w:val="18"/>
+              </w:rPr>
+              <w:t xml:space="preserve">66</w:t>
+            </w:r>
           </w:p>
         </w:tc>
         <w:tc>
@@ -3014,6 +3367,13 @@
               <w:spacing w:before="20" w:after="20"/>
               <w:jc w:val="center"/>
             </w:pPr>
+            <w:r>
+              <w:rPr>
+                <w:sz w:val="18"/>
+                <w:szCs w:val="18"/>
+              </w:rPr>
+              <w:t xml:space="preserve">53</w:t>
+            </w:r>
           </w:p>
         </w:tc>
         <w:tc>
@@ -3027,6 +3387,13 @@
               <w:spacing w:before="20" w:after="20"/>
               <w:jc w:val="center"/>
             </w:pPr>
+            <w:r>
+              <w:rPr>
+                <w:sz w:val="18"/>
+                <w:szCs w:val="18"/>
+              </w:rPr>
+              <w:t xml:space="preserve">60</w:t>
+            </w:r>
           </w:p>
         </w:tc>
         <w:tc>
@@ -3125,6 +3492,13 @@
               <w:spacing w:before="20" w:after="20"/>
               <w:jc w:val="center"/>
             </w:pPr>
+            <w:r>
+              <w:rPr>
+                <w:sz w:val="18"/>
+                <w:szCs w:val="18"/>
+              </w:rPr>
+              <w:t xml:space="preserve">211</w:t>
+            </w:r>
           </w:p>
         </w:tc>
         <w:tc>
@@ -3137,6 +3511,13 @@
               <w:spacing w:before="20" w:after="20"/>
               <w:jc w:val="center"/>
             </w:pPr>
+            <w:r>
+              <w:rPr>
+                <w:sz w:val="18"/>
+                <w:szCs w:val="18"/>
+              </w:rPr>
+              <w:t xml:space="preserve">55</w:t>
+            </w:r>
           </w:p>
         </w:tc>
         <w:tc>
@@ -3149,6 +3530,13 @@
               <w:spacing w:before="20" w:after="20"/>
               <w:jc w:val="center"/>
             </w:pPr>
+            <w:r>
+              <w:rPr>
+                <w:sz w:val="18"/>
+                <w:szCs w:val="18"/>
+              </w:rPr>
+              <w:t xml:space="preserve">42</w:t>
+            </w:r>
           </w:p>
         </w:tc>
         <w:tc>
@@ -3162,6 +3550,13 @@
               <w:spacing w:before="20" w:after="20"/>
               <w:jc w:val="center"/>
             </w:pPr>
+            <w:r>
+              <w:rPr>
+                <w:sz w:val="18"/>
+                <w:szCs w:val="18"/>
+              </w:rPr>
+              <w:t xml:space="preserve">48</w:t>
+            </w:r>
           </w:p>
         </w:tc>
         <w:tc>
@@ -3175,6 +3570,13 @@
               <w:spacing w:before="20" w:after="20"/>
               <w:jc w:val="center"/>
             </w:pPr>
+            <w:r>
+              <w:rPr>
+                <w:sz w:val="18"/>
+                <w:szCs w:val="18"/>
+              </w:rPr>
+              <w:t xml:space="preserve">74</w:t>
+            </w:r>
           </w:p>
         </w:tc>
         <w:tc>
@@ -3187,6 +3589,13 @@
               <w:spacing w:before="20" w:after="20"/>
               <w:jc w:val="center"/>
             </w:pPr>
+            <w:r>
+              <w:rPr>
+                <w:sz w:val="18"/>
+                <w:szCs w:val="18"/>
+              </w:rPr>
+              <w:t xml:space="preserve">281</w:t>
+            </w:r>
           </w:p>
         </w:tc>
         <w:tc>
@@ -3199,6 +3608,13 @@
               <w:spacing w:before="20" w:after="20"/>
               <w:jc w:val="center"/>
             </w:pPr>
+            <w:r>
+              <w:rPr>
+                <w:sz w:val="18"/>
+                <w:szCs w:val="18"/>
+              </w:rPr>
+              <w:t xml:space="preserve">50</w:t>
+            </w:r>
           </w:p>
         </w:tc>
         <w:tc>
@@ -3211,6 +3627,13 @@
               <w:spacing w:before="20" w:after="20"/>
               <w:jc w:val="center"/>
             </w:pPr>
+            <w:r>
+              <w:rPr>
+                <w:sz w:val="18"/>
+                <w:szCs w:val="18"/>
+              </w:rPr>
+              <w:t xml:space="preserve">46</w:t>
+            </w:r>
           </w:p>
         </w:tc>
         <w:tc>
@@ -3224,6 +3647,13 @@
               <w:spacing w:before="20" w:after="20"/>
               <w:jc w:val="center"/>
             </w:pPr>
+            <w:r>
+              <w:rPr>
+                <w:sz w:val="18"/>
+                <w:szCs w:val="18"/>
+              </w:rPr>
+              <w:t xml:space="preserve">48</w:t>
+            </w:r>
           </w:p>
         </w:tc>
         <w:tc>
@@ -3237,6 +3667,13 @@
               <w:spacing w:before="20" w:after="20"/>
               <w:jc w:val="center"/>
             </w:pPr>
+            <w:r>
+              <w:rPr>
+                <w:sz w:val="18"/>
+                <w:szCs w:val="18"/>
+              </w:rPr>
+              <w:t xml:space="preserve">87</w:t>
+            </w:r>
           </w:p>
         </w:tc>
         <w:tc>
@@ -3249,6 +3686,13 @@
               <w:spacing w:before="20" w:after="20"/>
               <w:jc w:val="center"/>
             </w:pPr>
+            <w:r>
+              <w:rPr>
+                <w:sz w:val="18"/>
+                <w:szCs w:val="18"/>
+              </w:rPr>
+              <w:t xml:space="preserve">351</w:t>
+            </w:r>
           </w:p>
         </w:tc>
         <w:tc>
@@ -3261,6 +3705,13 @@
               <w:spacing w:before="20" w:after="20"/>
               <w:jc w:val="center"/>
             </w:pPr>
+            <w:r>
+              <w:rPr>
+                <w:sz w:val="18"/>
+                <w:szCs w:val="18"/>
+              </w:rPr>
+              <w:t xml:space="preserve">53</w:t>
+            </w:r>
           </w:p>
         </w:tc>
         <w:tc>
@@ -3273,6 +3724,13 @@
               <w:spacing w:before="20" w:after="20"/>
               <w:jc w:val="center"/>
             </w:pPr>
+            <w:r>
+              <w:rPr>
+                <w:sz w:val="18"/>
+                <w:szCs w:val="18"/>
+              </w:rPr>
+              <w:t xml:space="preserve">54</w:t>
+            </w:r>
           </w:p>
         </w:tc>
         <w:tc>
@@ -3286,6 +3744,13 @@
               <w:spacing w:before="20" w:after="20"/>
               <w:jc w:val="center"/>
             </w:pPr>
+            <w:r>
+              <w:rPr>
+                <w:sz w:val="18"/>
+                <w:szCs w:val="18"/>
+              </w:rPr>
+              <w:t xml:space="preserve">48</w:t>
+            </w:r>
           </w:p>
         </w:tc>
         <w:tc>
@@ -3299,6 +3764,13 @@
               <w:spacing w:before="20" w:after="20"/>
               <w:jc w:val="center"/>
             </w:pPr>
+            <w:r>
+              <w:rPr>
+                <w:sz w:val="18"/>
+                <w:szCs w:val="18"/>
+              </w:rPr>
+              <w:t xml:space="preserve">91</w:t>
+            </w:r>
           </w:p>
         </w:tc>
         <w:tc>
@@ -3312,6 +3784,15 @@
               <w:spacing w:before="20" w:after="20"/>
               <w:jc w:val="center"/>
             </w:pPr>
+            <w:r>
+              <w:rPr>
+                <w:b/>
+                <w:bCs/>
+                <w:sz w:val="18"/>
+                <w:szCs w:val="18"/>
+              </w:rPr>
+              <w:t xml:space="preserve">11</w:t>
+            </w:r>
           </w:p>
         </w:tc>
         <w:tc>
@@ -3325,6 +3806,15 @@
               <w:spacing w:before="20" w:after="20"/>
               <w:jc w:val="center"/>
             </w:pPr>
+            <w:r>
+              <w:rPr>
+                <w:b/>
+                <w:bCs/>
+                <w:sz w:val="18"/>
+                <w:szCs w:val="18"/>
+              </w:rPr>
+              <w:t xml:space="preserve">48</w:t>
+            </w:r>
           </w:p>
         </w:tc>
         <w:tc>
@@ -3338,6 +3828,15 @@
               <w:spacing w:before="20" w:after="20"/>
               <w:jc w:val="center"/>
             </w:pPr>
+            <w:r>
+              <w:rPr>
+                <w:b/>
+                <w:bCs/>
+                <w:sz w:val="18"/>
+                <w:szCs w:val="18"/>
+              </w:rPr>
+              <w:t xml:space="preserve">84</w:t>
+            </w:r>
           </w:p>
         </w:tc>
       </w:tr>
@@ -3352,7 +3851,7 @@
           <w:b/>
           <w:bCs/>
         </w:rPr>
-        <w:t xml:space="preserve">Prístroj: Nivel System DT-2</w:t>
+        <w:t xml:space="preserve">Prístroj: Zeiss THEO 010A</w:t>
       </w:r>
     </w:p>
     <w:tbl>
@@ -4075,11 +4574,10 @@
             </w:pPr>
             <w:r>
               <w:rPr>
-                <w:highlight w:val="yellow"/>
-                <w:sz w:val="18"/>
-                <w:szCs w:val="18"/>
-              </w:rPr>
-              <w:t xml:space="preserve">[ ]</w:t>
+                <w:sz w:val="18"/>
+                <w:szCs w:val="18"/>
+              </w:rPr>
+              <w:t xml:space="preserve">S</w:t>
             </w:r>
           </w:p>
         </w:tc>
@@ -4096,11 +4594,10 @@
             </w:pPr>
             <w:r>
               <w:rPr>
-                <w:highlight w:val="yellow"/>
-                <w:sz w:val="18"/>
-                <w:szCs w:val="18"/>
-              </w:rPr>
-              <w:t xml:space="preserve">[ ]</w:t>
+                <w:sz w:val="18"/>
+                <w:szCs w:val="18"/>
+              </w:rPr>
+              <w:t xml:space="preserve">1</w:t>
             </w:r>
           </w:p>
         </w:tc>
@@ -4133,6 +4630,13 @@
               <w:spacing w:before="20" w:after="20"/>
               <w:jc w:val="center"/>
             </w:pPr>
+            <w:r>
+              <w:rPr>
+                <w:sz w:val="18"/>
+                <w:szCs w:val="18"/>
+              </w:rPr>
+              <w:t xml:space="preserve">0</w:t>
+            </w:r>
           </w:p>
         </w:tc>
         <w:tc>
@@ -4145,6 +4649,13 @@
               <w:spacing w:before="20" w:after="20"/>
               <w:jc w:val="center"/>
             </w:pPr>
+            <w:r>
+              <w:rPr>
+                <w:sz w:val="18"/>
+                <w:szCs w:val="18"/>
+              </w:rPr>
+              <w:t xml:space="preserve">03</w:t>
+            </w:r>
           </w:p>
         </w:tc>
         <w:tc>
@@ -4157,6 +4668,13 @@
               <w:spacing w:before="20" w:after="20"/>
               <w:jc w:val="center"/>
             </w:pPr>
+            <w:r>
+              <w:rPr>
+                <w:sz w:val="18"/>
+                <w:szCs w:val="18"/>
+              </w:rPr>
+              <w:t xml:space="preserve">12</w:t>
+            </w:r>
           </w:p>
         </w:tc>
         <w:tc>
@@ -4170,6 +4688,13 @@
               <w:spacing w:before="20" w:after="20"/>
               <w:jc w:val="center"/>
             </w:pPr>
+            <w:r>
+              <w:rPr>
+                <w:sz w:val="18"/>
+                <w:szCs w:val="18"/>
+              </w:rPr>
+              <w:t xml:space="preserve">03</w:t>
+            </w:r>
           </w:p>
         </w:tc>
         <w:tc>
@@ -4183,6 +4708,13 @@
               <w:spacing w:before="20" w:after="20"/>
               <w:jc w:val="center"/>
             </w:pPr>
+            <w:r>
+              <w:rPr>
+                <w:sz w:val="18"/>
+                <w:szCs w:val="18"/>
+              </w:rPr>
+              <w:t xml:space="preserve">05</w:t>
+            </w:r>
           </w:p>
         </w:tc>
         <w:tc>
@@ -4195,6 +4727,13 @@
               <w:spacing w:before="20" w:after="20"/>
               <w:jc w:val="center"/>
             </w:pPr>
+            <w:r>
+              <w:rPr>
+                <w:sz w:val="18"/>
+                <w:szCs w:val="18"/>
+              </w:rPr>
+              <w:t xml:space="preserve">70</w:t>
+            </w:r>
           </w:p>
         </w:tc>
         <w:tc>
@@ -4207,6 +4746,13 @@
               <w:spacing w:before="20" w:after="20"/>
               <w:jc w:val="center"/>
             </w:pPr>
+            <w:r>
+              <w:rPr>
+                <w:sz w:val="18"/>
+                <w:szCs w:val="18"/>
+              </w:rPr>
+              <w:t xml:space="preserve">03</w:t>
+            </w:r>
           </w:p>
         </w:tc>
         <w:tc>
@@ -4219,6 +4765,13 @@
               <w:spacing w:before="20" w:after="20"/>
               <w:jc w:val="center"/>
             </w:pPr>
+            <w:r>
+              <w:rPr>
+                <w:sz w:val="18"/>
+                <w:szCs w:val="18"/>
+              </w:rPr>
+              <w:t xml:space="preserve">30</w:t>
+            </w:r>
           </w:p>
         </w:tc>
         <w:tc>
@@ -4232,6 +4785,13 @@
               <w:spacing w:before="20" w:after="20"/>
               <w:jc w:val="center"/>
             </w:pPr>
+            <w:r>
+              <w:rPr>
+                <w:sz w:val="18"/>
+                <w:szCs w:val="18"/>
+              </w:rPr>
+              <w:t xml:space="preserve">03</w:t>
+            </w:r>
           </w:p>
         </w:tc>
         <w:tc>
@@ -4245,6 +4805,13 @@
               <w:spacing w:before="20" w:after="20"/>
               <w:jc w:val="center"/>
             </w:pPr>
+            <w:r>
+              <w:rPr>
+                <w:sz w:val="18"/>
+                <w:szCs w:val="18"/>
+              </w:rPr>
+              <w:t xml:space="preserve">52</w:t>
+            </w:r>
           </w:p>
         </w:tc>
         <w:tc>
@@ -4257,6 +4824,13 @@
               <w:spacing w:before="20" w:after="20"/>
               <w:jc w:val="center"/>
             </w:pPr>
+            <w:r>
+              <w:rPr>
+                <w:sz w:val="18"/>
+                <w:szCs w:val="18"/>
+              </w:rPr>
+              <w:t xml:space="preserve">140</w:t>
+            </w:r>
           </w:p>
         </w:tc>
         <w:tc>
@@ -4269,6 +4843,13 @@
               <w:spacing w:before="20" w:after="20"/>
               <w:jc w:val="center"/>
             </w:pPr>
+            <w:r>
+              <w:rPr>
+                <w:sz w:val="18"/>
+                <w:szCs w:val="18"/>
+              </w:rPr>
+              <w:t xml:space="preserve">05</w:t>
+            </w:r>
           </w:p>
         </w:tc>
         <w:tc>
@@ -4281,6 +4862,13 @@
               <w:spacing w:before="20" w:after="20"/>
               <w:jc w:val="center"/>
             </w:pPr>
+            <w:r>
+              <w:rPr>
+                <w:sz w:val="18"/>
+                <w:szCs w:val="18"/>
+              </w:rPr>
+              <w:t xml:space="preserve">00</w:t>
+            </w:r>
           </w:p>
         </w:tc>
         <w:tc>
@@ -4294,6 +4882,13 @@
               <w:spacing w:before="20" w:after="20"/>
               <w:jc w:val="center"/>
             </w:pPr>
+            <w:r>
+              <w:rPr>
+                <w:sz w:val="18"/>
+                <w:szCs w:val="18"/>
+              </w:rPr>
+              <w:t xml:space="preserve">04</w:t>
+            </w:r>
           </w:p>
         </w:tc>
         <w:tc>
@@ -4307,6 +4902,13 @@
               <w:spacing w:before="20" w:after="20"/>
               <w:jc w:val="center"/>
             </w:pPr>
+            <w:r>
+              <w:rPr>
+                <w:sz w:val="18"/>
+                <w:szCs w:val="18"/>
+              </w:rPr>
+              <w:t xml:space="preserve">69</w:t>
+            </w:r>
           </w:p>
         </w:tc>
         <w:tc>
@@ -4405,6 +5007,13 @@
               <w:spacing w:before="20" w:after="20"/>
               <w:jc w:val="center"/>
             </w:pPr>
+            <w:r>
+              <w:rPr>
+                <w:sz w:val="18"/>
+                <w:szCs w:val="18"/>
+              </w:rPr>
+              <w:t xml:space="preserve">200</w:t>
+            </w:r>
           </w:p>
         </w:tc>
         <w:tc>
@@ -4417,6 +5026,13 @@
               <w:spacing w:before="20" w:after="20"/>
               <w:jc w:val="center"/>
             </w:pPr>
+            <w:r>
+              <w:rPr>
+                <w:sz w:val="18"/>
+                <w:szCs w:val="18"/>
+              </w:rPr>
+              <w:t xml:space="preserve">02</w:t>
+            </w:r>
           </w:p>
         </w:tc>
         <w:tc>
@@ -4429,6 +5045,13 @@
               <w:spacing w:before="20" w:after="20"/>
               <w:jc w:val="center"/>
             </w:pPr>
+            <w:r>
+              <w:rPr>
+                <w:sz w:val="18"/>
+                <w:szCs w:val="18"/>
+              </w:rPr>
+              <w:t xml:space="preserve">98</w:t>
+            </w:r>
           </w:p>
         </w:tc>
         <w:tc>
@@ -4442,6 +5065,13 @@
               <w:spacing w:before="20" w:after="20"/>
               <w:jc w:val="center"/>
             </w:pPr>
+            <w:r>
+              <w:rPr>
+                <w:sz w:val="18"/>
+                <w:szCs w:val="18"/>
+              </w:rPr>
+              <w:t xml:space="preserve">00</w:t>
+            </w:r>
           </w:p>
         </w:tc>
         <w:tc>
@@ -4455,6 +5085,13 @@
               <w:spacing w:before="20" w:after="20"/>
               <w:jc w:val="center"/>
             </w:pPr>
+            <w:r>
+              <w:rPr>
+                <w:sz w:val="18"/>
+                <w:szCs w:val="18"/>
+              </w:rPr>
+              <w:t xml:space="preserve">00</w:t>
+            </w:r>
           </w:p>
         </w:tc>
         <w:tc>
@@ -4467,6 +5104,13 @@
               <w:spacing w:before="20" w:after="20"/>
               <w:jc w:val="center"/>
             </w:pPr>
+            <w:r>
+              <w:rPr>
+                <w:sz w:val="18"/>
+                <w:szCs w:val="18"/>
+              </w:rPr>
+              <w:t xml:space="preserve">270</w:t>
+            </w:r>
           </w:p>
         </w:tc>
         <w:tc>
@@ -4479,6 +5123,13 @@
               <w:spacing w:before="20" w:after="20"/>
               <w:jc w:val="center"/>
             </w:pPr>
+            <w:r>
+              <w:rPr>
+                <w:sz w:val="18"/>
+                <w:szCs w:val="18"/>
+              </w:rPr>
+              <w:t xml:space="preserve">03</w:t>
+            </w:r>
           </w:p>
         </w:tc>
         <w:tc>
@@ -4491,6 +5142,13 @@
               <w:spacing w:before="20" w:after="20"/>
               <w:jc w:val="center"/>
             </w:pPr>
+            <w:r>
+              <w:rPr>
+                <w:sz w:val="18"/>
+                <w:szCs w:val="18"/>
+              </w:rPr>
+              <w:t xml:space="preserve">74</w:t>
+            </w:r>
           </w:p>
         </w:tc>
         <w:tc>
@@ -4504,6 +5162,13 @@
               <w:spacing w:before="20" w:after="20"/>
               <w:jc w:val="center"/>
             </w:pPr>
+            <w:r>
+              <w:rPr>
+                <w:sz w:val="18"/>
+                <w:szCs w:val="18"/>
+              </w:rPr>
+              <w:t xml:space="preserve">00</w:t>
+            </w:r>
           </w:p>
         </w:tc>
         <w:tc>
@@ -4517,6 +5182,13 @@
               <w:spacing w:before="20" w:after="20"/>
               <w:jc w:val="center"/>
             </w:pPr>
+            <w:r>
+              <w:rPr>
+                <w:sz w:val="18"/>
+                <w:szCs w:val="18"/>
+              </w:rPr>
+              <w:t xml:space="preserve">00</w:t>
+            </w:r>
           </w:p>
         </w:tc>
         <w:tc>
@@ -4529,6 +5201,13 @@
               <w:spacing w:before="20" w:after="20"/>
               <w:jc w:val="center"/>
             </w:pPr>
+            <w:r>
+              <w:rPr>
+                <w:sz w:val="18"/>
+                <w:szCs w:val="18"/>
+              </w:rPr>
+              <w:t xml:space="preserve">340</w:t>
+            </w:r>
           </w:p>
         </w:tc>
         <w:tc>
@@ -4541,6 +5220,13 @@
               <w:spacing w:before="20" w:after="20"/>
               <w:jc w:val="center"/>
             </w:pPr>
+            <w:r>
+              <w:rPr>
+                <w:sz w:val="18"/>
+                <w:szCs w:val="18"/>
+              </w:rPr>
+              <w:t xml:space="preserve">04</w:t>
+            </w:r>
           </w:p>
         </w:tc>
         <w:tc>
@@ -4553,6 +5239,13 @@
               <w:spacing w:before="20" w:after="20"/>
               <w:jc w:val="center"/>
             </w:pPr>
+            <w:r>
+              <w:rPr>
+                <w:sz w:val="18"/>
+                <w:szCs w:val="18"/>
+              </w:rPr>
+              <w:t xml:space="preserve">38</w:t>
+            </w:r>
           </w:p>
         </w:tc>
         <w:tc>
@@ -4566,6 +5259,13 @@
               <w:spacing w:before="20" w:after="20"/>
               <w:jc w:val="center"/>
             </w:pPr>
+            <w:r>
+              <w:rPr>
+                <w:sz w:val="18"/>
+                <w:szCs w:val="18"/>
+              </w:rPr>
+              <w:t xml:space="preserve">00</w:t>
+            </w:r>
           </w:p>
         </w:tc>
         <w:tc>
@@ -4579,6 +5279,13 @@
               <w:spacing w:before="20" w:after="20"/>
               <w:jc w:val="center"/>
             </w:pPr>
+            <w:r>
+              <w:rPr>
+                <w:sz w:val="18"/>
+                <w:szCs w:val="18"/>
+              </w:rPr>
+              <w:t xml:space="preserve">00</w:t>
+            </w:r>
           </w:p>
         </w:tc>
         <w:tc>
@@ -4592,6 +5299,15 @@
               <w:spacing w:before="20" w:after="20"/>
               <w:jc w:val="center"/>
             </w:pPr>
+            <w:r>
+              <w:rPr>
+                <w:b/>
+                <w:bCs/>
+                <w:sz w:val="18"/>
+                <w:szCs w:val="18"/>
+              </w:rPr>
+              <w:t xml:space="preserve">0</w:t>
+            </w:r>
           </w:p>
         </w:tc>
         <w:tc>
@@ -4605,6 +5321,15 @@
               <w:spacing w:before="20" w:after="20"/>
               <w:jc w:val="center"/>
             </w:pPr>
+            <w:r>
+              <w:rPr>
+                <w:b/>
+                <w:bCs/>
+                <w:sz w:val="18"/>
+                <w:szCs w:val="18"/>
+              </w:rPr>
+              <w:t xml:space="preserve">00</w:t>
+            </w:r>
           </w:p>
         </w:tc>
         <w:tc>
@@ -4618,6 +5343,15 @@
               <w:spacing w:before="20" w:after="20"/>
               <w:jc w:val="center"/>
             </w:pPr>
+            <w:r>
+              <w:rPr>
+                <w:b/>
+                <w:bCs/>
+                <w:sz w:val="18"/>
+                <w:szCs w:val="18"/>
+              </w:rPr>
+              <w:t xml:space="preserve">00</w:t>
+            </w:r>
           </w:p>
         </w:tc>
       </w:tr>
@@ -4651,11 +5385,10 @@
             </w:pPr>
             <w:r>
               <w:rPr>
-                <w:highlight w:val="yellow"/>
-                <w:sz w:val="18"/>
-                <w:szCs w:val="18"/>
-              </w:rPr>
-              <w:t xml:space="preserve">[ ]</w:t>
+                <w:sz w:val="18"/>
+                <w:szCs w:val="18"/>
+              </w:rPr>
+              <w:t xml:space="preserve">2</w:t>
             </w:r>
           </w:p>
         </w:tc>
@@ -4688,6 +5421,13 @@
               <w:spacing w:before="20" w:after="20"/>
               <w:jc w:val="center"/>
             </w:pPr>
+            <w:r>
+              <w:rPr>
+                <w:sz w:val="18"/>
+                <w:szCs w:val="18"/>
+              </w:rPr>
+              <w:t xml:space="preserve">11</w:t>
+            </w:r>
           </w:p>
         </w:tc>
         <w:tc>
@@ -4700,6 +5440,13 @@
               <w:spacing w:before="20" w:after="20"/>
               <w:jc w:val="center"/>
             </w:pPr>
+            <w:r>
+              <w:rPr>
+                <w:sz w:val="18"/>
+                <w:szCs w:val="18"/>
+              </w:rPr>
+              <w:t xml:space="preserve">53</w:t>
+            </w:r>
           </w:p>
         </w:tc>
         <w:tc>
@@ -4712,6 +5459,13 @@
               <w:spacing w:before="20" w:after="20"/>
               <w:jc w:val="center"/>
             </w:pPr>
+            <w:r>
+              <w:rPr>
+                <w:sz w:val="18"/>
+                <w:szCs w:val="18"/>
+              </w:rPr>
+              <w:t xml:space="preserve">13</w:t>
+            </w:r>
           </w:p>
         </w:tc>
         <w:tc>
@@ -4725,6 +5479,13 @@
               <w:spacing w:before="20" w:after="20"/>
               <w:jc w:val="center"/>
             </w:pPr>
+            <w:r>
+              <w:rPr>
+                <w:sz w:val="18"/>
+                <w:szCs w:val="18"/>
+              </w:rPr>
+              <w:t xml:space="preserve">53</w:t>
+            </w:r>
           </w:p>
         </w:tc>
         <w:tc>
@@ -4738,6 +5499,13 @@
               <w:spacing w:before="20" w:after="20"/>
               <w:jc w:val="center"/>
             </w:pPr>
+            <w:r>
+              <w:rPr>
+                <w:sz w:val="18"/>
+                <w:szCs w:val="18"/>
+              </w:rPr>
+              <w:t xml:space="preserve">45</w:t>
+            </w:r>
           </w:p>
         </w:tc>
         <w:tc>
@@ -4750,6 +5518,13 @@
               <w:spacing w:before="20" w:after="20"/>
               <w:jc w:val="center"/>
             </w:pPr>
+            <w:r>
+              <w:rPr>
+                <w:sz w:val="18"/>
+                <w:szCs w:val="18"/>
+              </w:rPr>
+              <w:t xml:space="preserve">81</w:t>
+            </w:r>
           </w:p>
         </w:tc>
         <w:tc>
@@ -4762,6 +5537,13 @@
               <w:spacing w:before="20" w:after="20"/>
               <w:jc w:val="center"/>
             </w:pPr>
+            <w:r>
+              <w:rPr>
+                <w:sz w:val="18"/>
+                <w:szCs w:val="18"/>
+              </w:rPr>
+              <w:t xml:space="preserve">53</w:t>
+            </w:r>
           </w:p>
         </w:tc>
         <w:tc>
@@ -4774,6 +5556,13 @@
               <w:spacing w:before="20" w:after="20"/>
               <w:jc w:val="center"/>
             </w:pPr>
+            <w:r>
+              <w:rPr>
+                <w:sz w:val="18"/>
+                <w:szCs w:val="18"/>
+              </w:rPr>
+              <w:t xml:space="preserve">48</w:t>
+            </w:r>
           </w:p>
         </w:tc>
         <w:tc>
@@ -4787,6 +5576,13 @@
               <w:spacing w:before="20" w:after="20"/>
               <w:jc w:val="center"/>
             </w:pPr>
+            <w:r>
+              <w:rPr>
+                <w:sz w:val="18"/>
+                <w:szCs w:val="18"/>
+              </w:rPr>
+              <w:t xml:space="preserve">53</w:t>
+            </w:r>
           </w:p>
         </w:tc>
         <w:tc>
@@ -4800,6 +5596,13 @@
               <w:spacing w:before="20" w:after="20"/>
               <w:jc w:val="center"/>
             </w:pPr>
+            <w:r>
+              <w:rPr>
+                <w:sz w:val="18"/>
+                <w:szCs w:val="18"/>
+              </w:rPr>
+              <w:t xml:space="preserve">80</w:t>
+            </w:r>
           </w:p>
         </w:tc>
         <w:tc>
@@ -4812,6 +5615,13 @@
               <w:spacing w:before="20" w:after="20"/>
               <w:jc w:val="center"/>
             </w:pPr>
+            <w:r>
+              <w:rPr>
+                <w:sz w:val="18"/>
+                <w:szCs w:val="18"/>
+              </w:rPr>
+              <w:t xml:space="preserve">151</w:t>
+            </w:r>
           </w:p>
         </w:tc>
         <w:tc>
@@ -4824,6 +5634,13 @@
               <w:spacing w:before="20" w:after="20"/>
               <w:jc w:val="center"/>
             </w:pPr>
+            <w:r>
+              <w:rPr>
+                <w:sz w:val="18"/>
+                <w:szCs w:val="18"/>
+              </w:rPr>
+              <w:t xml:space="preserve">56</w:t>
+            </w:r>
           </w:p>
         </w:tc>
         <w:tc>
@@ -4836,6 +5653,13 @@
               <w:spacing w:before="20" w:after="20"/>
               <w:jc w:val="center"/>
             </w:pPr>
+            <w:r>
+              <w:rPr>
+                <w:sz w:val="18"/>
+                <w:szCs w:val="18"/>
+              </w:rPr>
+              <w:t xml:space="preserve">30</w:t>
+            </w:r>
           </w:p>
         </w:tc>
         <w:tc>
@@ -4849,6 +5673,13 @@
               <w:spacing w:before="20" w:after="20"/>
               <w:jc w:val="center"/>
             </w:pPr>
+            <w:r>
+              <w:rPr>
+                <w:sz w:val="18"/>
+                <w:szCs w:val="18"/>
+              </w:rPr>
+              <w:t xml:space="preserve">56</w:t>
+            </w:r>
           </w:p>
         </w:tc>
         <w:tc>
@@ -4862,6 +5693,13 @@
               <w:spacing w:before="20" w:after="20"/>
               <w:jc w:val="center"/>
             </w:pPr>
+            <w:r>
+              <w:rPr>
+                <w:sz w:val="18"/>
+                <w:szCs w:val="18"/>
+              </w:rPr>
+              <w:t xml:space="preserve">72</w:t>
+            </w:r>
           </w:p>
         </w:tc>
         <w:tc>
@@ -4960,6 +5798,13 @@
               <w:spacing w:before="20" w:after="20"/>
               <w:jc w:val="center"/>
             </w:pPr>
+            <w:r>
+              <w:rPr>
+                <w:sz w:val="18"/>
+                <w:szCs w:val="18"/>
+              </w:rPr>
+              <w:t xml:space="preserve">211</w:t>
+            </w:r>
           </w:p>
         </w:tc>
         <w:tc>
@@ -4972,6 +5817,13 @@
               <w:spacing w:before="20" w:after="20"/>
               <w:jc w:val="center"/>
             </w:pPr>
+            <w:r>
+              <w:rPr>
+                <w:sz w:val="18"/>
+                <w:szCs w:val="18"/>
+              </w:rPr>
+              <w:t xml:space="preserve">53</w:t>
+            </w:r>
           </w:p>
         </w:tc>
         <w:tc>
@@ -4984,6 +5836,13 @@
               <w:spacing w:before="20" w:after="20"/>
               <w:jc w:val="center"/>
             </w:pPr>
+            <w:r>
+              <w:rPr>
+                <w:sz w:val="18"/>
+                <w:szCs w:val="18"/>
+              </w:rPr>
+              <w:t xml:space="preserve">76</w:t>
+            </w:r>
           </w:p>
         </w:tc>
         <w:tc>
@@ -4997,6 +5856,13 @@
               <w:spacing w:before="20" w:after="20"/>
               <w:jc w:val="center"/>
             </w:pPr>
+            <w:r>
+              <w:rPr>
+                <w:sz w:val="18"/>
+                <w:szCs w:val="18"/>
+              </w:rPr>
+              <w:t xml:space="preserve">50</w:t>
+            </w:r>
           </w:p>
         </w:tc>
         <w:tc>
@@ -5010,6 +5876,13 @@
               <w:spacing w:before="20" w:after="20"/>
               <w:jc w:val="center"/>
             </w:pPr>
+            <w:r>
+              <w:rPr>
+                <w:sz w:val="18"/>
+                <w:szCs w:val="18"/>
+              </w:rPr>
+              <w:t xml:space="preserve">40</w:t>
+            </w:r>
           </w:p>
         </w:tc>
         <w:tc>
@@ -5022,6 +5895,13 @@
               <w:spacing w:before="20" w:after="20"/>
               <w:jc w:val="center"/>
             </w:pPr>
+            <w:r>
+              <w:rPr>
+                <w:sz w:val="18"/>
+                <w:szCs w:val="18"/>
+              </w:rPr>
+              <w:t xml:space="preserve">281</w:t>
+            </w:r>
           </w:p>
         </w:tc>
         <w:tc>
@@ -5034,6 +5914,13 @@
               <w:spacing w:before="20" w:after="20"/>
               <w:jc w:val="center"/>
             </w:pPr>
+            <w:r>
+              <w:rPr>
+                <w:sz w:val="18"/>
+                <w:szCs w:val="18"/>
+              </w:rPr>
+              <w:t xml:space="preserve">54</w:t>
+            </w:r>
           </w:p>
         </w:tc>
         <w:tc>
@@ -5046,6 +5933,13 @@
               <w:spacing w:before="20" w:after="20"/>
               <w:jc w:val="center"/>
             </w:pPr>
+            <w:r>
+              <w:rPr>
+                <w:sz w:val="18"/>
+                <w:szCs w:val="18"/>
+              </w:rPr>
+              <w:t xml:space="preserve">12</w:t>
+            </w:r>
           </w:p>
         </w:tc>
         <w:tc>
@@ -5059,6 +5953,13 @@
               <w:spacing w:before="20" w:after="20"/>
               <w:jc w:val="center"/>
             </w:pPr>
+            <w:r>
+              <w:rPr>
+                <w:sz w:val="18"/>
+                <w:szCs w:val="18"/>
+              </w:rPr>
+              <w:t xml:space="preserve">50</w:t>
+            </w:r>
           </w:p>
         </w:tc>
         <w:tc>
@@ -5072,6 +5973,13 @@
               <w:spacing w:before="20" w:after="20"/>
               <w:jc w:val="center"/>
             </w:pPr>
+            <w:r>
+              <w:rPr>
+                <w:sz w:val="18"/>
+                <w:szCs w:val="18"/>
+              </w:rPr>
+              <w:t xml:space="preserve">28</w:t>
+            </w:r>
           </w:p>
         </w:tc>
         <w:tc>
@@ -5084,6 +5992,13 @@
               <w:spacing w:before="20" w:after="20"/>
               <w:jc w:val="center"/>
             </w:pPr>
+            <w:r>
+              <w:rPr>
+                <w:sz w:val="18"/>
+                <w:szCs w:val="18"/>
+              </w:rPr>
+              <w:t xml:space="preserve">351</w:t>
+            </w:r>
           </w:p>
         </w:tc>
         <w:tc>
@@ -5096,6 +6011,13 @@
               <w:spacing w:before="20" w:after="20"/>
               <w:jc w:val="center"/>
             </w:pPr>
+            <w:r>
+              <w:rPr>
+                <w:sz w:val="18"/>
+                <w:szCs w:val="18"/>
+              </w:rPr>
+              <w:t xml:space="preserve">57</w:t>
+            </w:r>
           </w:p>
         </w:tc>
         <w:tc>
@@ -5108,6 +6030,13 @@
               <w:spacing w:before="20" w:after="20"/>
               <w:jc w:val="center"/>
             </w:pPr>
+            <w:r>
+              <w:rPr>
+                <w:sz w:val="18"/>
+                <w:szCs w:val="18"/>
+              </w:rPr>
+              <w:t xml:space="preserve">14</w:t>
+            </w:r>
           </w:p>
         </w:tc>
         <w:tc>
@@ -5121,6 +6050,13 @@
               <w:spacing w:before="20" w:after="20"/>
               <w:jc w:val="center"/>
             </w:pPr>
+            <w:r>
+              <w:rPr>
+                <w:sz w:val="18"/>
+                <w:szCs w:val="18"/>
+              </w:rPr>
+              <w:t xml:space="preserve">52</w:t>
+            </w:r>
           </w:p>
         </w:tc>
         <w:tc>
@@ -5134,6 +6070,13 @@
               <w:spacing w:before="20" w:after="20"/>
               <w:jc w:val="center"/>
             </w:pPr>
+            <w:r>
+              <w:rPr>
+                <w:sz w:val="18"/>
+                <w:szCs w:val="18"/>
+              </w:rPr>
+              <w:t xml:space="preserve">03</w:t>
+            </w:r>
           </w:p>
         </w:tc>
         <w:tc>
@@ -5147,6 +6090,15 @@
               <w:spacing w:before="20" w:after="20"/>
               <w:jc w:val="center"/>
             </w:pPr>
+            <w:r>
+              <w:rPr>
+                <w:b/>
+                <w:bCs/>
+                <w:sz w:val="18"/>
+                <w:szCs w:val="18"/>
+              </w:rPr>
+              <w:t xml:space="preserve">11</w:t>
+            </w:r>
           </w:p>
         </w:tc>
         <w:tc>
@@ -5160,6 +6112,15 @@
               <w:spacing w:before="20" w:after="20"/>
               <w:jc w:val="center"/>
             </w:pPr>
+            <w:r>
+              <w:rPr>
+                <w:b/>
+                <w:bCs/>
+                <w:sz w:val="18"/>
+                <w:szCs w:val="18"/>
+              </w:rPr>
+              <w:t xml:space="preserve">50</w:t>
+            </w:r>
           </w:p>
         </w:tc>
         <w:tc>
@@ -5173,6 +6134,15 @@
               <w:spacing w:before="20" w:after="20"/>
               <w:jc w:val="center"/>
             </w:pPr>
+            <w:r>
+              <w:rPr>
+                <w:b/>
+                <w:bCs/>
+                <w:sz w:val="18"/>
+                <w:szCs w:val="18"/>
+              </w:rPr>
+              <w:t xml:space="preserve">90</w:t>
+            </w:r>
           </w:p>
         </w:tc>
       </w:tr>
@@ -5382,7 +6352,7 @@
                 <w:sz w:val="18"/>
                 <w:szCs w:val="18"/>
               </w:rPr>
-              <w:t xml:space="preserve">Zeiss THEO 010A</w:t>
+              <w:t xml:space="preserve">Nivel System DT-2</w:t>
             </w:r>
           </w:p>
         </w:tc>
@@ -5398,11 +6368,10 @@
             </w:pPr>
             <w:r>
               <w:rPr>
-                <w:highlight w:val="yellow"/>
-                <w:sz w:val="18"/>
-                <w:szCs w:val="18"/>
-              </w:rPr>
-              <w:t xml:space="preserve">[ ]</w:t>
+                <w:sz w:val="18"/>
+                <w:szCs w:val="18"/>
+              </w:rPr>
+              <w:t xml:space="preserve">1</w:t>
             </w:r>
           </w:p>
         </w:tc>
@@ -5416,6 +6385,13 @@
               <w:spacing w:before="20" w:after="20"/>
               <w:jc w:val="center"/>
             </w:pPr>
+            <w:r>
+              <w:rPr>
+                <w:sz w:val="18"/>
+                <w:szCs w:val="18"/>
+              </w:rPr>
+              <w:t xml:space="preserve">+ 56</w:t>
+            </w:r>
           </w:p>
         </w:tc>
         <w:tc>
@@ -5428,6 +6404,13 @@
               <w:spacing w:before="20" w:after="20"/>
               <w:jc w:val="center"/>
             </w:pPr>
+            <w:r>
+              <w:rPr>
+                <w:sz w:val="18"/>
+                <w:szCs w:val="18"/>
+              </w:rPr>
+              <w:t xml:space="preserve">− 96</w:t>
+            </w:r>
           </w:p>
         </w:tc>
         <w:tc>
@@ -5440,6 +6423,13 @@
               <w:spacing w:before="20" w:after="20"/>
               <w:jc w:val="center"/>
             </w:pPr>
+            <w:r>
+              <w:rPr>
+                <w:sz w:val="18"/>
+                <w:szCs w:val="18"/>
+              </w:rPr>
+              <w:t xml:space="preserve">+ 79</w:t>
+            </w:r>
           </w:p>
         </w:tc>
         <w:tc>
@@ -5452,6 +6442,15 @@
               <w:spacing w:before="20" w:after="20"/>
               <w:jc w:val="center"/>
             </w:pPr>
+            <w:r>
+              <w:rPr>
+                <w:b/>
+                <w:bCs/>
+                <w:sz w:val="18"/>
+                <w:szCs w:val="18"/>
+              </w:rPr>
+              <w:t xml:space="preserve">0,0000</w:t>
+            </w:r>
           </w:p>
         </w:tc>
       </w:tr>
@@ -5484,11 +6483,10 @@
             </w:pPr>
             <w:r>
               <w:rPr>
-                <w:highlight w:val="yellow"/>
-                <w:sz w:val="18"/>
-                <w:szCs w:val="18"/>
-              </w:rPr>
-              <w:t xml:space="preserve">[ ]</w:t>
+                <w:sz w:val="18"/>
+                <w:szCs w:val="18"/>
+              </w:rPr>
+              <w:t xml:space="preserve">2</w:t>
             </w:r>
           </w:p>
         </w:tc>
@@ -5502,6 +6500,13 @@
               <w:spacing w:before="20" w:after="20"/>
               <w:jc w:val="center"/>
             </w:pPr>
+            <w:r>
+              <w:rPr>
+                <w:sz w:val="18"/>
+                <w:szCs w:val="18"/>
+              </w:rPr>
+              <w:t xml:space="preserve">− 24</w:t>
+            </w:r>
           </w:p>
         </w:tc>
         <w:tc>
@@ -5514,6 +6519,13 @@
               <w:spacing w:before="20" w:after="20"/>
               <w:jc w:val="center"/>
             </w:pPr>
+            <w:r>
+              <w:rPr>
+                <w:sz w:val="18"/>
+                <w:szCs w:val="18"/>
+              </w:rPr>
+              <w:t xml:space="preserve">+ 58</w:t>
+            </w:r>
           </w:p>
         </w:tc>
         <w:tc>
@@ -5526,6 +6538,13 @@
               <w:spacing w:before="20" w:after="20"/>
               <w:jc w:val="center"/>
             </w:pPr>
+            <w:r>
+              <w:rPr>
+                <w:sz w:val="18"/>
+                <w:szCs w:val="18"/>
+              </w:rPr>
+              <w:t xml:space="preserve">+ 12</w:t>
+            </w:r>
           </w:p>
         </w:tc>
         <w:tc>
@@ -5538,6 +6557,15 @@
               <w:spacing w:before="20" w:after="20"/>
               <w:jc w:val="center"/>
             </w:pPr>
+            <w:r>
+              <w:rPr>
+                <w:b/>
+                <w:bCs/>
+                <w:sz w:val="18"/>
+                <w:szCs w:val="18"/>
+              </w:rPr>
+              <w:t xml:space="preserve">11,4884</w:t>
+            </w:r>
           </w:p>
         </w:tc>
       </w:tr>
@@ -5563,7 +6591,7 @@
                 <w:sz w:val="18"/>
                 <w:szCs w:val="18"/>
               </w:rPr>
-              <w:t xml:space="preserve">Uhol ω (Zeiss THEO 010A)</w:t>
+              <w:t xml:space="preserve">Uhol ω (Nivel System DT-2)</w:t>
             </w:r>
           </w:p>
         </w:tc>
@@ -5582,11 +6610,10 @@
               <w:rPr>
                 <w:b/>
                 <w:bCs/>
-                <w:highlight w:val="yellow"/>
-                <w:sz w:val="18"/>
-                <w:szCs w:val="18"/>
-              </w:rPr>
-              <w:t xml:space="preserve">[ ]</w:t>
+                <w:sz w:val="18"/>
+                <w:szCs w:val="18"/>
+              </w:rPr>
+              <w:t xml:space="preserve">11,4884 gon</w:t>
             </w:r>
           </w:p>
         </w:tc>
@@ -5611,7 +6638,7 @@
                 <w:sz w:val="18"/>
                 <w:szCs w:val="18"/>
               </w:rPr>
-              <w:t xml:space="preserve">Nivel System DT-2</w:t>
+              <w:t xml:space="preserve">Zeiss THEO 010A</w:t>
             </w:r>
           </w:p>
         </w:tc>
@@ -5627,11 +6654,10 @@
             </w:pPr>
             <w:r>
               <w:rPr>
-                <w:highlight w:val="yellow"/>
-                <w:sz w:val="18"/>
-                <w:szCs w:val="18"/>
-              </w:rPr>
-              <w:t xml:space="preserve">[ ]</w:t>
+                <w:sz w:val="18"/>
+                <w:szCs w:val="18"/>
+              </w:rPr>
+              <w:t xml:space="preserve">1</w:t>
             </w:r>
           </w:p>
         </w:tc>
@@ -5645,6 +6671,13 @@
               <w:spacing w:before="20" w:after="20"/>
               <w:jc w:val="center"/>
             </w:pPr>
+            <w:r>
+              <w:rPr>
+                <w:sz w:val="18"/>
+                <w:szCs w:val="18"/>
+              </w:rPr>
+              <w:t xml:space="preserve">+ 14</w:t>
+            </w:r>
           </w:p>
         </w:tc>
         <w:tc>
@@ -5657,6 +6690,13 @@
               <w:spacing w:before="20" w:after="20"/>
               <w:jc w:val="center"/>
             </w:pPr>
+            <w:r>
+              <w:rPr>
+                <w:sz w:val="18"/>
+                <w:szCs w:val="18"/>
+              </w:rPr>
+              <w:t xml:space="preserve">− 44</w:t>
+            </w:r>
           </w:p>
         </w:tc>
         <w:tc>
@@ -5669,6 +6709,13 @@
               <w:spacing w:before="20" w:after="20"/>
               <w:jc w:val="center"/>
             </w:pPr>
+            <w:r>
+              <w:rPr>
+                <w:sz w:val="18"/>
+                <w:szCs w:val="18"/>
+              </w:rPr>
+              <w:t xml:space="preserve">+ 62</w:t>
+            </w:r>
           </w:p>
         </w:tc>
         <w:tc>
@@ -5681,6 +6728,15 @@
               <w:spacing w:before="20" w:after="20"/>
               <w:jc w:val="center"/>
             </w:pPr>
+            <w:r>
+              <w:rPr>
+                <w:b/>
+                <w:bCs/>
+                <w:sz w:val="18"/>
+                <w:szCs w:val="18"/>
+              </w:rPr>
+              <w:t xml:space="preserve">0,0000</w:t>
+            </w:r>
           </w:p>
         </w:tc>
       </w:tr>
@@ -5713,11 +6769,10 @@
             </w:pPr>
             <w:r>
               <w:rPr>
-                <w:highlight w:val="yellow"/>
-                <w:sz w:val="18"/>
-                <w:szCs w:val="18"/>
-              </w:rPr>
-              <w:t xml:space="preserve">[ ]</w:t>
+                <w:sz w:val="18"/>
+                <w:szCs w:val="18"/>
+              </w:rPr>
+              <w:t xml:space="preserve">2</w:t>
             </w:r>
           </w:p>
         </w:tc>
@@ -5731,6 +6786,13 @@
               <w:spacing w:before="20" w:after="20"/>
               <w:jc w:val="center"/>
             </w:pPr>
+            <w:r>
+              <w:rPr>
+                <w:sz w:val="18"/>
+                <w:szCs w:val="18"/>
+              </w:rPr>
+              <w:t xml:space="preserve">− 63</w:t>
+            </w:r>
           </w:p>
         </w:tc>
         <w:tc>
@@ -5743,6 +6805,13 @@
               <w:spacing w:before="20" w:after="20"/>
               <w:jc w:val="center"/>
             </w:pPr>
+            <w:r>
+              <w:rPr>
+                <w:sz w:val="18"/>
+                <w:szCs w:val="18"/>
+              </w:rPr>
+              <w:t xml:space="preserve">− 64</w:t>
+            </w:r>
           </w:p>
         </w:tc>
         <w:tc>
@@ -5755,6 +6824,13 @@
               <w:spacing w:before="20" w:after="20"/>
               <w:jc w:val="center"/>
             </w:pPr>
+            <w:r>
+              <w:rPr>
+                <w:sz w:val="18"/>
+                <w:szCs w:val="18"/>
+              </w:rPr>
+              <w:t xml:space="preserve">− 84</w:t>
+            </w:r>
           </w:p>
         </w:tc>
         <w:tc>
@@ -5767,6 +6843,15 @@
               <w:spacing w:before="20" w:after="20"/>
               <w:jc w:val="center"/>
             </w:pPr>
+            <w:r>
+              <w:rPr>
+                <w:b/>
+                <w:bCs/>
+                <w:sz w:val="18"/>
+                <w:szCs w:val="18"/>
+              </w:rPr>
+              <w:t xml:space="preserve">11,5090</w:t>
+            </w:r>
           </w:p>
         </w:tc>
       </w:tr>
@@ -5792,7 +6877,7 @@
                 <w:sz w:val="18"/>
                 <w:szCs w:val="18"/>
               </w:rPr>
-              <w:t xml:space="preserve">Uhol ω (Nivel System DT-2)</w:t>
+              <w:t xml:space="preserve">Uhol ω (Zeiss THEO 010A)</w:t>
             </w:r>
           </w:p>
         </w:tc>
@@ -5811,11 +6896,10 @@
               <w:rPr>
                 <w:b/>
                 <w:bCs/>
-                <w:highlight w:val="yellow"/>
-                <w:sz w:val="18"/>
-                <w:szCs w:val="18"/>
-              </w:rPr>
-              <w:t xml:space="preserve">[ ]</w:t>
+                <w:sz w:val="18"/>
+                <w:szCs w:val="18"/>
+              </w:rPr>
+              <w:t xml:space="preserve">11,5090 gon</w:t>
             </w:r>
           </w:p>
         </w:tc>

</xml_diff>

<commit_message>
Geodezia 1 Zadanie 2: druhy pristroj Trimble C5
Co-Authored-By: Claude Opus 5.5 (1M context) <noreply@anthropic.com>
</commit_message>
<xml_diff>
--- a/ZS_2026-27/Geodezia_1/Zadania/MOLNAR_GEODEZIA/MOLNAR_Zadanie_2_Meranie_vodorovnych_smerov.docx
+++ b/ZS_2026-27/Geodezia_1/Zadania/MOLNAR_GEODEZIA/MOLNAR_Zadanie_2_Meranie_vodorovnych_smerov.docx
@@ -824,7 +824,7 @@
       </w:pPr>
       <w:r>
         <w:rPr/>
-        <w:t xml:space="preserve">Elaborát bol vypracovaný na základe zadania č. 2 z predmetu Geodézia 1, ktoré zadal doc. Ing. Marián Marčiš, PhD. dňa 28. 9. 2026. Cieľom úlohy bolo odmerať 2 vodorovné smery v troch skupinách v dvoch polohách ďalekohľadu prístrojmi Nivel System DT-2 a Zeiss THEO 010A a vypočítať zápisník meraných vodorovných smerov.</w:t>
+        <w:t xml:space="preserve">Elaborát bol vypracovaný na základe zadania č. 2 z predmetu Geodézia 1, ktoré zadal doc. Ing. Marián Marčiš, PhD. dňa 28. 9. 2026. Cieľom úlohy bolo odmerať 2 vodorovné smery v troch skupinách v dvoch polohách ďalekohľadu prístrojmi Nivel System DT-2 a Trimble C5 a vypočítať zápisník meraných vodorovných smerov.</w:t>
       </w:r>
     </w:p>
     <w:p>
@@ -856,7 +856,7 @@
       </w:r>
       <w:r>
         <w:rPr/>
-        <w:t xml:space="preserve">). Použili sme optický reiteračný teodolit Zeiss THEO 010A s koincidenčným mikrometrom a elektronický teodolit Nivel System DT-2, oba na drevenom statíve.</w:t>
+        <w:t xml:space="preserve">). Použili sme elektronický teodolit Nivel System DT-2 a elektronickú totálnu stanicu Trimble C5, oba na statíve.</w:t>
       </w:r>
     </w:p>
     <w:p>
@@ -923,7 +923,7 @@
       </w:pPr>
       <w:r>
         <w:rPr/>
-        <w:t xml:space="preserve">Pri teodolite Zeiss THEO 010A sme po zacielení na prvý bod nastavili mikrometrom nulu a reiteračnou skrutkou otočili vodorovný kruh na požadované čítanie. Pred každým odčítaním sme mikrometrickou skrutkou skoincidovali dvojrysky a odčítali grády a desiatky centigónov na kruhu a zvyšok na stupnici mikrometra. Pri prístroji Nivel System DT-2 sme nulové čítanie nastavili pomocou klávesnice prístroja a smery sme odčítali priamo z displeja.</w:t>
+        <w:t xml:space="preserve">Pri oboch elektronických prístrojoch sme po zacielení na prvý bod nastavili požadované nulové čítanie pomocou klávesnice prístroja a vodorovné smery sme odčítali priamo z displeja.</w:t>
       </w:r>
     </w:p>
     <w:p>
@@ -1347,7 +1347,7 @@
       </w:r>
       <w:r>
         <w:rPr/>
-        <w:t xml:space="preserve">); prístrojom Zeiss THEO 010A sme určili vodorovný uhol ω = 11,5090</w:t>
+        <w:t xml:space="preserve">); prístrojom Trimble C5 sme určili vodorovný uhol ω = 11,5090</w:t>
       </w:r>
       <w:r>
         <w:rPr>
@@ -3851,7 +3851,7 @@
           <w:b/>
           <w:bCs/>
         </w:rPr>
-        <w:t xml:space="preserve">Prístroj: Zeiss THEO 010A</w:t>
+        <w:t xml:space="preserve">Prístroj: Trimble C5</w:t>
       </w:r>
     </w:p>
     <w:tbl>
@@ -6638,7 +6638,7 @@
                 <w:sz w:val="18"/>
                 <w:szCs w:val="18"/>
               </w:rPr>
-              <w:t xml:space="preserve">Zeiss THEO 010A</w:t>
+              <w:t xml:space="preserve">Trimble C5</w:t>
             </w:r>
           </w:p>
         </w:tc>
@@ -6877,7 +6877,7 @@
                 <w:sz w:val="18"/>
                 <w:szCs w:val="18"/>
               </w:rPr>
-              <w:t xml:space="preserve">Uhol ω (Zeiss THEO 010A)</w:t>
+              <w:t xml:space="preserve">Uhol ω (Trimble C5)</w:t>
             </w:r>
           </w:p>
         </w:tc>

</xml_diff>

<commit_message>
Geodezia 1 Zadanie 2: miesto merania a datumy
Co-Authored-By: Claude Opus 5.5 (1M context) <noreply@anthropic.com>
</commit_message>
<xml_diff>
--- a/ZS_2026-27/Geodezia_1/Zadania/MOLNAR_GEODEZIA/MOLNAR_Zadanie_2_Meranie_vodorovnych_smerov.docx
+++ b/ZS_2026-27/Geodezia_1/Zadania/MOLNAR_GEODEZIA/MOLNAR_Zadanie_2_Meranie_vodorovnych_smerov.docx
@@ -670,11 +670,10 @@
             </w:pPr>
             <w:r>
               <w:rPr>
-                <w:highlight w:val="yellow"/>
                 <w:sz w:val="20"/>
                 <w:szCs w:val="20"/>
               </w:rPr>
-              <w:t/>
+              <w:t>11. 10. 2026</w:t>
             </w:r>
             <w:r>
               <w:rPr>
@@ -846,17 +845,7 @@
       </w:pPr>
       <w:r>
         <w:rPr/>
-        <w:t xml:space="preserve">Meranie sme vykonali dňa 28. 9. 2026 (</w:t>
-      </w:r>
-      <w:r>
-        <w:rPr>
-          <w:highlight w:val="yellow"/>
-        </w:rPr>
-        <w:t xml:space="preserve">[miesto merania]</w:t>
-      </w:r>
-      <w:r>
-        <w:rPr/>
-        <w:t xml:space="preserve">). Použili sme elektronický teodolit Nivel System DT-2 a elektronickú totálnu stanicu Trimble C5, oba na statíve.</w:t>
+        <w:t xml:space="preserve">Meranie sme vykonali dňa 28. 9. 2026 (Námestie slobody v Bratislave). Použili sme elektronický teodolit Nivel System DT-2 a elektronickú totálnu stanicu Trimble C5, oba na statíve.</w:t>
       </w:r>
     </w:p>
     <w:p>
@@ -1395,13 +1384,7 @@
       </w:pPr>
       <w:r>
         <w:rPr/>
-        <w:t xml:space="preserve">V Bratislave, dňa </w:t>
-      </w:r>
-      <w:r>
-        <w:rPr>
-          <w:highlight w:val="yellow"/>
-        </w:rPr>
-        <w:t xml:space="preserve">[dátum]</w:t>
+        <w:t xml:space="preserve">V Bratislave, dňa 11. 10. 2026</w:t>
       </w:r>
     </w:p>
     <w:p>

</xml_diff>

<commit_message>
Geodezia 1 Zadanie 2: podpisana verzia, oprava preklepu
Co-Authored-By: Claude Opus 5.5 (1M context) <noreply@anthropic.com>
</commit_message>
<xml_diff>
--- a/ZS_2026-27/Geodezia_1/Zadania/MOLNAR_GEODEZIA/MOLNAR_Zadanie_2_Meranie_vodorovnych_smerov.docx
+++ b/ZS_2026-27/Geodezia_1/Zadania/MOLNAR_GEODEZIA/MOLNAR_Zadanie_2_Meranie_vodorovnych_smerov.docx
@@ -675,13 +675,6 @@
               </w:rPr>
               <w:t>11. 10. 2026</w:t>
             </w:r>
-            <w:r>
-              <w:rPr>
-                <w:sz w:val="20"/>
-                <w:szCs w:val="20"/>
-              </w:rPr>
-              <w:t/>
-            </w:r>
           </w:p>
         </w:tc>
       </w:tr>
@@ -780,8 +773,8 @@
     <w:p>
       <w:pPr>
         <w:sectPr>
-          <w:headerReference w:type="default" r:id="rId7"/>
-          <w:footerReference w:type="default" r:id="rId8"/>
+          <w:headerReference w:type="default" r:id="rId8"/>
+          <w:footerReference w:type="default" r:id="rId9"/>
           <w:pgSz w:w="11906" w:h="16838"/>
           <w:pgMar w:top="1134" w:right="850" w:bottom="680" w:left="1134" w:header="708" w:footer="708" w:gutter="0"/>
           <w:cols w:space="720"/>
@@ -801,7 +794,8 @@
           <w:sz w:val="28"/>
           <w:szCs w:val="28"/>
         </w:rPr>
-        <w:t xml:space="preserve">Technická správa</w:t>
+        <w:lastRenderedPageBreak/>
+        <w:t>Technická správa</w:t>
       </w:r>
     </w:p>
     <w:p>
@@ -814,7 +808,7 @@
           <w:b/>
           <w:bCs/>
         </w:rPr>
-        <w:t xml:space="preserve">1  Definícia úlohy</w:t>
+        <w:t>1  Definícia úlohy</w:t>
       </w:r>
     </w:p>
     <w:p>
@@ -822,8 +816,7 @@
         <w:spacing w:after="120"/>
       </w:pPr>
       <w:r>
-        <w:rPr/>
-        <w:t xml:space="preserve">Elaborát bol vypracovaný na základe zadania č. 2 z predmetu Geodézia 1, ktoré zadal doc. Ing. Marián Marčiš, PhD. dňa 28. 9. 2026. Cieľom úlohy bolo odmerať 2 vodorovné smery v troch skupinách v dvoch polohách ďalekohľadu prístrojmi Nivel System DT-2 a Trimble C5 a vypočítať zápisník meraných vodorovných smerov.</w:t>
+        <w:t>Cieľom úlohy bolo odmerať 2 vodorovné smery v troch skupinách v dvoch polohách ďalekohľadu prístrojmi Nivel System DT-2 a Trimble C5 a vypočítať zápisník meraných vodorovných smerov.</w:t>
       </w:r>
     </w:p>
     <w:p>
@@ -836,7 +829,7 @@
           <w:b/>
           <w:bCs/>
         </w:rPr>
-        <w:t xml:space="preserve">2  Postup merania</w:t>
+        <w:t>2  Postup merania</w:t>
       </w:r>
     </w:p>
     <w:p>
@@ -844,8 +837,13 @@
         <w:spacing w:after="120"/>
       </w:pPr>
       <w:r>
-        <w:rPr/>
-        <w:t xml:space="preserve">Meranie sme vykonali dňa 28. 9. 2026 (Námestie slobody v Bratislave). Použili sme elektronický teodolit Nivel System DT-2 a elektronickú totálnu stanicu Trimble C5, oba na statíve.</w:t>
+        <w:t xml:space="preserve">Meranie sme vykonali dňa 28. 9. 2026 </w:t>
+      </w:r>
+      <w:r>
+        <w:t xml:space="preserve">na </w:t>
+      </w:r>
+      <w:r>
+        <w:t>Námestí slobody v Bratislave. Použili sme elektronický teodolit Nivel System DT-2 a elektronickú totálnu stanicu Trimble C5, oba na statíve.</w:t>
       </w:r>
     </w:p>
     <w:p>
@@ -853,8 +851,13 @@
         <w:spacing w:after="120"/>
       </w:pPr>
       <w:r>
-        <w:rPr/>
-        <w:t xml:space="preserve">Prístroj sme postavili nad stanovisko, zcentrovali a zhorizontovali rovnakým postupom ako v zadaní č. 1. Vodorovné smery sme merali skupinovou metódou. V I. polohe ďalekohľadu sme zacielili na prvý bod, nastavili nulové čítanie a v smere chodu hodinových ručičiek sme zacielili na druhý bod. Potom sme ďalekohľad preložili do II. polohy a smery sme odčítali v opačnom poradí, najprv na druhý a potom na prvý bod (obr. 1). Jedno meranie v oboch polohách tvorí jednu skupinu.</w:t>
+        <w:t xml:space="preserve">Prístroj sme postavili </w:t>
+      </w:r>
+      <w:r>
+        <w:t>nad bod</w:t>
+      </w:r>
+      <w:r>
+        <w:t>, zcentrovali a zhorizontovali rovnakým postupom ako v zadaní č. 1. Vodorovné smery sme merali skupinovou metódou. V I. polohe ďalekohľadu sme zacielili na prvý bod, nastavili nulové čítanie a v smere chodu hodinových ručičiek sme zacielili na druhý bod. Potom sme ďalekohľad preložili do II. polohy a smery sme odčítali v opačnom poradí, najprv na druhý a potom na prvý bod (obr. 1). Jedno meranie v oboch polohách tvorí jednu skupinu.</w:t>
       </w:r>
     </w:p>
     <w:p>
@@ -862,47 +865,42 @@
         <w:spacing w:after="120"/>
       </w:pPr>
       <w:r>
-        <w:rPr/>
-        <w:t xml:space="preserve">Aby sa zmenšil vplyv chýb delenia vodorovného kruhu, nulové čítanie na prvý bod sme v každej skupine posunuli približne o 200</w:t>
+        <w:t>Aby sa zmenšil vplyv chýb delenia vodorovného kruhu, nulové čítanie na prvý bod sme v každej skupine posunuli približne o 200</w:t>
       </w:r>
       <w:r>
         <w:rPr>
           <w:vertAlign w:val="superscript"/>
         </w:rPr>
-        <w:t xml:space="preserve">g</w:t>
-      </w:r>
-      <w:r>
-        <w:rPr/>
+        <w:t>g</w:t>
+      </w:r>
+      <w:r>
         <w:t xml:space="preserve"> / 3, teda na 0</w:t>
       </w:r>
       <w:r>
         <w:rPr>
           <w:vertAlign w:val="superscript"/>
         </w:rPr>
-        <w:t xml:space="preserve">g</w:t>
-      </w:r>
-      <w:r>
-        <w:rPr/>
+        <w:t>g</w:t>
+      </w:r>
+      <w:r>
         <w:t xml:space="preserve"> v 1. skupine, 70</w:t>
       </w:r>
       <w:r>
         <w:rPr>
           <w:vertAlign w:val="superscript"/>
         </w:rPr>
-        <w:t xml:space="preserve">g</w:t>
-      </w:r>
-      <w:r>
-        <w:rPr/>
+        <w:t>g</w:t>
+      </w:r>
+      <w:r>
         <w:t xml:space="preserve"> v 2. skupine a 140</w:t>
       </w:r>
       <w:r>
         <w:rPr>
           <w:vertAlign w:val="superscript"/>
         </w:rPr>
-        <w:t xml:space="preserve">g</w:t>
-      </w:r>
-      <w:r>
-        <w:rPr/>
+        <w:t>g</w:t>
+      </w:r>
+      <w:r>
         <w:t xml:space="preserve"> v 3. skupine.</w:t>
       </w:r>
     </w:p>
@@ -911,8 +909,7 @@
         <w:spacing w:after="120"/>
       </w:pPr>
       <w:r>
-        <w:rPr/>
-        <w:t xml:space="preserve">Pri oboch elektronických prístrojoch sme po zacielení na prvý bod nastavili požadované nulové čítanie pomocou klávesnice prístroja a vodorovné smery sme odčítali priamo z displeja.</w:t>
+        <w:t>Pri oboch elektronických prístrojoch sme po zacielení na prvý bod nastavili požadované nulové čítanie pomocou klávesnice prístroja a vodorovné smery sme odčítali priamo z displeja.</w:t>
       </w:r>
     </w:p>
     <w:p>
@@ -926,7 +923,7 @@
           <w:noProof/>
         </w:rPr>
         <w:drawing>
-          <wp:inline distT="0" distB="0" distL="0" distR="0">
+          <wp:inline distT="0" distB="0" distL="0" distR="0" wp14:anchorId="22148E6B" wp14:editId="09A86562">
             <wp:extent cx="5220000" cy="3262500"/>
             <wp:effectExtent l="0" t="0" r="0" b="0"/>
             <wp:docPr id="1" name="schema.png"/>
@@ -941,7 +938,7 @@
                     <pic:cNvPicPr/>
                   </pic:nvPicPr>
                   <pic:blipFill>
-                    <a:blip r:embed="rId9"/>
+                    <a:blip r:embed="rId10"/>
                     <a:stretch>
                       <a:fillRect/>
                     </a:stretch>
@@ -972,7 +969,7 @@
           <w:sz w:val="20"/>
           <w:szCs w:val="20"/>
         </w:rPr>
-        <w:t xml:space="preserve">Obr. 1  Schéma merania vodorovných smerov v dvoch polohách ďalekohľadu</w:t>
+        <w:t>Obr. 1  Schéma merania vodorovných smerov v dvoch polohách ďalekohľadu</w:t>
       </w:r>
     </w:p>
     <w:p>
@@ -985,7 +982,7 @@
           <w:b/>
           <w:bCs/>
         </w:rPr>
-        <w:t xml:space="preserve">3  Postup riešenia úlohy</w:t>
+        <w:t>3  Postup riešenia úlohy</w:t>
       </w:r>
     </w:p>
     <w:p>
@@ -994,18 +991,16 @@
         <w:spacing w:after="120"/>
       </w:pPr>
       <w:r>
-        <w:rPr/>
-        <w:t xml:space="preserve">Namerané smery sú zapísané v zápisníku v prílohe A.1. V každej skupine sme pre každý bod vypočítali priemer z oboch polôh ďalekohľadu, pričom čítanie v II. polohe sme zmenšili (zväčšili) o 200</w:t>
+        <w:t>Namerané smery sú zapísané v zápisníku v prílohe A.1. V každej skupine sme pre každý bod vypočítali priemer z oboch polôh ďalekohľadu, pričom čítanie v II. polohe sme zmenšili (zväčšili) o 200</w:t>
       </w:r>
       <w:r>
         <w:rPr>
           <w:vertAlign w:val="superscript"/>
         </w:rPr>
-        <w:t xml:space="preserve">g</w:t>
-      </w:r>
-      <w:r>
-        <w:rPr/>
-        <w:t xml:space="preserve">:</w:t>
+        <w:t>g</w:t>
+      </w:r>
+      <w:r>
+        <w:t>:</w:t>
       </w:r>
     </w:p>
     <w:p>
@@ -1017,50 +1012,39 @@
         <w:spacing w:after="160"/>
       </w:pPr>
       <w:r>
-        <w:rPr/>
         <w:tab/>
-      </w:r>
-      <w:r>
-        <w:rPr/>
-        <w:t xml:space="preserve">ψ = (ψ</w:t>
+        <w:t>ψ = (ψ</w:t>
       </w:r>
       <w:r>
         <w:rPr>
           <w:vertAlign w:val="subscript"/>
         </w:rPr>
-        <w:t xml:space="preserve">I</w:t>
-      </w:r>
-      <w:r>
-        <w:rPr/>
+        <w:t>I</w:t>
+      </w:r>
+      <w:r>
         <w:t xml:space="preserve"> + (ψ</w:t>
       </w:r>
       <w:r>
         <w:rPr>
           <w:vertAlign w:val="subscript"/>
         </w:rPr>
-        <w:t xml:space="preserve">II</w:t>
-      </w:r>
-      <w:r>
-        <w:rPr/>
+        <w:t>II</w:t>
+      </w:r>
+      <w:r>
         <w:t xml:space="preserve"> ∓ 200</w:t>
       </w:r>
       <w:r>
         <w:rPr>
           <w:vertAlign w:val="superscript"/>
         </w:rPr>
-        <w:t xml:space="preserve">g</w:t>
-      </w:r>
-      <w:r>
-        <w:rPr/>
-        <w:t xml:space="preserve">)) / 2</w:t>
-      </w:r>
-      <w:r>
-        <w:rPr/>
+        <w:t>g</w:t>
+      </w:r>
+      <w:r>
+        <w:t>)) / 2</w:t>
+      </w:r>
+      <w:r>
         <w:tab/>
-      </w:r>
-      <w:r>
-        <w:rPr/>
-        <w:t xml:space="preserve">(1)</w:t>
+        <w:t>(1)</w:t>
       </w:r>
     </w:p>
     <w:p>
@@ -1069,8 +1053,7 @@
         <w:spacing w:after="120"/>
       </w:pPr>
       <w:r>
-        <w:rPr/>
-        <w:t xml:space="preserve">Rozdiel čítaní v oboch polohách slúži ako kontrola merania (vplyv kolimačnej chyby):</w:t>
+        <w:t>Rozdiel čítaní v oboch polohách slúži ako kontrola merania (vplyv kolimačnej chyby):</w:t>
       </w:r>
     </w:p>
     <w:p>
@@ -1082,50 +1065,39 @@
         <w:spacing w:after="160"/>
       </w:pPr>
       <w:r>
-        <w:rPr/>
         <w:tab/>
-      </w:r>
-      <w:r>
-        <w:rPr/>
-        <w:t xml:space="preserve">2c = ψ</w:t>
+        <w:t>2c = ψ</w:t>
       </w:r>
       <w:r>
         <w:rPr>
           <w:vertAlign w:val="subscript"/>
         </w:rPr>
-        <w:t xml:space="preserve">I</w:t>
-      </w:r>
-      <w:r>
-        <w:rPr/>
+        <w:t>I</w:t>
+      </w:r>
+      <w:r>
         <w:t xml:space="preserve"> − (ψ</w:t>
       </w:r>
       <w:r>
         <w:rPr>
           <w:vertAlign w:val="subscript"/>
         </w:rPr>
-        <w:t xml:space="preserve">II</w:t>
-      </w:r>
-      <w:r>
-        <w:rPr/>
+        <w:t>II</w:t>
+      </w:r>
+      <w:r>
         <w:t xml:space="preserve"> ∓ 200</w:t>
       </w:r>
       <w:r>
         <w:rPr>
           <w:vertAlign w:val="superscript"/>
         </w:rPr>
-        <w:t xml:space="preserve">g</w:t>
-      </w:r>
-      <w:r>
-        <w:rPr/>
-        <w:t xml:space="preserve">)</w:t>
-      </w:r>
-      <w:r>
-        <w:rPr/>
+        <w:t>g</w:t>
+      </w:r>
+      <w:r>
+        <w:t>)</w:t>
+      </w:r>
+      <w:r>
         <w:tab/>
-      </w:r>
-      <w:r>
-        <w:rPr/>
-        <w:t xml:space="preserve">(2)</w:t>
+        <w:t>(2)</w:t>
       </w:r>
     </w:p>
     <w:p>
@@ -1134,8 +1106,8 @@
         <w:spacing w:after="120"/>
       </w:pPr>
       <w:r>
-        <w:rPr/>
-        <w:t xml:space="preserve">Priemerné smery sme zredukovali na prvý bod, takže smer na prvý bod je v každej skupine nulový:</w:t>
+        <w:lastRenderedPageBreak/>
+        <w:t>Priemerné smery sme zredukovali na prvý bod, takže smer na prvý bod je v každej skupine nulový:</w:t>
       </w:r>
     </w:p>
     <w:p>
@@ -1147,46 +1119,36 @@
         <w:spacing w:after="160"/>
       </w:pPr>
       <w:r>
-        <w:rPr/>
         <w:tab/>
-      </w:r>
-      <w:r>
-        <w:rPr/>
-        <w:t xml:space="preserve">ψ</w:t>
+        <w:t>ψ</w:t>
       </w:r>
       <w:r>
         <w:rPr>
           <w:vertAlign w:val="subscript"/>
         </w:rPr>
-        <w:t xml:space="preserve">red,j</w:t>
-      </w:r>
-      <w:r>
-        <w:rPr/>
+        <w:t>red,j</w:t>
+      </w:r>
+      <w:r>
         <w:t xml:space="preserve"> = ψ</w:t>
       </w:r>
       <w:r>
         <w:rPr>
           <w:vertAlign w:val="subscript"/>
         </w:rPr>
-        <w:t xml:space="preserve">j</w:t>
-      </w:r>
-      <w:r>
-        <w:rPr/>
+        <w:t>j</w:t>
+      </w:r>
+      <w:r>
         <w:t xml:space="preserve"> − ψ</w:t>
       </w:r>
       <w:r>
         <w:rPr>
           <w:vertAlign w:val="subscript"/>
         </w:rPr>
-        <w:t xml:space="preserve">1</w:t>
-      </w:r>
-      <w:r>
-        <w:rPr/>
+        <w:t>1</w:t>
+      </w:r>
+      <w:r>
         <w:tab/>
-      </w:r>
-      <w:r>
-        <w:rPr/>
-        <w:t xml:space="preserve">(3)</w:t>
+        <w:t>(3)</w:t>
       </w:r>
     </w:p>
     <w:p>
@@ -1195,8 +1157,7 @@
         <w:spacing w:after="120"/>
       </w:pPr>
       <w:r>
-        <w:rPr/>
-        <w:t xml:space="preserve">Výsledný smer je aritmetický priemer redukovaných smerov z troch skupín a zároveň udáva vodorovný uhol medzi oboma bodmi:</w:t>
+        <w:t>Výsledný smer je aritmetický priemer redukovaných smerov z troch skupín a zároveň udáva vodorovný uhol medzi oboma bodmi:</w:t>
       </w:r>
     </w:p>
     <w:p>
@@ -1208,84 +1169,72 @@
         <w:spacing w:after="160"/>
       </w:pPr>
       <w:r>
-        <w:rPr/>
         <w:tab/>
-      </w:r>
-      <w:r>
-        <w:rPr/>
-        <w:t xml:space="preserve">ψ̄ = (ψ</w:t>
+        <w:t>ψ̄ = (ψ</w:t>
       </w:r>
       <w:r>
         <w:rPr>
           <w:vertAlign w:val="subscript"/>
         </w:rPr>
-        <w:t xml:space="preserve">red</w:t>
+        <w:t>red</w:t>
       </w:r>
       <w:r>
         <w:rPr>
           <w:vertAlign w:val="superscript"/>
         </w:rPr>
-        <w:t xml:space="preserve">(1)</w:t>
-      </w:r>
-      <w:r>
-        <w:rPr/>
+        <w:t>(1)</w:t>
+      </w:r>
+      <w:r>
         <w:t xml:space="preserve"> + ψ</w:t>
       </w:r>
       <w:r>
         <w:rPr>
           <w:vertAlign w:val="subscript"/>
         </w:rPr>
-        <w:t xml:space="preserve">red</w:t>
+        <w:t>red</w:t>
       </w:r>
       <w:r>
         <w:rPr>
           <w:vertAlign w:val="superscript"/>
         </w:rPr>
-        <w:t xml:space="preserve">(2)</w:t>
-      </w:r>
-      <w:r>
-        <w:rPr/>
+        <w:t>(2)</w:t>
+      </w:r>
+      <w:r>
         <w:t xml:space="preserve"> + ψ</w:t>
       </w:r>
       <w:r>
         <w:rPr>
           <w:vertAlign w:val="subscript"/>
         </w:rPr>
-        <w:t xml:space="preserve">red</w:t>
+        <w:t>red</w:t>
       </w:r>
       <w:r>
         <w:rPr>
           <w:vertAlign w:val="superscript"/>
         </w:rPr>
-        <w:t xml:space="preserve">(3)</w:t>
-      </w:r>
-      <w:r>
-        <w:rPr/>
-        <w:t xml:space="preserve">) / 3,     ω = ψ̄</w:t>
+        <w:t>(3)</w:t>
+      </w:r>
+      <w:r>
+        <w:t>) / 3,     ω = ψ̄</w:t>
       </w:r>
       <w:r>
         <w:rPr>
           <w:vertAlign w:val="subscript"/>
         </w:rPr>
-        <w:t xml:space="preserve">2</w:t>
-      </w:r>
-      <w:r>
-        <w:rPr/>
+        <w:t>2</w:t>
+      </w:r>
+      <w:r>
         <w:t xml:space="preserve"> − ψ̄</w:t>
       </w:r>
       <w:r>
         <w:rPr>
           <w:vertAlign w:val="subscript"/>
         </w:rPr>
-        <w:t xml:space="preserve">1</w:t>
-      </w:r>
-      <w:r>
-        <w:rPr/>
+        <w:t>1</w:t>
+      </w:r>
+      <w:r>
         <w:tab/>
-      </w:r>
-      <w:r>
-        <w:rPr/>
-        <w:t xml:space="preserve">(4)</w:t>
+        <w:t>(4)</w:t>
       </w:r>
     </w:p>
     <w:p>
@@ -1293,8 +1242,7 @@
         <w:spacing w:after="120"/>
       </w:pPr>
       <w:r>
-        <w:rPr/>
-        <w:t xml:space="preserve">Výpočty sú v zápisníku v prílohe A.1 a výsledky sú zhrnuté v tab. 1 v tej istej prílohe.</w:t>
+        <w:t>Výpočty sú v zápisníku v prílohe A.1 a výsledky sú zhrnuté v tab. 1 v tej istej prílohe.</w:t>
       </w:r>
     </w:p>
     <w:p>
@@ -1307,7 +1255,7 @@
           <w:b/>
           <w:bCs/>
         </w:rPr>
-        <w:t xml:space="preserve">4  Zhodnotenie výsledkov</w:t>
+        <w:t>4  Zhodnotenie výsledkov</w:t>
       </w:r>
     </w:p>
     <w:p>
@@ -1315,48 +1263,43 @@
         <w:spacing w:after="120"/>
       </w:pPr>
       <w:r>
-        <w:rPr/>
-        <w:t xml:space="preserve">Z troch skupín prístrojom Nivel System DT-2 sme určili vodorovný uhol ω = 11,4884</w:t>
+        <w:t>Z troch skupín prístrojom Nivel System DT-2 sme určili vodorovný uhol ω = 11,4884</w:t>
       </w:r>
       <w:r>
         <w:rPr>
           <w:vertAlign w:val="superscript"/>
         </w:rPr>
-        <w:t xml:space="preserve">g</w:t>
-      </w:r>
-      <w:r>
-        <w:rPr/>
+        <w:t>g</w:t>
+      </w:r>
+      <w:r>
         <w:t xml:space="preserve"> (rozdiel redukovaných smerov medzi skupinami najviac 17</w:t>
       </w:r>
       <w:r>
         <w:rPr>
           <w:vertAlign w:val="superscript"/>
         </w:rPr>
-        <w:t xml:space="preserve">cc</w:t>
-      </w:r>
-      <w:r>
-        <w:rPr/>
-        <w:t xml:space="preserve">); prístrojom Trimble C5 sme určili vodorovný uhol ω = 11,5090</w:t>
+        <w:t>cc</w:t>
+      </w:r>
+      <w:r>
+        <w:t>); prístrojom Trimble C5 sme určili vodorovný uhol ω = 11,5090</w:t>
       </w:r>
       <w:r>
         <w:rPr>
           <w:vertAlign w:val="superscript"/>
         </w:rPr>
-        <w:t xml:space="preserve">g</w:t>
-      </w:r>
-      <w:r>
-        <w:rPr/>
+        <w:t>g</w:t>
+      </w:r>
+      <w:r>
         <w:t xml:space="preserve"> (rozdiel redukovaných smerov medzi skupinami najviac 175</w:t>
       </w:r>
       <w:r>
         <w:rPr>
           <w:vertAlign w:val="superscript"/>
         </w:rPr>
-        <w:t xml:space="preserve">cc</w:t>
-      </w:r>
-      <w:r>
-        <w:rPr/>
-        <w:t xml:space="preserve">).</w:t>
+        <w:t>cc</w:t>
+      </w:r>
+      <w:r>
+        <w:t>).</w:t>
       </w:r>
     </w:p>
     <w:p>
@@ -1364,18 +1307,16 @@
         <w:spacing w:after="120"/>
       </w:pPr>
       <w:r>
-        <w:rPr/>
-        <w:t xml:space="preserve">Rozdiel uhlov z oboch prístrojov je 206</w:t>
+        <w:t>Rozdiel uhlov z oboch prístrojov je 206</w:t>
       </w:r>
       <w:r>
         <w:rPr>
           <w:vertAlign w:val="superscript"/>
         </w:rPr>
-        <w:t xml:space="preserve">cc</w:t>
-      </w:r>
-      <w:r>
-        <w:rPr/>
-        <w:t xml:space="preserve">. Meraním v dvoch polohách ďalekohľadu sa vylúčil vplyv kolimačnej chyby a chyby horizontálnej osi, posunom nulového čítania medzi skupinami sa zmenšil vplyv chýb delenia vodorovného kruhu.</w:t>
+        <w:t>cc</w:t>
+      </w:r>
+      <w:r>
+        <w:t>. Meraním v dvoch polohách ďalekohľadu sa vylúčil vplyv kolimačnej chyby a chyby horizontálnej osi, posunom nulového čítania medzi skupinami sa zmenšil vplyv chýb delenia vodorovného kruhu.</w:t>
       </w:r>
     </w:p>
     <w:p>
@@ -1383,8 +1324,1122 @@
         <w:spacing w:before="360" w:after="480"/>
       </w:pPr>
       <w:r>
-        <w:rPr/>
-        <w:t xml:space="preserve">V Bratislave, dňa 11. 10. 2026</w:t>
+        <w:rPr>
+          <w:noProof/>
+        </w:rPr>
+        <mc:AlternateContent>
+          <mc:Choice Requires="wps">
+            <w:drawing>
+              <wp:anchor distT="0" distB="0" distL="114300" distR="114300" simplePos="0" relativeHeight="251659264" behindDoc="0" locked="0" layoutInCell="1" allowOverlap="1" wp14:anchorId="7FC52762" wp14:editId="25F1D2F5">
+                <wp:simplePos x="0" y="0"/>
+                <wp:positionH relativeFrom="column">
+                  <wp:posOffset>3922395</wp:posOffset>
+                </wp:positionH>
+                <wp:positionV relativeFrom="paragraph">
+                  <wp:posOffset>180340</wp:posOffset>
+                </wp:positionV>
+                <wp:extent cx="1158861" cy="1098359"/>
+                <wp:effectExtent l="0" t="0" r="41910" b="26035"/>
+                <wp:wrapNone/>
+                <wp:docPr id="959731760" name="Freeform: Shape 2"/>
+                <wp:cNvGraphicFramePr/>
+                <a:graphic xmlns:a="http://schemas.openxmlformats.org/drawingml/2006/main">
+                  <a:graphicData uri="http://schemas.microsoft.com/office/word/2010/wordprocessingShape">
+                    <wps:wsp>
+                      <wps:cNvSpPr/>
+                      <wps:spPr>
+                        <a:xfrm>
+                          <a:off x="0" y="0"/>
+                          <a:ext cx="1158861" cy="1098359"/>
+                        </a:xfrm>
+                        <a:custGeom>
+                          <a:avLst/>
+                          <a:gdLst>
+                            <a:gd name="csX0" fmla="*/ 621 w 1158861"/>
+                            <a:gd name="csY0" fmla="*/ 412559 h 1098359"/>
+                            <a:gd name="csX1" fmla="*/ 41261 w 1158861"/>
+                            <a:gd name="csY1" fmla="*/ 300799 h 1098359"/>
+                            <a:gd name="csX2" fmla="*/ 66661 w 1158861"/>
+                            <a:gd name="csY2" fmla="*/ 305879 h 1098359"/>
+                            <a:gd name="csX3" fmla="*/ 86981 w 1158861"/>
+                            <a:gd name="csY3" fmla="*/ 336359 h 1098359"/>
+                            <a:gd name="csX4" fmla="*/ 71741 w 1158861"/>
+                            <a:gd name="csY4" fmla="*/ 351599 h 1098359"/>
+                            <a:gd name="csX5" fmla="*/ 36181 w 1158861"/>
+                            <a:gd name="csY5" fmla="*/ 376999 h 1098359"/>
+                            <a:gd name="csX6" fmla="*/ 31101 w 1158861"/>
+                            <a:gd name="csY6" fmla="*/ 392239 h 1098359"/>
+                            <a:gd name="csX7" fmla="*/ 41261 w 1158861"/>
+                            <a:gd name="csY7" fmla="*/ 351599 h 1098359"/>
+                            <a:gd name="csX8" fmla="*/ 61581 w 1158861"/>
+                            <a:gd name="csY8" fmla="*/ 336359 h 1098359"/>
+                            <a:gd name="csX9" fmla="*/ 117461 w 1158861"/>
+                            <a:gd name="csY9" fmla="*/ 290639 h 1098359"/>
+                            <a:gd name="csX10" fmla="*/ 142861 w 1158861"/>
+                            <a:gd name="csY10" fmla="*/ 295719 h 1098359"/>
+                            <a:gd name="csX11" fmla="*/ 163181 w 1158861"/>
+                            <a:gd name="csY11" fmla="*/ 356679 h 1098359"/>
+                            <a:gd name="csX12" fmla="*/ 173341 w 1158861"/>
+                            <a:gd name="csY12" fmla="*/ 402399 h 1098359"/>
+                            <a:gd name="csX13" fmla="*/ 178421 w 1158861"/>
+                            <a:gd name="csY13" fmla="*/ 427799 h 1098359"/>
+                            <a:gd name="csX14" fmla="*/ 183501 w 1158861"/>
+                            <a:gd name="csY14" fmla="*/ 514159 h 1098359"/>
+                            <a:gd name="csX15" fmla="*/ 198741 w 1158861"/>
+                            <a:gd name="csY15" fmla="*/ 341439 h 1098359"/>
+                            <a:gd name="csX16" fmla="*/ 234301 w 1158861"/>
+                            <a:gd name="csY16" fmla="*/ 280479 h 1098359"/>
+                            <a:gd name="csX17" fmla="*/ 249541 w 1158861"/>
+                            <a:gd name="csY17" fmla="*/ 275399 h 1098359"/>
+                            <a:gd name="csX18" fmla="*/ 259701 w 1158861"/>
+                            <a:gd name="csY18" fmla="*/ 295719 h 1098359"/>
+                            <a:gd name="csX19" fmla="*/ 274941 w 1158861"/>
+                            <a:gd name="csY19" fmla="*/ 316039 h 1098359"/>
+                            <a:gd name="csX20" fmla="*/ 285101 w 1158861"/>
+                            <a:gd name="csY20" fmla="*/ 331279 h 1098359"/>
+                            <a:gd name="csX21" fmla="*/ 295261 w 1158861"/>
+                            <a:gd name="csY21" fmla="*/ 382079 h 1098359"/>
+                            <a:gd name="csX22" fmla="*/ 300341 w 1158861"/>
+                            <a:gd name="csY22" fmla="*/ 427799 h 1098359"/>
+                            <a:gd name="csX23" fmla="*/ 310501 w 1158861"/>
+                            <a:gd name="csY23" fmla="*/ 549719 h 1098359"/>
+                            <a:gd name="csX24" fmla="*/ 330821 w 1158861"/>
+                            <a:gd name="csY24" fmla="*/ 534479 h 1098359"/>
+                            <a:gd name="csX25" fmla="*/ 310501 w 1158861"/>
+                            <a:gd name="csY25" fmla="*/ 402399 h 1098359"/>
+                            <a:gd name="csX26" fmla="*/ 335901 w 1158861"/>
+                            <a:gd name="csY26" fmla="*/ 249999 h 1098359"/>
+                            <a:gd name="csX27" fmla="*/ 351141 w 1158861"/>
+                            <a:gd name="csY27" fmla="*/ 244919 h 1098359"/>
+                            <a:gd name="csX28" fmla="*/ 366381 w 1158861"/>
+                            <a:gd name="csY28" fmla="*/ 255079 h 1098359"/>
+                            <a:gd name="csX29" fmla="*/ 391781 w 1158861"/>
+                            <a:gd name="csY29" fmla="*/ 300799 h 1098359"/>
+                            <a:gd name="csX30" fmla="*/ 401941 w 1158861"/>
+                            <a:gd name="csY30" fmla="*/ 331279 h 1098359"/>
+                            <a:gd name="csX31" fmla="*/ 407021 w 1158861"/>
+                            <a:gd name="csY31" fmla="*/ 432879 h 1098359"/>
+                            <a:gd name="csX32" fmla="*/ 412101 w 1158861"/>
+                            <a:gd name="csY32" fmla="*/ 839279 h 1098359"/>
+                            <a:gd name="csX33" fmla="*/ 432421 w 1158861"/>
+                            <a:gd name="csY33" fmla="*/ 798639 h 1098359"/>
+                            <a:gd name="csX34" fmla="*/ 457821 w 1158861"/>
+                            <a:gd name="csY34" fmla="*/ 727519 h 1098359"/>
+                            <a:gd name="csX35" fmla="*/ 478141 w 1158861"/>
+                            <a:gd name="csY35" fmla="*/ 651319 h 1098359"/>
+                            <a:gd name="csX36" fmla="*/ 498461 w 1158861"/>
+                            <a:gd name="csY36" fmla="*/ 580199 h 1098359"/>
+                            <a:gd name="csX37" fmla="*/ 513701 w 1158861"/>
+                            <a:gd name="csY37" fmla="*/ 448119 h 1098359"/>
+                            <a:gd name="csX38" fmla="*/ 523861 w 1158861"/>
+                            <a:gd name="csY38" fmla="*/ 402399 h 1098359"/>
+                            <a:gd name="csX39" fmla="*/ 539101 w 1158861"/>
+                            <a:gd name="csY39" fmla="*/ 326199 h 1098359"/>
+                            <a:gd name="csX40" fmla="*/ 549261 w 1158861"/>
+                            <a:gd name="csY40" fmla="*/ 300799 h 1098359"/>
+                            <a:gd name="csX41" fmla="*/ 508621 w 1158861"/>
+                            <a:gd name="csY41" fmla="*/ 305879 h 1098359"/>
+                            <a:gd name="csX42" fmla="*/ 432421 w 1158861"/>
+                            <a:gd name="csY42" fmla="*/ 366839 h 1098359"/>
+                            <a:gd name="csX43" fmla="*/ 325741 w 1158861"/>
+                            <a:gd name="csY43" fmla="*/ 453199 h 1098359"/>
+                            <a:gd name="csX44" fmla="*/ 280021 w 1158861"/>
+                            <a:gd name="csY44" fmla="*/ 478599 h 1098359"/>
+                            <a:gd name="csX45" fmla="*/ 249541 w 1158861"/>
+                            <a:gd name="csY45" fmla="*/ 493839 h 1098359"/>
+                            <a:gd name="csX46" fmla="*/ 234301 w 1158861"/>
+                            <a:gd name="csY46" fmla="*/ 503999 h 1098359"/>
+                            <a:gd name="csX47" fmla="*/ 264781 w 1158861"/>
+                            <a:gd name="csY47" fmla="*/ 498919 h 1098359"/>
+                            <a:gd name="csX48" fmla="*/ 467981 w 1158861"/>
+                            <a:gd name="csY48" fmla="*/ 488759 h 1098359"/>
+                            <a:gd name="csX49" fmla="*/ 645781 w 1158861"/>
+                            <a:gd name="csY49" fmla="*/ 483679 h 1098359"/>
+                            <a:gd name="csX50" fmla="*/ 584821 w 1158861"/>
+                            <a:gd name="csY50" fmla="*/ 473519 h 1098359"/>
+                            <a:gd name="csX51" fmla="*/ 559421 w 1158861"/>
+                            <a:gd name="csY51" fmla="*/ 458279 h 1098359"/>
+                            <a:gd name="csX52" fmla="*/ 518781 w 1158861"/>
+                            <a:gd name="csY52" fmla="*/ 422719 h 1098359"/>
+                            <a:gd name="csX53" fmla="*/ 478141 w 1158861"/>
+                            <a:gd name="csY53" fmla="*/ 402399 h 1098359"/>
+                            <a:gd name="csX54" fmla="*/ 417181 w 1158861"/>
+                            <a:gd name="csY54" fmla="*/ 371919 h 1098359"/>
+                            <a:gd name="csX55" fmla="*/ 386701 w 1158861"/>
+                            <a:gd name="csY55" fmla="*/ 356679 h 1098359"/>
+                            <a:gd name="csX56" fmla="*/ 340981 w 1158861"/>
+                            <a:gd name="csY56" fmla="*/ 341439 h 1098359"/>
+                            <a:gd name="csX57" fmla="*/ 310501 w 1158861"/>
+                            <a:gd name="csY57" fmla="*/ 346519 h 1098359"/>
+                            <a:gd name="csX58" fmla="*/ 305421 w 1158861"/>
+                            <a:gd name="csY58" fmla="*/ 382079 h 1098359"/>
+                            <a:gd name="csX59" fmla="*/ 315581 w 1158861"/>
+                            <a:gd name="csY59" fmla="*/ 448119 h 1098359"/>
+                            <a:gd name="csX60" fmla="*/ 325741 w 1158861"/>
+                            <a:gd name="csY60" fmla="*/ 468439 h 1098359"/>
+                            <a:gd name="csX61" fmla="*/ 401941 w 1158861"/>
+                            <a:gd name="csY61" fmla="*/ 498919 h 1098359"/>
+                            <a:gd name="csX62" fmla="*/ 483221 w 1158861"/>
+                            <a:gd name="csY62" fmla="*/ 488759 h 1098359"/>
+                            <a:gd name="csX63" fmla="*/ 528941 w 1158861"/>
+                            <a:gd name="csY63" fmla="*/ 458279 h 1098359"/>
+                            <a:gd name="csX64" fmla="*/ 554341 w 1158861"/>
+                            <a:gd name="csY64" fmla="*/ 448119 h 1098359"/>
+                            <a:gd name="csX65" fmla="*/ 589901 w 1158861"/>
+                            <a:gd name="csY65" fmla="*/ 453199 h 1098359"/>
+                            <a:gd name="csX66" fmla="*/ 594981 w 1158861"/>
+                            <a:gd name="csY66" fmla="*/ 468439 h 1098359"/>
+                            <a:gd name="csX67" fmla="*/ 610221 w 1158861"/>
+                            <a:gd name="csY67" fmla="*/ 478599 h 1098359"/>
+                            <a:gd name="csX68" fmla="*/ 630541 w 1158861"/>
+                            <a:gd name="csY68" fmla="*/ 468439 h 1098359"/>
+                            <a:gd name="csX69" fmla="*/ 635621 w 1158861"/>
+                            <a:gd name="csY69" fmla="*/ 448119 h 1098359"/>
+                            <a:gd name="csX70" fmla="*/ 650861 w 1158861"/>
+                            <a:gd name="csY70" fmla="*/ 453199 h 1098359"/>
+                            <a:gd name="csX71" fmla="*/ 676261 w 1158861"/>
+                            <a:gd name="csY71" fmla="*/ 458279 h 1098359"/>
+                            <a:gd name="csX72" fmla="*/ 721981 w 1158861"/>
+                            <a:gd name="csY72" fmla="*/ 448119 h 1098359"/>
+                            <a:gd name="csX73" fmla="*/ 732141 w 1158861"/>
+                            <a:gd name="csY73" fmla="*/ 432879 h 1098359"/>
+                            <a:gd name="csX74" fmla="*/ 752461 w 1158861"/>
+                            <a:gd name="csY74" fmla="*/ 417639 h 1098359"/>
+                            <a:gd name="csX75" fmla="*/ 777861 w 1158861"/>
+                            <a:gd name="csY75" fmla="*/ 412559 h 1098359"/>
+                            <a:gd name="csX76" fmla="*/ 813421 w 1158861"/>
+                            <a:gd name="csY76" fmla="*/ 402399 h 1098359"/>
+                            <a:gd name="csX77" fmla="*/ 767701 w 1158861"/>
+                            <a:gd name="csY77" fmla="*/ 392239 h 1098359"/>
+                            <a:gd name="csX78" fmla="*/ 645781 w 1158861"/>
+                            <a:gd name="csY78" fmla="*/ 402399 h 1098359"/>
+                            <a:gd name="csX79" fmla="*/ 615301 w 1158861"/>
+                            <a:gd name="csY79" fmla="*/ 432879 h 1098359"/>
+                            <a:gd name="csX80" fmla="*/ 610221 w 1158861"/>
+                            <a:gd name="csY80" fmla="*/ 453199 h 1098359"/>
+                            <a:gd name="csX81" fmla="*/ 615301 w 1158861"/>
+                            <a:gd name="csY81" fmla="*/ 483679 h 1098359"/>
+                            <a:gd name="csX82" fmla="*/ 666101 w 1158861"/>
+                            <a:gd name="csY82" fmla="*/ 509079 h 1098359"/>
+                            <a:gd name="csX83" fmla="*/ 691501 w 1158861"/>
+                            <a:gd name="csY83" fmla="*/ 519239 h 1098359"/>
+                            <a:gd name="csX84" fmla="*/ 747381 w 1158861"/>
+                            <a:gd name="csY84" fmla="*/ 514159 h 1098359"/>
+                            <a:gd name="csX85" fmla="*/ 762621 w 1158861"/>
+                            <a:gd name="csY85" fmla="*/ 503999 h 1098359"/>
+                            <a:gd name="csX86" fmla="*/ 777861 w 1158861"/>
+                            <a:gd name="csY86" fmla="*/ 498919 h 1098359"/>
+                            <a:gd name="csX87" fmla="*/ 793101 w 1158861"/>
+                            <a:gd name="csY87" fmla="*/ 463359 h 1098359"/>
+                            <a:gd name="csX88" fmla="*/ 803261 w 1158861"/>
+                            <a:gd name="csY88" fmla="*/ 448119 h 1098359"/>
+                            <a:gd name="csX89" fmla="*/ 813421 w 1158861"/>
+                            <a:gd name="csY89" fmla="*/ 427799 h 1098359"/>
+                            <a:gd name="csX90" fmla="*/ 838821 w 1158861"/>
+                            <a:gd name="csY90" fmla="*/ 387159 h 1098359"/>
+                            <a:gd name="csX91" fmla="*/ 854061 w 1158861"/>
+                            <a:gd name="csY91" fmla="*/ 397319 h 1098359"/>
+                            <a:gd name="csX92" fmla="*/ 864221 w 1158861"/>
+                            <a:gd name="csY92" fmla="*/ 412559 h 1098359"/>
+                            <a:gd name="csX93" fmla="*/ 889621 w 1158861"/>
+                            <a:gd name="csY93" fmla="*/ 407479 h 1098359"/>
+                            <a:gd name="csX94" fmla="*/ 1067421 w 1158861"/>
+                            <a:gd name="csY94" fmla="*/ 392239 h 1098359"/>
+                            <a:gd name="csX95" fmla="*/ 1128381 w 1158861"/>
+                            <a:gd name="csY95" fmla="*/ 387159 h 1098359"/>
+                            <a:gd name="csX96" fmla="*/ 1148701 w 1158861"/>
+                            <a:gd name="csY96" fmla="*/ 361759 h 1098359"/>
+                            <a:gd name="csX97" fmla="*/ 1158861 w 1158861"/>
+                            <a:gd name="csY97" fmla="*/ 249999 h 1098359"/>
+                            <a:gd name="csX98" fmla="*/ 1102981 w 1158861"/>
+                            <a:gd name="csY98" fmla="*/ 51879 h 1098359"/>
+                            <a:gd name="csX99" fmla="*/ 1072501 w 1158861"/>
+                            <a:gd name="csY99" fmla="*/ 1079 h 1098359"/>
+                            <a:gd name="csX100" fmla="*/ 991221 w 1158861"/>
+                            <a:gd name="csY100" fmla="*/ 102679 h 1098359"/>
+                            <a:gd name="csX101" fmla="*/ 874381 w 1158861"/>
+                            <a:gd name="csY101" fmla="*/ 702119 h 1098359"/>
+                            <a:gd name="csX102" fmla="*/ 859141 w 1158861"/>
+                            <a:gd name="csY102" fmla="*/ 1027239 h 1098359"/>
+                            <a:gd name="csX103" fmla="*/ 854061 w 1158861"/>
+                            <a:gd name="csY103" fmla="*/ 1098359 h 1098359"/>
+                          </a:gdLst>
+                          <a:ahLst/>
+                          <a:cxnLst>
+                            <a:cxn ang="0">
+                              <a:pos x="csX0" y="csY0"/>
+                            </a:cxn>
+                            <a:cxn ang="0">
+                              <a:pos x="csX1" y="csY1"/>
+                            </a:cxn>
+                            <a:cxn ang="0">
+                              <a:pos x="csX2" y="csY2"/>
+                            </a:cxn>
+                            <a:cxn ang="0">
+                              <a:pos x="csX3" y="csY3"/>
+                            </a:cxn>
+                            <a:cxn ang="0">
+                              <a:pos x="csX4" y="csY4"/>
+                            </a:cxn>
+                            <a:cxn ang="0">
+                              <a:pos x="csX5" y="csY5"/>
+                            </a:cxn>
+                            <a:cxn ang="0">
+                              <a:pos x="csX6" y="csY6"/>
+                            </a:cxn>
+                            <a:cxn ang="0">
+                              <a:pos x="csX7" y="csY7"/>
+                            </a:cxn>
+                            <a:cxn ang="0">
+                              <a:pos x="csX8" y="csY8"/>
+                            </a:cxn>
+                            <a:cxn ang="0">
+                              <a:pos x="csX9" y="csY9"/>
+                            </a:cxn>
+                            <a:cxn ang="0">
+                              <a:pos x="csX10" y="csY10"/>
+                            </a:cxn>
+                            <a:cxn ang="0">
+                              <a:pos x="csX11" y="csY11"/>
+                            </a:cxn>
+                            <a:cxn ang="0">
+                              <a:pos x="csX12" y="csY12"/>
+                            </a:cxn>
+                            <a:cxn ang="0">
+                              <a:pos x="csX13" y="csY13"/>
+                            </a:cxn>
+                            <a:cxn ang="0">
+                              <a:pos x="csX14" y="csY14"/>
+                            </a:cxn>
+                            <a:cxn ang="0">
+                              <a:pos x="csX15" y="csY15"/>
+                            </a:cxn>
+                            <a:cxn ang="0">
+                              <a:pos x="csX16" y="csY16"/>
+                            </a:cxn>
+                            <a:cxn ang="0">
+                              <a:pos x="csX17" y="csY17"/>
+                            </a:cxn>
+                            <a:cxn ang="0">
+                              <a:pos x="csX18" y="csY18"/>
+                            </a:cxn>
+                            <a:cxn ang="0">
+                              <a:pos x="csX19" y="csY19"/>
+                            </a:cxn>
+                            <a:cxn ang="0">
+                              <a:pos x="csX20" y="csY20"/>
+                            </a:cxn>
+                            <a:cxn ang="0">
+                              <a:pos x="csX21" y="csY21"/>
+                            </a:cxn>
+                            <a:cxn ang="0">
+                              <a:pos x="csX22" y="csY22"/>
+                            </a:cxn>
+                            <a:cxn ang="0">
+                              <a:pos x="csX23" y="csY23"/>
+                            </a:cxn>
+                            <a:cxn ang="0">
+                              <a:pos x="csX24" y="csY24"/>
+                            </a:cxn>
+                            <a:cxn ang="0">
+                              <a:pos x="csX25" y="csY25"/>
+                            </a:cxn>
+                            <a:cxn ang="0">
+                              <a:pos x="csX26" y="csY26"/>
+                            </a:cxn>
+                            <a:cxn ang="0">
+                              <a:pos x="csX27" y="csY27"/>
+                            </a:cxn>
+                            <a:cxn ang="0">
+                              <a:pos x="csX28" y="csY28"/>
+                            </a:cxn>
+                            <a:cxn ang="0">
+                              <a:pos x="csX29" y="csY29"/>
+                            </a:cxn>
+                            <a:cxn ang="0">
+                              <a:pos x="csX30" y="csY30"/>
+                            </a:cxn>
+                            <a:cxn ang="0">
+                              <a:pos x="csX31" y="csY31"/>
+                            </a:cxn>
+                            <a:cxn ang="0">
+                              <a:pos x="csX32" y="csY32"/>
+                            </a:cxn>
+                            <a:cxn ang="0">
+                              <a:pos x="csX33" y="csY33"/>
+                            </a:cxn>
+                            <a:cxn ang="0">
+                              <a:pos x="csX34" y="csY34"/>
+                            </a:cxn>
+                            <a:cxn ang="0">
+                              <a:pos x="csX35" y="csY35"/>
+                            </a:cxn>
+                            <a:cxn ang="0">
+                              <a:pos x="csX36" y="csY36"/>
+                            </a:cxn>
+                            <a:cxn ang="0">
+                              <a:pos x="csX37" y="csY37"/>
+                            </a:cxn>
+                            <a:cxn ang="0">
+                              <a:pos x="csX38" y="csY38"/>
+                            </a:cxn>
+                            <a:cxn ang="0">
+                              <a:pos x="csX39" y="csY39"/>
+                            </a:cxn>
+                            <a:cxn ang="0">
+                              <a:pos x="csX40" y="csY40"/>
+                            </a:cxn>
+                            <a:cxn ang="0">
+                              <a:pos x="csX41" y="csY41"/>
+                            </a:cxn>
+                            <a:cxn ang="0">
+                              <a:pos x="csX42" y="csY42"/>
+                            </a:cxn>
+                            <a:cxn ang="0">
+                              <a:pos x="csX43" y="csY43"/>
+                            </a:cxn>
+                            <a:cxn ang="0">
+                              <a:pos x="csX44" y="csY44"/>
+                            </a:cxn>
+                            <a:cxn ang="0">
+                              <a:pos x="csX45" y="csY45"/>
+                            </a:cxn>
+                            <a:cxn ang="0">
+                              <a:pos x="csX46" y="csY46"/>
+                            </a:cxn>
+                            <a:cxn ang="0">
+                              <a:pos x="csX47" y="csY47"/>
+                            </a:cxn>
+                            <a:cxn ang="0">
+                              <a:pos x="csX48" y="csY48"/>
+                            </a:cxn>
+                            <a:cxn ang="0">
+                              <a:pos x="csX49" y="csY49"/>
+                            </a:cxn>
+                            <a:cxn ang="0">
+                              <a:pos x="csX50" y="csY50"/>
+                            </a:cxn>
+                            <a:cxn ang="0">
+                              <a:pos x="csX51" y="csY51"/>
+                            </a:cxn>
+                            <a:cxn ang="0">
+                              <a:pos x="csX52" y="csY52"/>
+                            </a:cxn>
+                            <a:cxn ang="0">
+                              <a:pos x="csX53" y="csY53"/>
+                            </a:cxn>
+                            <a:cxn ang="0">
+                              <a:pos x="csX54" y="csY54"/>
+                            </a:cxn>
+                            <a:cxn ang="0">
+                              <a:pos x="csX55" y="csY55"/>
+                            </a:cxn>
+                            <a:cxn ang="0">
+                              <a:pos x="csX56" y="csY56"/>
+                            </a:cxn>
+                            <a:cxn ang="0">
+                              <a:pos x="csX57" y="csY57"/>
+                            </a:cxn>
+                            <a:cxn ang="0">
+                              <a:pos x="csX58" y="csY58"/>
+                            </a:cxn>
+                            <a:cxn ang="0">
+                              <a:pos x="csX59" y="csY59"/>
+                            </a:cxn>
+                            <a:cxn ang="0">
+                              <a:pos x="csX60" y="csY60"/>
+                            </a:cxn>
+                            <a:cxn ang="0">
+                              <a:pos x="csX61" y="csY61"/>
+                            </a:cxn>
+                            <a:cxn ang="0">
+                              <a:pos x="csX62" y="csY62"/>
+                            </a:cxn>
+                            <a:cxn ang="0">
+                              <a:pos x="csX63" y="csY63"/>
+                            </a:cxn>
+                            <a:cxn ang="0">
+                              <a:pos x="csX64" y="csY64"/>
+                            </a:cxn>
+                            <a:cxn ang="0">
+                              <a:pos x="csX65" y="csY65"/>
+                            </a:cxn>
+                            <a:cxn ang="0">
+                              <a:pos x="csX66" y="csY66"/>
+                            </a:cxn>
+                            <a:cxn ang="0">
+                              <a:pos x="csX67" y="csY67"/>
+                            </a:cxn>
+                            <a:cxn ang="0">
+                              <a:pos x="csX68" y="csY68"/>
+                            </a:cxn>
+                            <a:cxn ang="0">
+                              <a:pos x="csX69" y="csY69"/>
+                            </a:cxn>
+                            <a:cxn ang="0">
+                              <a:pos x="csX70" y="csY70"/>
+                            </a:cxn>
+                            <a:cxn ang="0">
+                              <a:pos x="csX71" y="csY71"/>
+                            </a:cxn>
+                            <a:cxn ang="0">
+                              <a:pos x="csX72" y="csY72"/>
+                            </a:cxn>
+                            <a:cxn ang="0">
+                              <a:pos x="csX73" y="csY73"/>
+                            </a:cxn>
+                            <a:cxn ang="0">
+                              <a:pos x="csX74" y="csY74"/>
+                            </a:cxn>
+                            <a:cxn ang="0">
+                              <a:pos x="csX75" y="csY75"/>
+                            </a:cxn>
+                            <a:cxn ang="0">
+                              <a:pos x="csX76" y="csY76"/>
+                            </a:cxn>
+                            <a:cxn ang="0">
+                              <a:pos x="csX77" y="csY77"/>
+                            </a:cxn>
+                            <a:cxn ang="0">
+                              <a:pos x="csX78" y="csY78"/>
+                            </a:cxn>
+                            <a:cxn ang="0">
+                              <a:pos x="csX79" y="csY79"/>
+                            </a:cxn>
+                            <a:cxn ang="0">
+                              <a:pos x="csX80" y="csY80"/>
+                            </a:cxn>
+                            <a:cxn ang="0">
+                              <a:pos x="csX81" y="csY81"/>
+                            </a:cxn>
+                            <a:cxn ang="0">
+                              <a:pos x="csX82" y="csY82"/>
+                            </a:cxn>
+                            <a:cxn ang="0">
+                              <a:pos x="csX83" y="csY83"/>
+                            </a:cxn>
+                            <a:cxn ang="0">
+                              <a:pos x="csX84" y="csY84"/>
+                            </a:cxn>
+                            <a:cxn ang="0">
+                              <a:pos x="csX85" y="csY85"/>
+                            </a:cxn>
+                            <a:cxn ang="0">
+                              <a:pos x="csX86" y="csY86"/>
+                            </a:cxn>
+                            <a:cxn ang="0">
+                              <a:pos x="csX87" y="csY87"/>
+                            </a:cxn>
+                            <a:cxn ang="0">
+                              <a:pos x="csX88" y="csY88"/>
+                            </a:cxn>
+                            <a:cxn ang="0">
+                              <a:pos x="csX89" y="csY89"/>
+                            </a:cxn>
+                            <a:cxn ang="0">
+                              <a:pos x="csX90" y="csY90"/>
+                            </a:cxn>
+                            <a:cxn ang="0">
+                              <a:pos x="csX91" y="csY91"/>
+                            </a:cxn>
+                            <a:cxn ang="0">
+                              <a:pos x="csX92" y="csY92"/>
+                            </a:cxn>
+                            <a:cxn ang="0">
+                              <a:pos x="csX93" y="csY93"/>
+                            </a:cxn>
+                            <a:cxn ang="0">
+                              <a:pos x="csX94" y="csY94"/>
+                            </a:cxn>
+                            <a:cxn ang="0">
+                              <a:pos x="csX95" y="csY95"/>
+                            </a:cxn>
+                            <a:cxn ang="0">
+                              <a:pos x="csX96" y="csY96"/>
+                            </a:cxn>
+                            <a:cxn ang="0">
+                              <a:pos x="csX97" y="csY97"/>
+                            </a:cxn>
+                            <a:cxn ang="0">
+                              <a:pos x="csX98" y="csY98"/>
+                            </a:cxn>
+                            <a:cxn ang="0">
+                              <a:pos x="csX99" y="csY99"/>
+                            </a:cxn>
+                            <a:cxn ang="0">
+                              <a:pos x="csX100" y="csY100"/>
+                            </a:cxn>
+                            <a:cxn ang="0">
+                              <a:pos x="csX101" y="csY101"/>
+                            </a:cxn>
+                            <a:cxn ang="0">
+                              <a:pos x="csX102" y="csY102"/>
+                            </a:cxn>
+                            <a:cxn ang="0">
+                              <a:pos x="csX103" y="csY103"/>
+                            </a:cxn>
+                          </a:cxnLst>
+                          <a:rect l="l" t="t" r="r" b="b"/>
+                          <a:pathLst>
+                            <a:path w="1158861" h="1098359">
+                              <a:moveTo>
+                                <a:pt x="621" y="412559"/>
+                              </a:moveTo>
+                              <a:cubicBezTo>
+                                <a:pt x="6966" y="349106"/>
+                                <a:pt x="-19972" y="306366"/>
+                                <a:pt x="41261" y="300799"/>
+                              </a:cubicBezTo>
+                              <a:cubicBezTo>
+                                <a:pt x="49860" y="300017"/>
+                                <a:pt x="58194" y="304186"/>
+                                <a:pt x="66661" y="305879"/>
+                              </a:cubicBezTo>
+                              <a:cubicBezTo>
+                                <a:pt x="70892" y="310110"/>
+                                <a:pt x="90657" y="325331"/>
+                                <a:pt x="86981" y="336359"/>
+                              </a:cubicBezTo>
+                              <a:cubicBezTo>
+                                <a:pt x="84709" y="343175"/>
+                                <a:pt x="76416" y="346144"/>
+                                <a:pt x="71741" y="351599"/>
+                              </a:cubicBezTo>
+                              <a:cubicBezTo>
+                                <a:pt x="48779" y="378388"/>
+                                <a:pt x="67628" y="369137"/>
+                                <a:pt x="36181" y="376999"/>
+                              </a:cubicBezTo>
+                              <a:cubicBezTo>
+                                <a:pt x="34488" y="382079"/>
+                                <a:pt x="30051" y="397490"/>
+                                <a:pt x="31101" y="392239"/>
+                              </a:cubicBezTo>
+                              <a:cubicBezTo>
+                                <a:pt x="33839" y="378547"/>
+                                <a:pt x="34575" y="363858"/>
+                                <a:pt x="41261" y="351599"/>
+                              </a:cubicBezTo>
+                              <a:cubicBezTo>
+                                <a:pt x="45315" y="344166"/>
+                                <a:pt x="54970" y="341648"/>
+                                <a:pt x="61581" y="336359"/>
+                              </a:cubicBezTo>
+                              <a:cubicBezTo>
+                                <a:pt x="80374" y="321325"/>
+                                <a:pt x="117461" y="290639"/>
+                                <a:pt x="117461" y="290639"/>
+                              </a:cubicBezTo>
+                              <a:cubicBezTo>
+                                <a:pt x="125928" y="292332"/>
+                                <a:pt x="135954" y="290538"/>
+                                <a:pt x="142861" y="295719"/>
+                              </a:cubicBezTo>
+                              <a:cubicBezTo>
+                                <a:pt x="161542" y="309730"/>
+                                <a:pt x="160002" y="337607"/>
+                                <a:pt x="163181" y="356679"/>
+                              </a:cubicBezTo>
+                              <a:cubicBezTo>
+                                <a:pt x="168288" y="387322"/>
+                                <a:pt x="167252" y="374999"/>
+                                <a:pt x="173341" y="402399"/>
+                              </a:cubicBezTo>
+                              <a:cubicBezTo>
+                                <a:pt x="175214" y="410828"/>
+                                <a:pt x="176728" y="419332"/>
+                                <a:pt x="178421" y="427799"/>
+                              </a:cubicBezTo>
+                              <a:cubicBezTo>
+                                <a:pt x="180114" y="456586"/>
+                                <a:pt x="176896" y="542229"/>
+                                <a:pt x="183501" y="514159"/>
+                              </a:cubicBezTo>
+                              <a:cubicBezTo>
+                                <a:pt x="196739" y="457898"/>
+                                <a:pt x="172893" y="393134"/>
+                                <a:pt x="198741" y="341439"/>
+                              </a:cubicBezTo>
+                              <a:cubicBezTo>
+                                <a:pt x="204197" y="330527"/>
+                                <a:pt x="220400" y="292063"/>
+                                <a:pt x="234301" y="280479"/>
+                              </a:cubicBezTo>
+                              <a:cubicBezTo>
+                                <a:pt x="238415" y="277051"/>
+                                <a:pt x="244461" y="277092"/>
+                                <a:pt x="249541" y="275399"/>
+                              </a:cubicBezTo>
+                              <a:cubicBezTo>
+                                <a:pt x="252928" y="282172"/>
+                                <a:pt x="255687" y="289297"/>
+                                <a:pt x="259701" y="295719"/>
+                              </a:cubicBezTo>
+                              <a:cubicBezTo>
+                                <a:pt x="264188" y="302899"/>
+                                <a:pt x="270020" y="309149"/>
+                                <a:pt x="274941" y="316039"/>
+                              </a:cubicBezTo>
+                              <a:cubicBezTo>
+                                <a:pt x="278490" y="321007"/>
+                                <a:pt x="281714" y="326199"/>
+                                <a:pt x="285101" y="331279"/>
+                              </a:cubicBezTo>
+                              <a:cubicBezTo>
+                                <a:pt x="288488" y="348212"/>
+                                <a:pt x="293354" y="364916"/>
+                                <a:pt x="295261" y="382079"/>
+                              </a:cubicBezTo>
+                              <a:cubicBezTo>
+                                <a:pt x="296954" y="397319"/>
+                                <a:pt x="299013" y="412523"/>
+                                <a:pt x="300341" y="427799"/>
+                              </a:cubicBezTo>
+                              <a:cubicBezTo>
+                                <a:pt x="317121" y="620768"/>
+                                <a:pt x="295547" y="400177"/>
+                                <a:pt x="310501" y="549719"/>
+                              </a:cubicBezTo>
+                              <a:cubicBezTo>
+                                <a:pt x="317274" y="544639"/>
+                                <a:pt x="330018" y="542908"/>
+                                <a:pt x="330821" y="534479"/>
+                              </a:cubicBezTo>
+                              <a:cubicBezTo>
+                                <a:pt x="334856" y="492110"/>
+                                <a:pt x="320934" y="444129"/>
+                                <a:pt x="310501" y="402399"/>
+                              </a:cubicBezTo>
+                              <a:cubicBezTo>
+                                <a:pt x="313040" y="338936"/>
+                                <a:pt x="289876" y="289449"/>
+                                <a:pt x="335901" y="249999"/>
+                              </a:cubicBezTo>
+                              <a:cubicBezTo>
+                                <a:pt x="339967" y="246514"/>
+                                <a:pt x="346061" y="246612"/>
+                                <a:pt x="351141" y="244919"/>
+                              </a:cubicBezTo>
+                              <a:cubicBezTo>
+                                <a:pt x="356221" y="248306"/>
+                                <a:pt x="362064" y="250762"/>
+                                <a:pt x="366381" y="255079"/>
+                              </a:cubicBezTo>
+                              <a:cubicBezTo>
+                                <a:pt x="381383" y="270081"/>
+                                <a:pt x="384626" y="281123"/>
+                                <a:pt x="391781" y="300799"/>
+                              </a:cubicBezTo>
+                              <a:cubicBezTo>
+                                <a:pt x="395441" y="310864"/>
+                                <a:pt x="398554" y="321119"/>
+                                <a:pt x="401941" y="331279"/>
+                              </a:cubicBezTo>
+                              <a:cubicBezTo>
+                                <a:pt x="403634" y="365146"/>
+                                <a:pt x="406343" y="398977"/>
+                                <a:pt x="407021" y="432879"/>
+                              </a:cubicBezTo>
+                              <a:cubicBezTo>
+                                <a:pt x="409730" y="568329"/>
+                                <a:pt x="402715" y="704127"/>
+                                <a:pt x="412101" y="839279"/>
+                              </a:cubicBezTo>
+                              <a:cubicBezTo>
+                                <a:pt x="413150" y="854388"/>
+                                <a:pt x="426686" y="812657"/>
+                                <a:pt x="432421" y="798639"/>
+                              </a:cubicBezTo>
+                              <a:cubicBezTo>
+                                <a:pt x="441952" y="775340"/>
+                                <a:pt x="450360" y="751561"/>
+                                <a:pt x="457821" y="727519"/>
+                              </a:cubicBezTo>
+                              <a:cubicBezTo>
+                                <a:pt x="465613" y="702413"/>
+                                <a:pt x="472006" y="676881"/>
+                                <a:pt x="478141" y="651319"/>
+                              </a:cubicBezTo>
+                              <a:cubicBezTo>
+                                <a:pt x="494265" y="584135"/>
+                                <a:pt x="478614" y="619893"/>
+                                <a:pt x="498461" y="580199"/>
+                              </a:cubicBezTo>
+                              <a:cubicBezTo>
+                                <a:pt x="503463" y="515178"/>
+                                <a:pt x="501986" y="512551"/>
+                                <a:pt x="513701" y="448119"/>
+                              </a:cubicBezTo>
+                              <a:cubicBezTo>
+                                <a:pt x="516494" y="432759"/>
+                                <a:pt x="521294" y="417798"/>
+                                <a:pt x="523861" y="402399"/>
+                              </a:cubicBezTo>
+                              <a:cubicBezTo>
+                                <a:pt x="534252" y="340056"/>
+                                <a:pt x="521209" y="375402"/>
+                                <a:pt x="539101" y="326199"/>
+                              </a:cubicBezTo>
+                              <a:cubicBezTo>
+                                <a:pt x="542217" y="317629"/>
+                                <a:pt x="556848" y="305857"/>
+                                <a:pt x="549261" y="300799"/>
+                              </a:cubicBezTo>
+                              <a:cubicBezTo>
+                                <a:pt x="537902" y="293226"/>
+                                <a:pt x="522168" y="304186"/>
+                                <a:pt x="508621" y="305879"/>
+                              </a:cubicBezTo>
+                              <a:cubicBezTo>
+                                <a:pt x="366774" y="429995"/>
+                                <a:pt x="555658" y="267076"/>
+                                <a:pt x="432421" y="366839"/>
+                              </a:cubicBezTo>
+                              <a:cubicBezTo>
+                                <a:pt x="392268" y="399344"/>
+                                <a:pt x="367102" y="427348"/>
+                                <a:pt x="325741" y="453199"/>
+                              </a:cubicBezTo>
+                              <a:cubicBezTo>
+                                <a:pt x="310957" y="462439"/>
+                                <a:pt x="295404" y="470395"/>
+                                <a:pt x="280021" y="478599"/>
+                              </a:cubicBezTo>
+                              <a:cubicBezTo>
+                                <a:pt x="269998" y="483945"/>
+                                <a:pt x="259471" y="488322"/>
+                                <a:pt x="249541" y="493839"/>
+                              </a:cubicBezTo>
+                              <a:cubicBezTo>
+                                <a:pt x="244204" y="496804"/>
+                                <a:pt x="228509" y="502068"/>
+                                <a:pt x="234301" y="503999"/>
+                              </a:cubicBezTo>
+                              <a:cubicBezTo>
+                                <a:pt x="244073" y="507256"/>
+                                <a:pt x="254503" y="499589"/>
+                                <a:pt x="264781" y="498919"/>
+                              </a:cubicBezTo>
+                              <a:cubicBezTo>
+                                <a:pt x="332455" y="494505"/>
+                                <a:pt x="400217" y="491470"/>
+                                <a:pt x="467981" y="488759"/>
+                              </a:cubicBezTo>
+                              <a:cubicBezTo>
+                                <a:pt x="527224" y="486389"/>
+                                <a:pt x="586514" y="485372"/>
+                                <a:pt x="645781" y="483679"/>
+                              </a:cubicBezTo>
+                              <a:cubicBezTo>
+                                <a:pt x="625461" y="480292"/>
+                                <a:pt x="602486" y="484118"/>
+                                <a:pt x="584821" y="473519"/>
+                              </a:cubicBezTo>
+                              <a:cubicBezTo>
+                                <a:pt x="576354" y="468439"/>
+                                <a:pt x="567215" y="464341"/>
+                                <a:pt x="559421" y="458279"/>
+                              </a:cubicBezTo>
+                              <a:cubicBezTo>
+                                <a:pt x="530186" y="435540"/>
+                                <a:pt x="549353" y="440552"/>
+                                <a:pt x="518781" y="422719"/>
+                              </a:cubicBezTo>
+                              <a:cubicBezTo>
+                                <a:pt x="505699" y="415088"/>
+                                <a:pt x="491688" y="409172"/>
+                                <a:pt x="478141" y="402399"/>
+                              </a:cubicBezTo>
+                              <a:lnTo>
+                                <a:pt x="417181" y="371919"/>
+                              </a:lnTo>
+                              <a:cubicBezTo>
+                                <a:pt x="407021" y="366839"/>
+                                <a:pt x="397721" y="359434"/>
+                                <a:pt x="386701" y="356679"/>
+                              </a:cubicBezTo>
+                              <a:cubicBezTo>
+                                <a:pt x="357534" y="349387"/>
+                                <a:pt x="372863" y="354192"/>
+                                <a:pt x="340981" y="341439"/>
+                              </a:cubicBezTo>
+                              <a:cubicBezTo>
+                                <a:pt x="330821" y="343132"/>
+                                <a:pt x="317284" y="338767"/>
+                                <a:pt x="310501" y="346519"/>
+                              </a:cubicBezTo>
+                              <a:cubicBezTo>
+                                <a:pt x="302616" y="355530"/>
+                                <a:pt x="304823" y="370120"/>
+                                <a:pt x="305421" y="382079"/>
+                              </a:cubicBezTo>
+                              <a:cubicBezTo>
+                                <a:pt x="306533" y="404324"/>
+                                <a:pt x="310480" y="426439"/>
+                                <a:pt x="315581" y="448119"/>
+                              </a:cubicBezTo>
+                              <a:cubicBezTo>
+                                <a:pt x="317315" y="455491"/>
+                                <a:pt x="320042" y="463452"/>
+                                <a:pt x="325741" y="468439"/>
+                              </a:cubicBezTo>
+                              <a:cubicBezTo>
+                                <a:pt x="339541" y="480514"/>
+                                <a:pt x="389354" y="494723"/>
+                                <a:pt x="401941" y="498919"/>
+                              </a:cubicBezTo>
+                              <a:cubicBezTo>
+                                <a:pt x="429034" y="495532"/>
+                                <a:pt x="456596" y="494810"/>
+                                <a:pt x="483221" y="488759"/>
+                              </a:cubicBezTo>
+                              <a:cubicBezTo>
+                                <a:pt x="529514" y="478238"/>
+                                <a:pt x="499732" y="476535"/>
+                                <a:pt x="528941" y="458279"/>
+                              </a:cubicBezTo>
+                              <a:cubicBezTo>
+                                <a:pt x="536674" y="453446"/>
+                                <a:pt x="545874" y="451506"/>
+                                <a:pt x="554341" y="448119"/>
+                              </a:cubicBezTo>
+                              <a:cubicBezTo>
+                                <a:pt x="566194" y="449812"/>
+                                <a:pt x="579191" y="447844"/>
+                                <a:pt x="589901" y="453199"/>
+                              </a:cubicBezTo>
+                              <a:cubicBezTo>
+                                <a:pt x="594690" y="455594"/>
+                                <a:pt x="591636" y="464258"/>
+                                <a:pt x="594981" y="468439"/>
+                              </a:cubicBezTo>
+                              <a:cubicBezTo>
+                                <a:pt x="598795" y="473207"/>
+                                <a:pt x="605141" y="475212"/>
+                                <a:pt x="610221" y="478599"/>
+                              </a:cubicBezTo>
+                              <a:cubicBezTo>
+                                <a:pt x="616994" y="475212"/>
+                                <a:pt x="625693" y="474257"/>
+                                <a:pt x="630541" y="468439"/>
+                              </a:cubicBezTo>
+                              <a:cubicBezTo>
+                                <a:pt x="635011" y="463075"/>
+                                <a:pt x="630036" y="452308"/>
+                                <a:pt x="635621" y="448119"/>
+                              </a:cubicBezTo>
+                              <a:cubicBezTo>
+                                <a:pt x="639905" y="444906"/>
+                                <a:pt x="645666" y="451900"/>
+                                <a:pt x="650861" y="453199"/>
+                              </a:cubicBezTo>
+                              <a:cubicBezTo>
+                                <a:pt x="659238" y="455293"/>
+                                <a:pt x="667794" y="456586"/>
+                                <a:pt x="676261" y="458279"/>
+                              </a:cubicBezTo>
+                              <a:cubicBezTo>
+                                <a:pt x="691501" y="454892"/>
+                                <a:pt x="707769" y="454579"/>
+                                <a:pt x="721981" y="448119"/>
+                              </a:cubicBezTo>
+                              <a:cubicBezTo>
+                                <a:pt x="727539" y="445593"/>
+                                <a:pt x="727824" y="437196"/>
+                                <a:pt x="732141" y="432879"/>
+                              </a:cubicBezTo>
+                              <a:cubicBezTo>
+                                <a:pt x="738128" y="426892"/>
+                                <a:pt x="744724" y="421078"/>
+                                <a:pt x="752461" y="417639"/>
+                              </a:cubicBezTo>
+                              <a:cubicBezTo>
+                                <a:pt x="760351" y="414132"/>
+                                <a:pt x="769484" y="414653"/>
+                                <a:pt x="777861" y="412559"/>
+                              </a:cubicBezTo>
+                              <a:cubicBezTo>
+                                <a:pt x="789821" y="409569"/>
+                                <a:pt x="801568" y="405786"/>
+                                <a:pt x="813421" y="402399"/>
+                              </a:cubicBezTo>
+                              <a:cubicBezTo>
+                                <a:pt x="798181" y="399012"/>
+                                <a:pt x="783303" y="392796"/>
+                                <a:pt x="767701" y="392239"/>
+                              </a:cubicBezTo>
+                              <a:cubicBezTo>
+                                <a:pt x="701966" y="389891"/>
+                                <a:pt x="692212" y="393113"/>
+                                <a:pt x="645781" y="402399"/>
+                              </a:cubicBezTo>
+                              <a:cubicBezTo>
+                                <a:pt x="630312" y="412712"/>
+                                <a:pt x="624753" y="413976"/>
+                                <a:pt x="615301" y="432879"/>
+                              </a:cubicBezTo>
+                              <a:cubicBezTo>
+                                <a:pt x="612179" y="439124"/>
+                                <a:pt x="611914" y="446426"/>
+                                <a:pt x="610221" y="453199"/>
+                              </a:cubicBezTo>
+                              <a:cubicBezTo>
+                                <a:pt x="611914" y="463359"/>
+                                <a:pt x="610002" y="474847"/>
+                                <a:pt x="615301" y="483679"/>
+                              </a:cubicBezTo>
+                              <a:cubicBezTo>
+                                <a:pt x="630371" y="508796"/>
+                                <a:pt x="643664" y="502348"/>
+                                <a:pt x="666101" y="509079"/>
+                              </a:cubicBezTo>
+                              <a:cubicBezTo>
+                                <a:pt x="674835" y="511699"/>
+                                <a:pt x="683034" y="515852"/>
+                                <a:pt x="691501" y="519239"/>
+                              </a:cubicBezTo>
+                              <a:cubicBezTo>
+                                <a:pt x="710128" y="517546"/>
+                                <a:pt x="729093" y="518078"/>
+                                <a:pt x="747381" y="514159"/>
+                              </a:cubicBezTo>
+                              <a:cubicBezTo>
+                                <a:pt x="753351" y="512880"/>
+                                <a:pt x="757160" y="506729"/>
+                                <a:pt x="762621" y="503999"/>
+                              </a:cubicBezTo>
+                              <a:cubicBezTo>
+                                <a:pt x="767410" y="501604"/>
+                                <a:pt x="772781" y="500612"/>
+                                <a:pt x="777861" y="498919"/>
+                              </a:cubicBezTo>
+                              <a:cubicBezTo>
+                                <a:pt x="803368" y="460658"/>
+                                <a:pt x="773419" y="509284"/>
+                                <a:pt x="793101" y="463359"/>
+                              </a:cubicBezTo>
+                              <a:cubicBezTo>
+                                <a:pt x="795506" y="457747"/>
+                                <a:pt x="800232" y="453420"/>
+                                <a:pt x="803261" y="448119"/>
+                              </a:cubicBezTo>
+                              <a:cubicBezTo>
+                                <a:pt x="807018" y="441544"/>
+                                <a:pt x="810609" y="434830"/>
+                                <a:pt x="813421" y="427799"/>
+                              </a:cubicBezTo>
+                              <a:cubicBezTo>
+                                <a:pt x="828809" y="389329"/>
+                                <a:pt x="812790" y="404513"/>
+                                <a:pt x="838821" y="387159"/>
+                              </a:cubicBezTo>
+                              <a:cubicBezTo>
+                                <a:pt x="843901" y="390546"/>
+                                <a:pt x="849744" y="393002"/>
+                                <a:pt x="854061" y="397319"/>
+                              </a:cubicBezTo>
+                              <a:cubicBezTo>
+                                <a:pt x="858378" y="401636"/>
+                                <a:pt x="858351" y="410882"/>
+                                <a:pt x="864221" y="412559"/>
+                              </a:cubicBezTo>
+                              <a:cubicBezTo>
+                                <a:pt x="872523" y="414931"/>
+                                <a:pt x="881154" y="409172"/>
+                                <a:pt x="889621" y="407479"/>
+                              </a:cubicBezTo>
+                              <a:cubicBezTo>
+                                <a:pt x="960985" y="359903"/>
+                                <a:pt x="907897" y="386738"/>
+                                <a:pt x="1067421" y="392239"/>
+                              </a:cubicBezTo>
+                              <a:cubicBezTo>
+                                <a:pt x="1087741" y="390546"/>
+                                <a:pt x="1109289" y="394319"/>
+                                <a:pt x="1128381" y="387159"/>
+                              </a:cubicBezTo>
+                              <a:cubicBezTo>
+                                <a:pt x="1138533" y="383352"/>
+                                <a:pt x="1146349" y="372343"/>
+                                <a:pt x="1148701" y="361759"/>
+                              </a:cubicBezTo>
+                              <a:cubicBezTo>
+                                <a:pt x="1156816" y="325243"/>
+                                <a:pt x="1155474" y="287252"/>
+                                <a:pt x="1158861" y="249999"/>
+                              </a:cubicBezTo>
+                              <a:cubicBezTo>
+                                <a:pt x="1140234" y="183959"/>
+                                <a:pt x="1125472" y="116705"/>
+                                <a:pt x="1102981" y="51879"/>
+                              </a:cubicBezTo>
+                              <a:cubicBezTo>
+                                <a:pt x="1096508" y="33222"/>
+                                <a:pt x="1090478" y="-7093"/>
+                                <a:pt x="1072501" y="1079"/>
+                              </a:cubicBezTo>
+                              <a:cubicBezTo>
+                                <a:pt x="1033018" y="19026"/>
+                                <a:pt x="1018314" y="68812"/>
+                                <a:pt x="991221" y="102679"/>
+                              </a:cubicBezTo>
+                              <a:cubicBezTo>
+                                <a:pt x="952274" y="302492"/>
+                                <a:pt x="903171" y="500591"/>
+                                <a:pt x="874381" y="702119"/>
+                              </a:cubicBezTo>
+                              <a:cubicBezTo>
+                                <a:pt x="859038" y="809521"/>
+                                <a:pt x="864697" y="918889"/>
+                                <a:pt x="859141" y="1027239"/>
+                              </a:cubicBezTo>
+                              <a:cubicBezTo>
+                                <a:pt x="857924" y="1050975"/>
+                                <a:pt x="855754" y="1074652"/>
+                                <a:pt x="854061" y="1098359"/>
+                              </a:cubicBezTo>
+                            </a:path>
+                          </a:pathLst>
+                        </a:custGeom>
+                      </wps:spPr>
+                      <wps:style>
+                        <a:lnRef idx="1">
+                          <a:schemeClr val="dk1"/>
+                        </a:lnRef>
+                        <a:fillRef idx="0">
+                          <a:schemeClr val="dk1"/>
+                        </a:fillRef>
+                        <a:effectRef idx="0">
+                          <a:schemeClr val="dk1"/>
+                        </a:effectRef>
+                        <a:fontRef idx="minor">
+                          <a:schemeClr val="tx1"/>
+                        </a:fontRef>
+                      </wps:style>
+                      <wps:bodyPr rot="0" spcFirstLastPara="0" vertOverflow="overflow" horzOverflow="overflow" vert="horz" wrap="square" lIns="91440" tIns="45720" rIns="91440" bIns="45720" numCol="1" spcCol="0" rtlCol="0" fromWordArt="0" anchor="ctr" anchorCtr="0" forceAA="0" compatLnSpc="1">
+                        <a:prstTxWarp prst="textNoShape">
+                          <a:avLst/>
+                        </a:prstTxWarp>
+                        <a:noAutofit/>
+                      </wps:bodyPr>
+                    </wps:wsp>
+                  </a:graphicData>
+                </a:graphic>
+              </wp:anchor>
+            </w:drawing>
+          </mc:Choice>
+          <mc:Fallback>
+            <w:pict>
+              <v:shape w14:anchorId="56B01FCC" id="Freeform: Shape 2" o:spid="_x0000_s1026" style="position:absolute;margin-left:308.85pt;margin-top:14.2pt;width:91.25pt;height:86.5pt;z-index:251659264;visibility:visible;mso-wrap-style:square;mso-wrap-distance-left:9pt;mso-wrap-distance-top:0;mso-wrap-distance-right:9pt;mso-wrap-distance-bottom:0;mso-position-horizontal:absolute;mso-position-horizontal-relative:text;mso-position-vertical:absolute;mso-position-vertical-relative:text;v-text-anchor:middle" coordsize="1158861,1098359" o:gfxdata="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" path="m621,412559c6966,349106,-19972,306366,41261,300799v8599,-782,16933,3387,25400,5080c70892,310110,90657,325331,86981,336359v-2272,6816,-10565,9785,-15240,15240c48779,378388,67628,369137,36181,376999v-1693,5080,-6130,20491,-5080,15240c33839,378547,34575,363858,41261,351599v4054,-7433,13709,-9951,20320,-15240c80374,321325,117461,290639,117461,290639v8467,1693,18493,-101,25400,5080c161542,309730,160002,337607,163181,356679v5107,30643,4071,18320,10160,45720c175214,410828,176728,419332,178421,427799v1693,28787,-1525,114430,5080,86360c196739,457898,172893,393134,198741,341439v5456,-10912,21659,-49376,35560,-60960c238415,277051,244461,277092,249541,275399v3387,6773,6146,13898,10160,20320c264188,302899,270020,309149,274941,316039v3549,4968,6773,10160,10160,15240c288488,348212,293354,364916,295261,382079v1693,15240,3752,30444,5080,45720c317121,620768,295547,400177,310501,549719v6773,-5080,19517,-6811,20320,-15240c334856,492110,320934,444129,310501,402399v2539,-63463,-20625,-112950,25400,-152400c339967,246514,346061,246612,351141,244919v5080,3387,10923,5843,15240,10160c381383,270081,384626,281123,391781,300799v3660,10065,6773,20320,10160,30480c403634,365146,406343,398977,407021,432879v2709,135450,-4306,271248,5080,406400c413150,854388,426686,812657,432421,798639v9531,-23299,17939,-47078,25400,-71120c465613,702413,472006,676881,478141,651319v16124,-67184,473,-31426,20320,-71120c503463,515178,501986,512551,513701,448119v2793,-15360,7593,-30321,10160,-45720c534252,340056,521209,375402,539101,326199v3116,-8570,17747,-20342,10160,-25400c537902,293226,522168,304186,508621,305879v-141847,124116,47037,-38803,-76200,60960c392268,399344,367102,427348,325741,453199v-14784,9240,-30337,17196,-45720,25400c269998,483945,259471,488322,249541,493839v-5337,2965,-21032,8229,-15240,10160c244073,507256,254503,499589,264781,498919v67674,-4414,135436,-7449,203200,-10160c527224,486389,586514,485372,645781,483679v-20320,-3387,-43295,439,-60960,-10160c576354,468439,567215,464341,559421,458279,530186,435540,549353,440552,518781,422719v-13082,-7631,-27093,-13547,-40640,-20320l417181,371919v-10160,-5080,-19460,-12485,-30480,-15240c357534,349387,372863,354192,340981,341439v-10160,1693,-23697,-2672,-30480,5080c302616,355530,304823,370120,305421,382079v1112,22245,5059,44360,10160,66040c317315,455491,320042,463452,325741,468439v13800,12075,63613,26284,76200,30480c429034,495532,456596,494810,483221,488759v46293,-10521,16511,-12224,45720,-30480c536674,453446,545874,451506,554341,448119v11853,1693,24850,-275,35560,5080c594690,455594,591636,464258,594981,468439v3814,4768,10160,6773,15240,10160c616994,475212,625693,474257,630541,468439v4470,-5364,-505,-16131,5080,-20320c639905,444906,645666,451900,650861,453199v8377,2094,16933,3387,25400,5080c691501,454892,707769,454579,721981,448119v5558,-2526,5843,-10923,10160,-15240c738128,426892,744724,421078,752461,417639v7890,-3507,17023,-2986,25400,-5080c789821,409569,801568,405786,813421,402399v-15240,-3387,-30118,-9603,-45720,-10160c701966,389891,692212,393113,645781,402399v-15469,10313,-21028,11577,-30480,30480c612179,439124,611914,446426,610221,453199v1693,10160,-219,21648,5080,30480c630371,508796,643664,502348,666101,509079v8734,2620,16933,6773,25400,10160c710128,517546,729093,518078,747381,514159v5970,-1279,9779,-7430,15240,-10160c767410,501604,772781,500612,777861,498919v25507,-38261,-4442,10365,15240,-35560c795506,457747,800232,453420,803261,448119v3757,-6575,7348,-13289,10160,-20320c828809,389329,812790,404513,838821,387159v5080,3387,10923,5843,15240,10160c858378,401636,858351,410882,864221,412559v8302,2372,16933,-3387,25400,-5080c960985,359903,907897,386738,1067421,392239v20320,-1693,41868,2080,60960,-5080c1138533,383352,1146349,372343,1148701,361759v8115,-36516,6773,-74507,10160,-111760c1140234,183959,1125472,116705,1102981,51879,1096508,33222,1090478,-7093,1072501,1079v-39483,17947,-54187,67733,-81280,101600c952274,302492,903171,500591,874381,702119v-15343,107402,-9684,216770,-15240,325120c857924,1050975,855754,1074652,854061,1098359e" filled="f" strokecolor="black [3200]" strokeweight="1pt">
+                <v:stroke joinstyle="miter"/>
+                <v:path arrowok="t" o:connecttype="custom" o:connectlocs="621,412559;41261,300799;66661,305879;86981,336359;71741,351599;36181,376999;31101,392239;41261,351599;61581,336359;117461,290639;142861,295719;163181,356679;173341,402399;178421,427799;183501,514159;198741,341439;234301,280479;249541,275399;259701,295719;274941,316039;285101,331279;295261,382079;300341,427799;310501,549719;330821,534479;310501,402399;335901,249999;351141,244919;366381,255079;391781,300799;401941,331279;407021,432879;412101,839279;432421,798639;457821,727519;478141,651319;498461,580199;513701,448119;523861,402399;539101,326199;549261,300799;508621,305879;432421,366839;325741,453199;280021,478599;249541,493839;234301,503999;264781,498919;467981,488759;645781,483679;584821,473519;559421,458279;518781,422719;478141,402399;417181,371919;386701,356679;340981,341439;310501,346519;305421,382079;315581,448119;325741,468439;401941,498919;483221,488759;528941,458279;554341,448119;589901,453199;594981,468439;610221,478599;630541,468439;635621,448119;650861,453199;676261,458279;721981,448119;732141,432879;752461,417639;777861,412559;813421,402399;767701,392239;645781,402399;615301,432879;610221,453199;615301,483679;666101,509079;691501,519239;747381,514159;762621,503999;777861,498919;793101,463359;803261,448119;813421,427799;838821,387159;854061,397319;864221,412559;889621,407479;1067421,392239;1128381,387159;1148701,361759;1158861,249999;1102981,51879;1072501,1079;991221,102679;874381,702119;859141,1027239;854061,1098359" o:connectangles="0,0,0,0,0,0,0,0,0,0,0,0,0,0,0,0,0,0,0,0,0,0,0,0,0,0,0,0,0,0,0,0,0,0,0,0,0,0,0,0,0,0,0,0,0,0,0,0,0,0,0,0,0,0,0,0,0,0,0,0,0,0,0,0,0,0,0,0,0,0,0,0,0,0,0,0,0,0,0,0,0,0,0,0,0,0,0,0,0,0,0,0,0,0,0,0,0,0,0,0,0,0,0,0"/>
+              </v:shape>
+            </w:pict>
+          </mc:Fallback>
+        </mc:AlternateContent>
+      </w:r>
+      <w:r>
+        <w:t>V Bratislave, dňa 11. 10. 2026</w:t>
       </w:r>
     </w:p>
     <w:p>
@@ -1392,19 +2447,13 @@
         <w:tabs>
           <w:tab w:val="left" w:pos="6000"/>
         </w:tabs>
-        <w:spacing w:after="0"/>
       </w:pPr>
       <w:r>
-        <w:rPr/>
-        <w:t xml:space="preserve">Adam Molnar</w:t>
-      </w:r>
-      <w:r>
-        <w:rPr/>
+        <w:t>Adam Molnar</w:t>
+      </w:r>
+      <w:r>
         <w:tab/>
-      </w:r>
-      <w:r>
-        <w:rPr/>
-        <w:t xml:space="preserve">………………………………</w:t>
+        <w:t>………………………………</w:t>
       </w:r>
     </w:p>
     <w:p>
@@ -1422,15 +2471,7 @@
           <w:szCs w:val="18"/>
         </w:rPr>
         <w:tab/>
-      </w:r>
-      <w:r>
-        <w:rPr>
-          <w:i/>
-          <w:iCs/>
-          <w:sz w:val="18"/>
-          <w:szCs w:val="18"/>
-        </w:rPr>
-        <w:t xml:space="preserve">podpis</w:t>
+        <w:t>podpis</w:t>
       </w:r>
     </w:p>
     <w:p>
@@ -1487,8 +2528,7 @@
         <w:spacing w:after="60"/>
       </w:pPr>
       <w:r>
-        <w:rPr/>
-        <w:t xml:space="preserve">Príloha A.1   Zápisník meraných vodorovných smerov</w:t>
+        <w:t>Príloha A.1   Zápisník meraných vodorovných smerov</w:t>
       </w:r>
     </w:p>
     <w:p>
@@ -1515,7 +2555,8 @@
           <w:sz w:val="28"/>
           <w:szCs w:val="28"/>
         </w:rPr>
-        <w:t xml:space="preserve">Zápisník meraných vodorovných smerov</w:t>
+        <w:lastRenderedPageBreak/>
+        <w:t>Zápisník meraných vodorovných smerov</w:t>
       </w:r>
     </w:p>
     <w:p>
@@ -1528,7 +2569,7 @@
           <w:b/>
           <w:bCs/>
         </w:rPr>
-        <w:t xml:space="preserve">Prístroj: Nivel System DT-2</w:t>
+        <w:t>Prístroj: Nivel System DT-2</w:t>
       </w:r>
     </w:p>
     <w:tbl>
@@ -1548,6 +2589,7 @@
           <w:left w:w="28" w:type="dxa"/>
           <w:right w:w="28" w:type="dxa"/>
         </w:tblCellMar>
+        <w:tblLook w:val="04A0" w:firstRow="1" w:lastRow="0" w:firstColumn="1" w:lastColumn="0" w:noHBand="0" w:noVBand="1"/>
       </w:tblPr>
       <w:tblGrid>
         <w:gridCol w:w="1000"/>
@@ -1576,6 +2618,7 @@
         <w:trPr>
           <w:cantSplit/>
           <w:tblHeader/>
+          <w:jc w:val="center"/>
         </w:trPr>
         <w:tc>
           <w:tcPr>
@@ -1595,7 +2638,7 @@
                 <w:sz w:val="18"/>
                 <w:szCs w:val="18"/>
               </w:rPr>
-              <w:t xml:space="preserve">Stanovisko</w:t>
+              <w:t>Stanovisko</w:t>
             </w:r>
           </w:p>
         </w:tc>
@@ -1617,7 +2660,7 @@
                 <w:sz w:val="18"/>
                 <w:szCs w:val="18"/>
               </w:rPr>
-              <w:t xml:space="preserve">Bod</w:t>
+              <w:t>Bod</w:t>
             </w:r>
           </w:p>
         </w:tc>
@@ -1639,7 +2682,7 @@
                 <w:sz w:val="18"/>
                 <w:szCs w:val="18"/>
               </w:rPr>
-              <w:t xml:space="preserve">Pol.</w:t>
+              <w:t>Pol.</w:t>
             </w:r>
           </w:p>
         </w:tc>
@@ -1661,7 +2704,7 @@
                 <w:sz w:val="18"/>
                 <w:szCs w:val="18"/>
               </w:rPr>
-              <w:t xml:space="preserve">1. skupina</w:t>
+              <w:t>1. skupina</w:t>
             </w:r>
           </w:p>
         </w:tc>
@@ -1684,7 +2727,7 @@
                 <w:sz w:val="18"/>
                 <w:szCs w:val="18"/>
               </w:rPr>
-              <w:t xml:space="preserve">priemer / redukcia</w:t>
+              <w:t>priemer / redukcia</w:t>
             </w:r>
           </w:p>
         </w:tc>
@@ -1706,7 +2749,7 @@
                 <w:sz w:val="18"/>
                 <w:szCs w:val="18"/>
               </w:rPr>
-              <w:t xml:space="preserve">2. skupina</w:t>
+              <w:t>2. skupina</w:t>
             </w:r>
           </w:p>
         </w:tc>
@@ -1729,7 +2772,7 @@
                 <w:sz w:val="18"/>
                 <w:szCs w:val="18"/>
               </w:rPr>
-              <w:t xml:space="preserve">priemer / redukcia</w:t>
+              <w:t>priemer / redukcia</w:t>
             </w:r>
           </w:p>
         </w:tc>
@@ -1751,7 +2794,7 @@
                 <w:sz w:val="18"/>
                 <w:szCs w:val="18"/>
               </w:rPr>
-              <w:t xml:space="preserve">3. skupina</w:t>
+              <w:t>3. skupina</w:t>
             </w:r>
           </w:p>
         </w:tc>
@@ -1774,7 +2817,7 @@
                 <w:sz w:val="18"/>
                 <w:szCs w:val="18"/>
               </w:rPr>
-              <w:t xml:space="preserve">priemer / redukcia</w:t>
+              <w:t>priemer / redukcia</w:t>
             </w:r>
           </w:p>
         </w:tc>
@@ -1797,7 +2840,7 @@
                 <w:sz w:val="18"/>
                 <w:szCs w:val="18"/>
               </w:rPr>
-              <w:t xml:space="preserve">výsledný smer</w:t>
+              <w:t>výsledný smer</w:t>
             </w:r>
           </w:p>
         </w:tc>
@@ -1806,6 +2849,7 @@
         <w:trPr>
           <w:cantSplit/>
           <w:tblHeader/>
+          <w:jc w:val="center"/>
         </w:trPr>
         <w:tc>
           <w:tcPr>
@@ -1863,7 +2907,7 @@
                 <w:sz w:val="18"/>
                 <w:szCs w:val="18"/>
               </w:rPr>
-              <w:t xml:space="preserve">g</w:t>
+              <w:t>g</w:t>
             </w:r>
           </w:p>
         </w:tc>
@@ -1884,7 +2928,7 @@
                 <w:sz w:val="18"/>
                 <w:szCs w:val="18"/>
               </w:rPr>
-              <w:t xml:space="preserve">c</w:t>
+              <w:t>c</w:t>
             </w:r>
           </w:p>
         </w:tc>
@@ -1905,7 +2949,7 @@
                 <w:sz w:val="18"/>
                 <w:szCs w:val="18"/>
               </w:rPr>
-              <w:t xml:space="preserve">cc</w:t>
+              <w:t>cc</w:t>
             </w:r>
           </w:p>
         </w:tc>
@@ -1927,7 +2971,7 @@
                 <w:sz w:val="18"/>
                 <w:szCs w:val="18"/>
               </w:rPr>
-              <w:t xml:space="preserve">c</w:t>
+              <w:t>c</w:t>
             </w:r>
           </w:p>
         </w:tc>
@@ -1949,7 +2993,7 @@
                 <w:sz w:val="18"/>
                 <w:szCs w:val="18"/>
               </w:rPr>
-              <w:t xml:space="preserve">cc</w:t>
+              <w:t>cc</w:t>
             </w:r>
           </w:p>
         </w:tc>
@@ -1970,7 +3014,7 @@
                 <w:sz w:val="18"/>
                 <w:szCs w:val="18"/>
               </w:rPr>
-              <w:t xml:space="preserve">g</w:t>
+              <w:t>g</w:t>
             </w:r>
           </w:p>
         </w:tc>
@@ -1991,7 +3035,7 @@
                 <w:sz w:val="18"/>
                 <w:szCs w:val="18"/>
               </w:rPr>
-              <w:t xml:space="preserve">c</w:t>
+              <w:t>c</w:t>
             </w:r>
           </w:p>
         </w:tc>
@@ -2012,7 +3056,7 @@
                 <w:sz w:val="18"/>
                 <w:szCs w:val="18"/>
               </w:rPr>
-              <w:t xml:space="preserve">cc</w:t>
+              <w:t>cc</w:t>
             </w:r>
           </w:p>
         </w:tc>
@@ -2034,7 +3078,7 @@
                 <w:sz w:val="18"/>
                 <w:szCs w:val="18"/>
               </w:rPr>
-              <w:t xml:space="preserve">c</w:t>
+              <w:t>c</w:t>
             </w:r>
           </w:p>
         </w:tc>
@@ -2056,7 +3100,7 @@
                 <w:sz w:val="18"/>
                 <w:szCs w:val="18"/>
               </w:rPr>
-              <w:t xml:space="preserve">cc</w:t>
+              <w:t>cc</w:t>
             </w:r>
           </w:p>
         </w:tc>
@@ -2077,7 +3121,7 @@
                 <w:sz w:val="18"/>
                 <w:szCs w:val="18"/>
               </w:rPr>
-              <w:t xml:space="preserve">g</w:t>
+              <w:t>g</w:t>
             </w:r>
           </w:p>
         </w:tc>
@@ -2098,7 +3142,7 @@
                 <w:sz w:val="18"/>
                 <w:szCs w:val="18"/>
               </w:rPr>
-              <w:t xml:space="preserve">c</w:t>
+              <w:t>c</w:t>
             </w:r>
           </w:p>
         </w:tc>
@@ -2119,7 +3163,7 @@
                 <w:sz w:val="18"/>
                 <w:szCs w:val="18"/>
               </w:rPr>
-              <w:t xml:space="preserve">cc</w:t>
+              <w:t>cc</w:t>
             </w:r>
           </w:p>
         </w:tc>
@@ -2141,7 +3185,7 @@
                 <w:sz w:val="18"/>
                 <w:szCs w:val="18"/>
               </w:rPr>
-              <w:t xml:space="preserve">c</w:t>
+              <w:t>c</w:t>
             </w:r>
           </w:p>
         </w:tc>
@@ -2163,7 +3207,7 @@
                 <w:sz w:val="18"/>
                 <w:szCs w:val="18"/>
               </w:rPr>
-              <w:t xml:space="preserve">cc</w:t>
+              <w:t>cc</w:t>
             </w:r>
           </w:p>
         </w:tc>
@@ -2185,7 +3229,7 @@
                 <w:sz w:val="18"/>
                 <w:szCs w:val="18"/>
               </w:rPr>
-              <w:t xml:space="preserve">g</w:t>
+              <w:t>g</w:t>
             </w:r>
           </w:p>
         </w:tc>
@@ -2207,7 +3251,7 @@
                 <w:sz w:val="18"/>
                 <w:szCs w:val="18"/>
               </w:rPr>
-              <w:t xml:space="preserve">c</w:t>
+              <w:t>c</w:t>
             </w:r>
           </w:p>
         </w:tc>
@@ -2229,7 +3273,7 @@
                 <w:sz w:val="18"/>
                 <w:szCs w:val="18"/>
               </w:rPr>
-              <w:t xml:space="preserve">cc</w:t>
+              <w:t>cc</w:t>
             </w:r>
           </w:p>
         </w:tc>
@@ -2237,6 +3281,7 @@
       <w:tr>
         <w:trPr>
           <w:cantSplit/>
+          <w:jc w:val="center"/>
         </w:trPr>
         <w:tc>
           <w:tcPr>
@@ -2254,7 +3299,7 @@
                 <w:sz w:val="18"/>
                 <w:szCs w:val="18"/>
               </w:rPr>
-              <w:t xml:space="preserve">S</w:t>
+              <w:t>S</w:t>
             </w:r>
           </w:p>
         </w:tc>
@@ -2274,7 +3319,7 @@
                 <w:sz w:val="18"/>
                 <w:szCs w:val="18"/>
               </w:rPr>
-              <w:t xml:space="preserve">1</w:t>
+              <w:t>1</w:t>
             </w:r>
           </w:p>
         </w:tc>
@@ -2293,7 +3338,7 @@
                 <w:sz w:val="18"/>
                 <w:szCs w:val="18"/>
               </w:rPr>
-              <w:t xml:space="preserve">I.</w:t>
+              <w:t>I.</w:t>
             </w:r>
           </w:p>
         </w:tc>
@@ -2312,7 +3357,7 @@
                 <w:sz w:val="18"/>
                 <w:szCs w:val="18"/>
               </w:rPr>
-              <w:t xml:space="preserve">0</w:t>
+              <w:t>0</w:t>
             </w:r>
           </w:p>
         </w:tc>
@@ -2331,7 +3376,7 @@
                 <w:sz w:val="18"/>
                 <w:szCs w:val="18"/>
               </w:rPr>
-              <w:t xml:space="preserve">06</w:t>
+              <w:t>06</w:t>
             </w:r>
           </w:p>
         </w:tc>
@@ -2350,7 +3395,7 @@
                 <w:sz w:val="18"/>
                 <w:szCs w:val="18"/>
               </w:rPr>
-              <w:t xml:space="preserve">84</w:t>
+              <w:t>84</w:t>
             </w:r>
           </w:p>
         </w:tc>
@@ -2370,7 +3415,7 @@
                 <w:sz w:val="18"/>
                 <w:szCs w:val="18"/>
               </w:rPr>
-              <w:t xml:space="preserve">06</w:t>
+              <w:t>06</w:t>
             </w:r>
           </w:p>
         </w:tc>
@@ -2390,7 +3435,7 @@
                 <w:sz w:val="18"/>
                 <w:szCs w:val="18"/>
               </w:rPr>
-              <w:t xml:space="preserve">56</w:t>
+              <w:t>56</w:t>
             </w:r>
           </w:p>
         </w:tc>
@@ -2409,7 +3454,7 @@
                 <w:sz w:val="18"/>
                 <w:szCs w:val="18"/>
               </w:rPr>
-              <w:t xml:space="preserve">70</w:t>
+              <w:t>70</w:t>
             </w:r>
           </w:p>
         </w:tc>
@@ -2428,7 +3473,7 @@
                 <w:sz w:val="18"/>
                 <w:szCs w:val="18"/>
               </w:rPr>
-              <w:t xml:space="preserve">01</w:t>
+              <w:t>01</w:t>
             </w:r>
           </w:p>
         </w:tc>
@@ -2447,7 +3492,7 @@
                 <w:sz w:val="18"/>
                 <w:szCs w:val="18"/>
               </w:rPr>
-              <w:t xml:space="preserve">40</w:t>
+              <w:t>40</w:t>
             </w:r>
           </w:p>
         </w:tc>
@@ -2467,7 +3512,7 @@
                 <w:sz w:val="18"/>
                 <w:szCs w:val="18"/>
               </w:rPr>
-              <w:t xml:space="preserve">01</w:t>
+              <w:t>01</w:t>
             </w:r>
           </w:p>
         </w:tc>
@@ -2487,7 +3532,7 @@
                 <w:sz w:val="18"/>
                 <w:szCs w:val="18"/>
               </w:rPr>
-              <w:t xml:space="preserve">88</w:t>
+              <w:t>88</w:t>
             </w:r>
           </w:p>
         </w:tc>
@@ -2506,7 +3551,7 @@
                 <w:sz w:val="18"/>
                 <w:szCs w:val="18"/>
               </w:rPr>
-              <w:t xml:space="preserve">140</w:t>
+              <w:t>140</w:t>
             </w:r>
           </w:p>
         </w:tc>
@@ -2525,7 +3570,7 @@
                 <w:sz w:val="18"/>
                 <w:szCs w:val="18"/>
               </w:rPr>
-              <w:t xml:space="preserve">05</w:t>
+              <w:t>05</w:t>
             </w:r>
           </w:p>
         </w:tc>
@@ -2544,7 +3589,7 @@
                 <w:sz w:val="18"/>
                 <w:szCs w:val="18"/>
               </w:rPr>
-              <w:t xml:space="preserve">08</w:t>
+              <w:t>08</w:t>
             </w:r>
           </w:p>
         </w:tc>
@@ -2564,7 +3609,7 @@
                 <w:sz w:val="18"/>
                 <w:szCs w:val="18"/>
               </w:rPr>
-              <w:t xml:space="preserve">04</w:t>
+              <w:t>04</w:t>
             </w:r>
           </w:p>
         </w:tc>
@@ -2584,7 +3629,7 @@
                 <w:sz w:val="18"/>
                 <w:szCs w:val="18"/>
               </w:rPr>
-              <w:t xml:space="preserve">69</w:t>
+              <w:t>69</w:t>
             </w:r>
           </w:p>
         </w:tc>
@@ -2628,6 +3673,7 @@
       <w:tr>
         <w:trPr>
           <w:cantSplit/>
+          <w:jc w:val="center"/>
         </w:trPr>
         <w:tc>
           <w:tcPr>
@@ -2670,7 +3716,7 @@
                 <w:sz w:val="18"/>
                 <w:szCs w:val="18"/>
               </w:rPr>
-              <w:t xml:space="preserve">II.</w:t>
+              <w:t>II.</w:t>
             </w:r>
           </w:p>
         </w:tc>
@@ -2689,7 +3735,7 @@
                 <w:sz w:val="18"/>
                 <w:szCs w:val="18"/>
               </w:rPr>
-              <w:t xml:space="preserve">200</w:t>
+              <w:t>200</w:t>
             </w:r>
           </w:p>
         </w:tc>
@@ -2708,7 +3754,7 @@
                 <w:sz w:val="18"/>
                 <w:szCs w:val="18"/>
               </w:rPr>
-              <w:t xml:space="preserve">06</w:t>
+              <w:t>06</w:t>
             </w:r>
           </w:p>
         </w:tc>
@@ -2727,7 +3773,7 @@
                 <w:sz w:val="18"/>
                 <w:szCs w:val="18"/>
               </w:rPr>
-              <w:t xml:space="preserve">28</w:t>
+              <w:t>28</w:t>
             </w:r>
           </w:p>
         </w:tc>
@@ -2747,7 +3793,7 @@
                 <w:sz w:val="18"/>
                 <w:szCs w:val="18"/>
               </w:rPr>
-              <w:t xml:space="preserve">00</w:t>
+              <w:t>00</w:t>
             </w:r>
           </w:p>
         </w:tc>
@@ -2767,7 +3813,7 @@
                 <w:sz w:val="18"/>
                 <w:szCs w:val="18"/>
               </w:rPr>
-              <w:t xml:space="preserve">00</w:t>
+              <w:t>00</w:t>
             </w:r>
           </w:p>
         </w:tc>
@@ -2786,7 +3832,7 @@
                 <w:sz w:val="18"/>
                 <w:szCs w:val="18"/>
               </w:rPr>
-              <w:t xml:space="preserve">270</w:t>
+              <w:t>270</w:t>
             </w:r>
           </w:p>
         </w:tc>
@@ -2805,7 +3851,7 @@
                 <w:sz w:val="18"/>
                 <w:szCs w:val="18"/>
               </w:rPr>
-              <w:t xml:space="preserve">02</w:t>
+              <w:t>02</w:t>
             </w:r>
           </w:p>
         </w:tc>
@@ -2824,7 +3870,7 @@
                 <w:sz w:val="18"/>
                 <w:szCs w:val="18"/>
               </w:rPr>
-              <w:t xml:space="preserve">36</w:t>
+              <w:t>36</w:t>
             </w:r>
           </w:p>
         </w:tc>
@@ -2844,7 +3890,7 @@
                 <w:sz w:val="18"/>
                 <w:szCs w:val="18"/>
               </w:rPr>
-              <w:t xml:space="preserve">00</w:t>
+              <w:t>00</w:t>
             </w:r>
           </w:p>
         </w:tc>
@@ -2864,7 +3910,7 @@
                 <w:sz w:val="18"/>
                 <w:szCs w:val="18"/>
               </w:rPr>
-              <w:t xml:space="preserve">00</w:t>
+              <w:t>00</w:t>
             </w:r>
           </w:p>
         </w:tc>
@@ -2883,7 +3929,7 @@
                 <w:sz w:val="18"/>
                 <w:szCs w:val="18"/>
               </w:rPr>
-              <w:t xml:space="preserve">340</w:t>
+              <w:t>340</w:t>
             </w:r>
           </w:p>
         </w:tc>
@@ -2902,7 +3948,7 @@
                 <w:sz w:val="18"/>
                 <w:szCs w:val="18"/>
               </w:rPr>
-              <w:t xml:space="preserve">04</w:t>
+              <w:t>04</w:t>
             </w:r>
           </w:p>
         </w:tc>
@@ -2921,7 +3967,7 @@
                 <w:sz w:val="18"/>
                 <w:szCs w:val="18"/>
               </w:rPr>
-              <w:t xml:space="preserve">29</w:t>
+              <w:t>29</w:t>
             </w:r>
           </w:p>
         </w:tc>
@@ -2941,7 +3987,7 @@
                 <w:sz w:val="18"/>
                 <w:szCs w:val="18"/>
               </w:rPr>
-              <w:t xml:space="preserve">00</w:t>
+              <w:t>00</w:t>
             </w:r>
           </w:p>
         </w:tc>
@@ -2961,7 +4007,7 @@
                 <w:sz w:val="18"/>
                 <w:szCs w:val="18"/>
               </w:rPr>
-              <w:t xml:space="preserve">00</w:t>
+              <w:t>00</w:t>
             </w:r>
           </w:p>
         </w:tc>
@@ -2983,7 +4029,7 @@
                 <w:sz w:val="18"/>
                 <w:szCs w:val="18"/>
               </w:rPr>
-              <w:t xml:space="preserve">0</w:t>
+              <w:t>0</w:t>
             </w:r>
           </w:p>
         </w:tc>
@@ -3005,7 +4051,7 @@
                 <w:sz w:val="18"/>
                 <w:szCs w:val="18"/>
               </w:rPr>
-              <w:t xml:space="preserve">00</w:t>
+              <w:t>00</w:t>
             </w:r>
           </w:p>
         </w:tc>
@@ -3027,7 +4073,7 @@
                 <w:sz w:val="18"/>
                 <w:szCs w:val="18"/>
               </w:rPr>
-              <w:t xml:space="preserve">00</w:t>
+              <w:t>00</w:t>
             </w:r>
           </w:p>
         </w:tc>
@@ -3035,6 +4081,7 @@
       <w:tr>
         <w:trPr>
           <w:cantSplit/>
+          <w:jc w:val="center"/>
         </w:trPr>
         <w:tc>
           <w:tcPr>
@@ -3065,7 +4112,7 @@
                 <w:sz w:val="18"/>
                 <w:szCs w:val="18"/>
               </w:rPr>
-              <w:t xml:space="preserve">2</w:t>
+              <w:t>2</w:t>
             </w:r>
           </w:p>
         </w:tc>
@@ -3084,7 +4131,7 @@
                 <w:sz w:val="18"/>
                 <w:szCs w:val="18"/>
               </w:rPr>
-              <w:t xml:space="preserve">I.</w:t>
+              <w:t>I.</w:t>
             </w:r>
           </w:p>
         </w:tc>
@@ -3103,7 +4150,7 @@
                 <w:sz w:val="18"/>
                 <w:szCs w:val="18"/>
               </w:rPr>
-              <w:t xml:space="preserve">11</w:t>
+              <w:t>11</w:t>
             </w:r>
           </w:p>
         </w:tc>
@@ -3122,7 +4169,7 @@
                 <w:sz w:val="18"/>
                 <w:szCs w:val="18"/>
               </w:rPr>
-              <w:t xml:space="preserve">55</w:t>
+              <w:t>55</w:t>
             </w:r>
           </w:p>
         </w:tc>
@@ -3141,7 +4188,7 @@
                 <w:sz w:val="18"/>
                 <w:szCs w:val="18"/>
               </w:rPr>
-              <w:t xml:space="preserve">18</w:t>
+              <w:t>18</w:t>
             </w:r>
           </w:p>
         </w:tc>
@@ -3161,7 +4208,7 @@
                 <w:sz w:val="18"/>
                 <w:szCs w:val="18"/>
               </w:rPr>
-              <w:t xml:space="preserve">55</w:t>
+              <w:t>55</w:t>
             </w:r>
           </w:p>
         </w:tc>
@@ -3181,7 +4228,7 @@
                 <w:sz w:val="18"/>
                 <w:szCs w:val="18"/>
               </w:rPr>
-              <w:t xml:space="preserve">30</w:t>
+              <w:t>30</w:t>
             </w:r>
           </w:p>
         </w:tc>
@@ -3200,7 +4247,7 @@
                 <w:sz w:val="18"/>
                 <w:szCs w:val="18"/>
               </w:rPr>
-              <w:t xml:space="preserve">81</w:t>
+              <w:t>81</w:t>
             </w:r>
           </w:p>
         </w:tc>
@@ -3219,7 +4266,7 @@
                 <w:sz w:val="18"/>
                 <w:szCs w:val="18"/>
               </w:rPr>
-              <w:t xml:space="preserve">51</w:t>
+              <w:t>51</w:t>
             </w:r>
           </w:p>
         </w:tc>
@@ -3238,7 +4285,7 @@
                 <w:sz w:val="18"/>
                 <w:szCs w:val="18"/>
               </w:rPr>
-              <w:t xml:space="preserve">04</w:t>
+              <w:t>04</w:t>
             </w:r>
           </w:p>
         </w:tc>
@@ -3258,7 +4305,7 @@
                 <w:sz w:val="18"/>
                 <w:szCs w:val="18"/>
               </w:rPr>
-              <w:t xml:space="preserve">50</w:t>
+              <w:t>50</w:t>
             </w:r>
           </w:p>
         </w:tc>
@@ -3278,7 +4325,7 @@
                 <w:sz w:val="18"/>
                 <w:szCs w:val="18"/>
               </w:rPr>
-              <w:t xml:space="preserve">75</w:t>
+              <w:t>75</w:t>
             </w:r>
           </w:p>
         </w:tc>
@@ -3297,7 +4344,7 @@
                 <w:sz w:val="18"/>
                 <w:szCs w:val="18"/>
               </w:rPr>
-              <w:t xml:space="preserve">151</w:t>
+              <w:t>151</w:t>
             </w:r>
           </w:p>
         </w:tc>
@@ -3316,7 +4363,7 @@
                 <w:sz w:val="18"/>
                 <w:szCs w:val="18"/>
               </w:rPr>
-              <w:t xml:space="preserve">53</w:t>
+              <w:t>53</w:t>
             </w:r>
           </w:p>
         </w:tc>
@@ -3335,7 +4382,7 @@
                 <w:sz w:val="18"/>
                 <w:szCs w:val="18"/>
               </w:rPr>
-              <w:t xml:space="preserve">66</w:t>
+              <w:t>66</w:t>
             </w:r>
           </w:p>
         </w:tc>
@@ -3355,7 +4402,7 @@
                 <w:sz w:val="18"/>
                 <w:szCs w:val="18"/>
               </w:rPr>
-              <w:t xml:space="preserve">53</w:t>
+              <w:t>53</w:t>
             </w:r>
           </w:p>
         </w:tc>
@@ -3375,7 +4422,7 @@
                 <w:sz w:val="18"/>
                 <w:szCs w:val="18"/>
               </w:rPr>
-              <w:t xml:space="preserve">60</w:t>
+              <w:t>60</w:t>
             </w:r>
           </w:p>
         </w:tc>
@@ -3419,6 +4466,7 @@
       <w:tr>
         <w:trPr>
           <w:cantSplit/>
+          <w:jc w:val="center"/>
         </w:trPr>
         <w:tc>
           <w:tcPr>
@@ -3461,7 +4509,7 @@
                 <w:sz w:val="18"/>
                 <w:szCs w:val="18"/>
               </w:rPr>
-              <w:t xml:space="preserve">II.</w:t>
+              <w:t>II.</w:t>
             </w:r>
           </w:p>
         </w:tc>
@@ -3480,7 +4528,7 @@
                 <w:sz w:val="18"/>
                 <w:szCs w:val="18"/>
               </w:rPr>
-              <w:t xml:space="preserve">211</w:t>
+              <w:t>211</w:t>
             </w:r>
           </w:p>
         </w:tc>
@@ -3499,7 +4547,7 @@
                 <w:sz w:val="18"/>
                 <w:szCs w:val="18"/>
               </w:rPr>
-              <w:t xml:space="preserve">55</w:t>
+              <w:t>55</w:t>
             </w:r>
           </w:p>
         </w:tc>
@@ -3518,7 +4566,7 @@
                 <w:sz w:val="18"/>
                 <w:szCs w:val="18"/>
               </w:rPr>
-              <w:t xml:space="preserve">42</w:t>
+              <w:t>42</w:t>
             </w:r>
           </w:p>
         </w:tc>
@@ -3538,7 +4586,7 @@
                 <w:sz w:val="18"/>
                 <w:szCs w:val="18"/>
               </w:rPr>
-              <w:t xml:space="preserve">48</w:t>
+              <w:t>48</w:t>
             </w:r>
           </w:p>
         </w:tc>
@@ -3558,7 +4606,7 @@
                 <w:sz w:val="18"/>
                 <w:szCs w:val="18"/>
               </w:rPr>
-              <w:t xml:space="preserve">74</w:t>
+              <w:t>74</w:t>
             </w:r>
           </w:p>
         </w:tc>
@@ -3577,7 +4625,7 @@
                 <w:sz w:val="18"/>
                 <w:szCs w:val="18"/>
               </w:rPr>
-              <w:t xml:space="preserve">281</w:t>
+              <w:t>281</w:t>
             </w:r>
           </w:p>
         </w:tc>
@@ -3596,7 +4644,7 @@
                 <w:sz w:val="18"/>
                 <w:szCs w:val="18"/>
               </w:rPr>
-              <w:t xml:space="preserve">50</w:t>
+              <w:t>50</w:t>
             </w:r>
           </w:p>
         </w:tc>
@@ -3615,7 +4663,7 @@
                 <w:sz w:val="18"/>
                 <w:szCs w:val="18"/>
               </w:rPr>
-              <w:t xml:space="preserve">46</w:t>
+              <w:t>46</w:t>
             </w:r>
           </w:p>
         </w:tc>
@@ -3635,7 +4683,7 @@
                 <w:sz w:val="18"/>
                 <w:szCs w:val="18"/>
               </w:rPr>
-              <w:t xml:space="preserve">48</w:t>
+              <w:t>48</w:t>
             </w:r>
           </w:p>
         </w:tc>
@@ -3655,7 +4703,7 @@
                 <w:sz w:val="18"/>
                 <w:szCs w:val="18"/>
               </w:rPr>
-              <w:t xml:space="preserve">87</w:t>
+              <w:t>87</w:t>
             </w:r>
           </w:p>
         </w:tc>
@@ -3674,7 +4722,7 @@
                 <w:sz w:val="18"/>
                 <w:szCs w:val="18"/>
               </w:rPr>
-              <w:t xml:space="preserve">351</w:t>
+              <w:t>351</w:t>
             </w:r>
           </w:p>
         </w:tc>
@@ -3693,7 +4741,7 @@
                 <w:sz w:val="18"/>
                 <w:szCs w:val="18"/>
               </w:rPr>
-              <w:t xml:space="preserve">53</w:t>
+              <w:t>53</w:t>
             </w:r>
           </w:p>
         </w:tc>
@@ -3712,7 +4760,7 @@
                 <w:sz w:val="18"/>
                 <w:szCs w:val="18"/>
               </w:rPr>
-              <w:t xml:space="preserve">54</w:t>
+              <w:t>54</w:t>
             </w:r>
           </w:p>
         </w:tc>
@@ -3732,7 +4780,7 @@
                 <w:sz w:val="18"/>
                 <w:szCs w:val="18"/>
               </w:rPr>
-              <w:t xml:space="preserve">48</w:t>
+              <w:t>48</w:t>
             </w:r>
           </w:p>
         </w:tc>
@@ -3752,7 +4800,7 @@
                 <w:sz w:val="18"/>
                 <w:szCs w:val="18"/>
               </w:rPr>
-              <w:t xml:space="preserve">91</w:t>
+              <w:t>91</w:t>
             </w:r>
           </w:p>
         </w:tc>
@@ -3774,7 +4822,7 @@
                 <w:sz w:val="18"/>
                 <w:szCs w:val="18"/>
               </w:rPr>
-              <w:t xml:space="preserve">11</w:t>
+              <w:t>11</w:t>
             </w:r>
           </w:p>
         </w:tc>
@@ -3796,7 +4844,7 @@
                 <w:sz w:val="18"/>
                 <w:szCs w:val="18"/>
               </w:rPr>
-              <w:t xml:space="preserve">48</w:t>
+              <w:t>48</w:t>
             </w:r>
           </w:p>
         </w:tc>
@@ -3818,7 +4866,7 @@
                 <w:sz w:val="18"/>
                 <w:szCs w:val="18"/>
               </w:rPr>
-              <w:t xml:space="preserve">84</w:t>
+              <w:t>84</w:t>
             </w:r>
           </w:p>
         </w:tc>
@@ -3834,7 +4882,7 @@
           <w:b/>
           <w:bCs/>
         </w:rPr>
-        <w:t xml:space="preserve">Prístroj: Trimble C5</w:t>
+        <w:t>Prístroj: Trimble C5</w:t>
       </w:r>
     </w:p>
     <w:tbl>
@@ -3854,6 +4902,7 @@
           <w:left w:w="28" w:type="dxa"/>
           <w:right w:w="28" w:type="dxa"/>
         </w:tblCellMar>
+        <w:tblLook w:val="04A0" w:firstRow="1" w:lastRow="0" w:firstColumn="1" w:lastColumn="0" w:noHBand="0" w:noVBand="1"/>
       </w:tblPr>
       <w:tblGrid>
         <w:gridCol w:w="1000"/>
@@ -3882,6 +4931,7 @@
         <w:trPr>
           <w:cantSplit/>
           <w:tblHeader/>
+          <w:jc w:val="center"/>
         </w:trPr>
         <w:tc>
           <w:tcPr>
@@ -3901,7 +4951,7 @@
                 <w:sz w:val="18"/>
                 <w:szCs w:val="18"/>
               </w:rPr>
-              <w:t xml:space="preserve">Stanovisko</w:t>
+              <w:t>Stanovisko</w:t>
             </w:r>
           </w:p>
         </w:tc>
@@ -3923,7 +4973,7 @@
                 <w:sz w:val="18"/>
                 <w:szCs w:val="18"/>
               </w:rPr>
-              <w:t xml:space="preserve">Bod</w:t>
+              <w:t>Bod</w:t>
             </w:r>
           </w:p>
         </w:tc>
@@ -3945,7 +4995,7 @@
                 <w:sz w:val="18"/>
                 <w:szCs w:val="18"/>
               </w:rPr>
-              <w:t xml:space="preserve">Pol.</w:t>
+              <w:t>Pol.</w:t>
             </w:r>
           </w:p>
         </w:tc>
@@ -3967,7 +5017,7 @@
                 <w:sz w:val="18"/>
                 <w:szCs w:val="18"/>
               </w:rPr>
-              <w:t xml:space="preserve">1. skupina</w:t>
+              <w:t>1. skupina</w:t>
             </w:r>
           </w:p>
         </w:tc>
@@ -3990,7 +5040,7 @@
                 <w:sz w:val="18"/>
                 <w:szCs w:val="18"/>
               </w:rPr>
-              <w:t xml:space="preserve">priemer / redukcia</w:t>
+              <w:t>priemer / redukcia</w:t>
             </w:r>
           </w:p>
         </w:tc>
@@ -4012,7 +5062,7 @@
                 <w:sz w:val="18"/>
                 <w:szCs w:val="18"/>
               </w:rPr>
-              <w:t xml:space="preserve">2. skupina</w:t>
+              <w:t>2. skupina</w:t>
             </w:r>
           </w:p>
         </w:tc>
@@ -4035,7 +5085,7 @@
                 <w:sz w:val="18"/>
                 <w:szCs w:val="18"/>
               </w:rPr>
-              <w:t xml:space="preserve">priemer / redukcia</w:t>
+              <w:t>priemer / redukcia</w:t>
             </w:r>
           </w:p>
         </w:tc>
@@ -4057,7 +5107,7 @@
                 <w:sz w:val="18"/>
                 <w:szCs w:val="18"/>
               </w:rPr>
-              <w:t xml:space="preserve">3. skupina</w:t>
+              <w:t>3. skupina</w:t>
             </w:r>
           </w:p>
         </w:tc>
@@ -4080,7 +5130,7 @@
                 <w:sz w:val="18"/>
                 <w:szCs w:val="18"/>
               </w:rPr>
-              <w:t xml:space="preserve">priemer / redukcia</w:t>
+              <w:t>priemer / redukcia</w:t>
             </w:r>
           </w:p>
         </w:tc>
@@ -4103,7 +5153,7 @@
                 <w:sz w:val="18"/>
                 <w:szCs w:val="18"/>
               </w:rPr>
-              <w:t xml:space="preserve">výsledný smer</w:t>
+              <w:t>výsledný smer</w:t>
             </w:r>
           </w:p>
         </w:tc>
@@ -4112,6 +5162,7 @@
         <w:trPr>
           <w:cantSplit/>
           <w:tblHeader/>
+          <w:jc w:val="center"/>
         </w:trPr>
         <w:tc>
           <w:tcPr>
@@ -4169,7 +5220,7 @@
                 <w:sz w:val="18"/>
                 <w:szCs w:val="18"/>
               </w:rPr>
-              <w:t xml:space="preserve">g</w:t>
+              <w:t>g</w:t>
             </w:r>
           </w:p>
         </w:tc>
@@ -4190,7 +5241,7 @@
                 <w:sz w:val="18"/>
                 <w:szCs w:val="18"/>
               </w:rPr>
-              <w:t xml:space="preserve">c</w:t>
+              <w:t>c</w:t>
             </w:r>
           </w:p>
         </w:tc>
@@ -4211,7 +5262,7 @@
                 <w:sz w:val="18"/>
                 <w:szCs w:val="18"/>
               </w:rPr>
-              <w:t xml:space="preserve">cc</w:t>
+              <w:t>cc</w:t>
             </w:r>
           </w:p>
         </w:tc>
@@ -4233,7 +5284,7 @@
                 <w:sz w:val="18"/>
                 <w:szCs w:val="18"/>
               </w:rPr>
-              <w:t xml:space="preserve">c</w:t>
+              <w:t>c</w:t>
             </w:r>
           </w:p>
         </w:tc>
@@ -4255,7 +5306,7 @@
                 <w:sz w:val="18"/>
                 <w:szCs w:val="18"/>
               </w:rPr>
-              <w:t xml:space="preserve">cc</w:t>
+              <w:t>cc</w:t>
             </w:r>
           </w:p>
         </w:tc>
@@ -4276,7 +5327,7 @@
                 <w:sz w:val="18"/>
                 <w:szCs w:val="18"/>
               </w:rPr>
-              <w:t xml:space="preserve">g</w:t>
+              <w:t>g</w:t>
             </w:r>
           </w:p>
         </w:tc>
@@ -4297,7 +5348,7 @@
                 <w:sz w:val="18"/>
                 <w:szCs w:val="18"/>
               </w:rPr>
-              <w:t xml:space="preserve">c</w:t>
+              <w:t>c</w:t>
             </w:r>
           </w:p>
         </w:tc>
@@ -4318,7 +5369,7 @@
                 <w:sz w:val="18"/>
                 <w:szCs w:val="18"/>
               </w:rPr>
-              <w:t xml:space="preserve">cc</w:t>
+              <w:t>cc</w:t>
             </w:r>
           </w:p>
         </w:tc>
@@ -4340,7 +5391,7 @@
                 <w:sz w:val="18"/>
                 <w:szCs w:val="18"/>
               </w:rPr>
-              <w:t xml:space="preserve">c</w:t>
+              <w:t>c</w:t>
             </w:r>
           </w:p>
         </w:tc>
@@ -4362,7 +5413,7 @@
                 <w:sz w:val="18"/>
                 <w:szCs w:val="18"/>
               </w:rPr>
-              <w:t xml:space="preserve">cc</w:t>
+              <w:t>cc</w:t>
             </w:r>
           </w:p>
         </w:tc>
@@ -4383,7 +5434,7 @@
                 <w:sz w:val="18"/>
                 <w:szCs w:val="18"/>
               </w:rPr>
-              <w:t xml:space="preserve">g</w:t>
+              <w:t>g</w:t>
             </w:r>
           </w:p>
         </w:tc>
@@ -4404,7 +5455,7 @@
                 <w:sz w:val="18"/>
                 <w:szCs w:val="18"/>
               </w:rPr>
-              <w:t xml:space="preserve">c</w:t>
+              <w:t>c</w:t>
             </w:r>
           </w:p>
         </w:tc>
@@ -4425,7 +5476,7 @@
                 <w:sz w:val="18"/>
                 <w:szCs w:val="18"/>
               </w:rPr>
-              <w:t xml:space="preserve">cc</w:t>
+              <w:t>cc</w:t>
             </w:r>
           </w:p>
         </w:tc>
@@ -4447,7 +5498,7 @@
                 <w:sz w:val="18"/>
                 <w:szCs w:val="18"/>
               </w:rPr>
-              <w:t xml:space="preserve">c</w:t>
+              <w:t>c</w:t>
             </w:r>
           </w:p>
         </w:tc>
@@ -4469,7 +5520,7 @@
                 <w:sz w:val="18"/>
                 <w:szCs w:val="18"/>
               </w:rPr>
-              <w:t xml:space="preserve">cc</w:t>
+              <w:t>cc</w:t>
             </w:r>
           </w:p>
         </w:tc>
@@ -4491,7 +5542,7 @@
                 <w:sz w:val="18"/>
                 <w:szCs w:val="18"/>
               </w:rPr>
-              <w:t xml:space="preserve">g</w:t>
+              <w:t>g</w:t>
             </w:r>
           </w:p>
         </w:tc>
@@ -4513,7 +5564,7 @@
                 <w:sz w:val="18"/>
                 <w:szCs w:val="18"/>
               </w:rPr>
-              <w:t xml:space="preserve">c</w:t>
+              <w:t>c</w:t>
             </w:r>
           </w:p>
         </w:tc>
@@ -4535,7 +5586,7 @@
                 <w:sz w:val="18"/>
                 <w:szCs w:val="18"/>
               </w:rPr>
-              <w:t xml:space="preserve">cc</w:t>
+              <w:t>cc</w:t>
             </w:r>
           </w:p>
         </w:tc>
@@ -4543,6 +5594,7 @@
       <w:tr>
         <w:trPr>
           <w:cantSplit/>
+          <w:jc w:val="center"/>
         </w:trPr>
         <w:tc>
           <w:tcPr>
@@ -4560,7 +5612,7 @@
                 <w:sz w:val="18"/>
                 <w:szCs w:val="18"/>
               </w:rPr>
-              <w:t xml:space="preserve">S</w:t>
+              <w:t>S</w:t>
             </w:r>
           </w:p>
         </w:tc>
@@ -4580,7 +5632,7 @@
                 <w:sz w:val="18"/>
                 <w:szCs w:val="18"/>
               </w:rPr>
-              <w:t xml:space="preserve">1</w:t>
+              <w:t>1</w:t>
             </w:r>
           </w:p>
         </w:tc>
@@ -4599,7 +5651,7 @@
                 <w:sz w:val="18"/>
                 <w:szCs w:val="18"/>
               </w:rPr>
-              <w:t xml:space="preserve">I.</w:t>
+              <w:t>I.</w:t>
             </w:r>
           </w:p>
         </w:tc>
@@ -4618,7 +5670,7 @@
                 <w:sz w:val="18"/>
                 <w:szCs w:val="18"/>
               </w:rPr>
-              <w:t xml:space="preserve">0</w:t>
+              <w:t>0</w:t>
             </w:r>
           </w:p>
         </w:tc>
@@ -4637,7 +5689,7 @@
                 <w:sz w:val="18"/>
                 <w:szCs w:val="18"/>
               </w:rPr>
-              <w:t xml:space="preserve">03</w:t>
+              <w:t>03</w:t>
             </w:r>
           </w:p>
         </w:tc>
@@ -4656,7 +5708,7 @@
                 <w:sz w:val="18"/>
                 <w:szCs w:val="18"/>
               </w:rPr>
-              <w:t xml:space="preserve">12</w:t>
+              <w:t>12</w:t>
             </w:r>
           </w:p>
         </w:tc>
@@ -4676,7 +5728,7 @@
                 <w:sz w:val="18"/>
                 <w:szCs w:val="18"/>
               </w:rPr>
-              <w:t xml:space="preserve">03</w:t>
+              <w:t>03</w:t>
             </w:r>
           </w:p>
         </w:tc>
@@ -4696,7 +5748,7 @@
                 <w:sz w:val="18"/>
                 <w:szCs w:val="18"/>
               </w:rPr>
-              <w:t xml:space="preserve">05</w:t>
+              <w:t>05</w:t>
             </w:r>
           </w:p>
         </w:tc>
@@ -4715,7 +5767,7 @@
                 <w:sz w:val="18"/>
                 <w:szCs w:val="18"/>
               </w:rPr>
-              <w:t xml:space="preserve">70</w:t>
+              <w:t>70</w:t>
             </w:r>
           </w:p>
         </w:tc>
@@ -4734,7 +5786,7 @@
                 <w:sz w:val="18"/>
                 <w:szCs w:val="18"/>
               </w:rPr>
-              <w:t xml:space="preserve">03</w:t>
+              <w:t>03</w:t>
             </w:r>
           </w:p>
         </w:tc>
@@ -4753,7 +5805,7 @@
                 <w:sz w:val="18"/>
                 <w:szCs w:val="18"/>
               </w:rPr>
-              <w:t xml:space="preserve">30</w:t>
+              <w:t>30</w:t>
             </w:r>
           </w:p>
         </w:tc>
@@ -4773,7 +5825,7 @@
                 <w:sz w:val="18"/>
                 <w:szCs w:val="18"/>
               </w:rPr>
-              <w:t xml:space="preserve">03</w:t>
+              <w:t>03</w:t>
             </w:r>
           </w:p>
         </w:tc>
@@ -4793,7 +5845,7 @@
                 <w:sz w:val="18"/>
                 <w:szCs w:val="18"/>
               </w:rPr>
-              <w:t xml:space="preserve">52</w:t>
+              <w:t>52</w:t>
             </w:r>
           </w:p>
         </w:tc>
@@ -4812,7 +5864,7 @@
                 <w:sz w:val="18"/>
                 <w:szCs w:val="18"/>
               </w:rPr>
-              <w:t xml:space="preserve">140</w:t>
+              <w:t>140</w:t>
             </w:r>
           </w:p>
         </w:tc>
@@ -4831,7 +5883,7 @@
                 <w:sz w:val="18"/>
                 <w:szCs w:val="18"/>
               </w:rPr>
-              <w:t xml:space="preserve">05</w:t>
+              <w:t>05</w:t>
             </w:r>
           </w:p>
         </w:tc>
@@ -4850,7 +5902,7 @@
                 <w:sz w:val="18"/>
                 <w:szCs w:val="18"/>
               </w:rPr>
-              <w:t xml:space="preserve">00</w:t>
+              <w:t>00</w:t>
             </w:r>
           </w:p>
         </w:tc>
@@ -4870,7 +5922,7 @@
                 <w:sz w:val="18"/>
                 <w:szCs w:val="18"/>
               </w:rPr>
-              <w:t xml:space="preserve">04</w:t>
+              <w:t>04</w:t>
             </w:r>
           </w:p>
         </w:tc>
@@ -4890,7 +5942,7 @@
                 <w:sz w:val="18"/>
                 <w:szCs w:val="18"/>
               </w:rPr>
-              <w:t xml:space="preserve">69</w:t>
+              <w:t>69</w:t>
             </w:r>
           </w:p>
         </w:tc>
@@ -4934,6 +5986,7 @@
       <w:tr>
         <w:trPr>
           <w:cantSplit/>
+          <w:jc w:val="center"/>
         </w:trPr>
         <w:tc>
           <w:tcPr>
@@ -4976,7 +6029,7 @@
                 <w:sz w:val="18"/>
                 <w:szCs w:val="18"/>
               </w:rPr>
-              <w:t xml:space="preserve">II.</w:t>
+              <w:t>II.</w:t>
             </w:r>
           </w:p>
         </w:tc>
@@ -4995,7 +6048,7 @@
                 <w:sz w:val="18"/>
                 <w:szCs w:val="18"/>
               </w:rPr>
-              <w:t xml:space="preserve">200</w:t>
+              <w:t>200</w:t>
             </w:r>
           </w:p>
         </w:tc>
@@ -5014,7 +6067,7 @@
                 <w:sz w:val="18"/>
                 <w:szCs w:val="18"/>
               </w:rPr>
-              <w:t xml:space="preserve">02</w:t>
+              <w:t>02</w:t>
             </w:r>
           </w:p>
         </w:tc>
@@ -5033,7 +6086,7 @@
                 <w:sz w:val="18"/>
                 <w:szCs w:val="18"/>
               </w:rPr>
-              <w:t xml:space="preserve">98</w:t>
+              <w:t>98</w:t>
             </w:r>
           </w:p>
         </w:tc>
@@ -5053,7 +6106,7 @@
                 <w:sz w:val="18"/>
                 <w:szCs w:val="18"/>
               </w:rPr>
-              <w:t xml:space="preserve">00</w:t>
+              <w:t>00</w:t>
             </w:r>
           </w:p>
         </w:tc>
@@ -5073,7 +6126,7 @@
                 <w:sz w:val="18"/>
                 <w:szCs w:val="18"/>
               </w:rPr>
-              <w:t xml:space="preserve">00</w:t>
+              <w:t>00</w:t>
             </w:r>
           </w:p>
         </w:tc>
@@ -5092,7 +6145,7 @@
                 <w:sz w:val="18"/>
                 <w:szCs w:val="18"/>
               </w:rPr>
-              <w:t xml:space="preserve">270</w:t>
+              <w:t>270</w:t>
             </w:r>
           </w:p>
         </w:tc>
@@ -5111,7 +6164,7 @@
                 <w:sz w:val="18"/>
                 <w:szCs w:val="18"/>
               </w:rPr>
-              <w:t xml:space="preserve">03</w:t>
+              <w:t>03</w:t>
             </w:r>
           </w:p>
         </w:tc>
@@ -5130,7 +6183,7 @@
                 <w:sz w:val="18"/>
                 <w:szCs w:val="18"/>
               </w:rPr>
-              <w:t xml:space="preserve">74</w:t>
+              <w:t>74</w:t>
             </w:r>
           </w:p>
         </w:tc>
@@ -5150,7 +6203,7 @@
                 <w:sz w:val="18"/>
                 <w:szCs w:val="18"/>
               </w:rPr>
-              <w:t xml:space="preserve">00</w:t>
+              <w:t>00</w:t>
             </w:r>
           </w:p>
         </w:tc>
@@ -5170,7 +6223,7 @@
                 <w:sz w:val="18"/>
                 <w:szCs w:val="18"/>
               </w:rPr>
-              <w:t xml:space="preserve">00</w:t>
+              <w:t>00</w:t>
             </w:r>
           </w:p>
         </w:tc>
@@ -5189,7 +6242,7 @@
                 <w:sz w:val="18"/>
                 <w:szCs w:val="18"/>
               </w:rPr>
-              <w:t xml:space="preserve">340</w:t>
+              <w:t>340</w:t>
             </w:r>
           </w:p>
         </w:tc>
@@ -5208,7 +6261,7 @@
                 <w:sz w:val="18"/>
                 <w:szCs w:val="18"/>
               </w:rPr>
-              <w:t xml:space="preserve">04</w:t>
+              <w:t>04</w:t>
             </w:r>
           </w:p>
         </w:tc>
@@ -5227,7 +6280,7 @@
                 <w:sz w:val="18"/>
                 <w:szCs w:val="18"/>
               </w:rPr>
-              <w:t xml:space="preserve">38</w:t>
+              <w:t>38</w:t>
             </w:r>
           </w:p>
         </w:tc>
@@ -5247,7 +6300,7 @@
                 <w:sz w:val="18"/>
                 <w:szCs w:val="18"/>
               </w:rPr>
-              <w:t xml:space="preserve">00</w:t>
+              <w:t>00</w:t>
             </w:r>
           </w:p>
         </w:tc>
@@ -5267,7 +6320,7 @@
                 <w:sz w:val="18"/>
                 <w:szCs w:val="18"/>
               </w:rPr>
-              <w:t xml:space="preserve">00</w:t>
+              <w:t>00</w:t>
             </w:r>
           </w:p>
         </w:tc>
@@ -5289,7 +6342,7 @@
                 <w:sz w:val="18"/>
                 <w:szCs w:val="18"/>
               </w:rPr>
-              <w:t xml:space="preserve">0</w:t>
+              <w:t>0</w:t>
             </w:r>
           </w:p>
         </w:tc>
@@ -5311,7 +6364,7 @@
                 <w:sz w:val="18"/>
                 <w:szCs w:val="18"/>
               </w:rPr>
-              <w:t xml:space="preserve">00</w:t>
+              <w:t>00</w:t>
             </w:r>
           </w:p>
         </w:tc>
@@ -5333,7 +6386,7 @@
                 <w:sz w:val="18"/>
                 <w:szCs w:val="18"/>
               </w:rPr>
-              <w:t xml:space="preserve">00</w:t>
+              <w:t>00</w:t>
             </w:r>
           </w:p>
         </w:tc>
@@ -5341,6 +6394,7 @@
       <w:tr>
         <w:trPr>
           <w:cantSplit/>
+          <w:jc w:val="center"/>
         </w:trPr>
         <w:tc>
           <w:tcPr>
@@ -5371,7 +6425,7 @@
                 <w:sz w:val="18"/>
                 <w:szCs w:val="18"/>
               </w:rPr>
-              <w:t xml:space="preserve">2</w:t>
+              <w:t>2</w:t>
             </w:r>
           </w:p>
         </w:tc>
@@ -5390,7 +6444,7 @@
                 <w:sz w:val="18"/>
                 <w:szCs w:val="18"/>
               </w:rPr>
-              <w:t xml:space="preserve">I.</w:t>
+              <w:t>I.</w:t>
             </w:r>
           </w:p>
         </w:tc>
@@ -5409,7 +6463,7 @@
                 <w:sz w:val="18"/>
                 <w:szCs w:val="18"/>
               </w:rPr>
-              <w:t xml:space="preserve">11</w:t>
+              <w:t>11</w:t>
             </w:r>
           </w:p>
         </w:tc>
@@ -5428,7 +6482,7 @@
                 <w:sz w:val="18"/>
                 <w:szCs w:val="18"/>
               </w:rPr>
-              <w:t xml:space="preserve">53</w:t>
+              <w:t>53</w:t>
             </w:r>
           </w:p>
         </w:tc>
@@ -5447,7 +6501,7 @@
                 <w:sz w:val="18"/>
                 <w:szCs w:val="18"/>
               </w:rPr>
-              <w:t xml:space="preserve">13</w:t>
+              <w:t>13</w:t>
             </w:r>
           </w:p>
         </w:tc>
@@ -5467,7 +6521,7 @@
                 <w:sz w:val="18"/>
                 <w:szCs w:val="18"/>
               </w:rPr>
-              <w:t xml:space="preserve">53</w:t>
+              <w:t>53</w:t>
             </w:r>
           </w:p>
         </w:tc>
@@ -5487,7 +6541,7 @@
                 <w:sz w:val="18"/>
                 <w:szCs w:val="18"/>
               </w:rPr>
-              <w:t xml:space="preserve">45</w:t>
+              <w:t>45</w:t>
             </w:r>
           </w:p>
         </w:tc>
@@ -5506,7 +6560,7 @@
                 <w:sz w:val="18"/>
                 <w:szCs w:val="18"/>
               </w:rPr>
-              <w:t xml:space="preserve">81</w:t>
+              <w:t>81</w:t>
             </w:r>
           </w:p>
         </w:tc>
@@ -5525,7 +6579,7 @@
                 <w:sz w:val="18"/>
                 <w:szCs w:val="18"/>
               </w:rPr>
-              <w:t xml:space="preserve">53</w:t>
+              <w:t>53</w:t>
             </w:r>
           </w:p>
         </w:tc>
@@ -5544,7 +6598,7 @@
                 <w:sz w:val="18"/>
                 <w:szCs w:val="18"/>
               </w:rPr>
-              <w:t xml:space="preserve">48</w:t>
+              <w:t>48</w:t>
             </w:r>
           </w:p>
         </w:tc>
@@ -5564,7 +6618,7 @@
                 <w:sz w:val="18"/>
                 <w:szCs w:val="18"/>
               </w:rPr>
-              <w:t xml:space="preserve">53</w:t>
+              <w:t>53</w:t>
             </w:r>
           </w:p>
         </w:tc>
@@ -5584,7 +6638,7 @@
                 <w:sz w:val="18"/>
                 <w:szCs w:val="18"/>
               </w:rPr>
-              <w:t xml:space="preserve">80</w:t>
+              <w:t>80</w:t>
             </w:r>
           </w:p>
         </w:tc>
@@ -5603,7 +6657,7 @@
                 <w:sz w:val="18"/>
                 <w:szCs w:val="18"/>
               </w:rPr>
-              <w:t xml:space="preserve">151</w:t>
+              <w:t>151</w:t>
             </w:r>
           </w:p>
         </w:tc>
@@ -5622,7 +6676,7 @@
                 <w:sz w:val="18"/>
                 <w:szCs w:val="18"/>
               </w:rPr>
-              <w:t xml:space="preserve">56</w:t>
+              <w:t>56</w:t>
             </w:r>
           </w:p>
         </w:tc>
@@ -5641,7 +6695,7 @@
                 <w:sz w:val="18"/>
                 <w:szCs w:val="18"/>
               </w:rPr>
-              <w:t xml:space="preserve">30</w:t>
+              <w:t>30</w:t>
             </w:r>
           </w:p>
         </w:tc>
@@ -5661,7 +6715,7 @@
                 <w:sz w:val="18"/>
                 <w:szCs w:val="18"/>
               </w:rPr>
-              <w:t xml:space="preserve">56</w:t>
+              <w:t>56</w:t>
             </w:r>
           </w:p>
         </w:tc>
@@ -5681,7 +6735,7 @@
                 <w:sz w:val="18"/>
                 <w:szCs w:val="18"/>
               </w:rPr>
-              <w:t xml:space="preserve">72</w:t>
+              <w:t>72</w:t>
             </w:r>
           </w:p>
         </w:tc>
@@ -5725,6 +6779,7 @@
       <w:tr>
         <w:trPr>
           <w:cantSplit/>
+          <w:jc w:val="center"/>
         </w:trPr>
         <w:tc>
           <w:tcPr>
@@ -5767,7 +6822,7 @@
                 <w:sz w:val="18"/>
                 <w:szCs w:val="18"/>
               </w:rPr>
-              <w:t xml:space="preserve">II.</w:t>
+              <w:t>II.</w:t>
             </w:r>
           </w:p>
         </w:tc>
@@ -5786,7 +6841,7 @@
                 <w:sz w:val="18"/>
                 <w:szCs w:val="18"/>
               </w:rPr>
-              <w:t xml:space="preserve">211</w:t>
+              <w:t>211</w:t>
             </w:r>
           </w:p>
         </w:tc>
@@ -5805,7 +6860,7 @@
                 <w:sz w:val="18"/>
                 <w:szCs w:val="18"/>
               </w:rPr>
-              <w:t xml:space="preserve">53</w:t>
+              <w:t>53</w:t>
             </w:r>
           </w:p>
         </w:tc>
@@ -5824,7 +6879,7 @@
                 <w:sz w:val="18"/>
                 <w:szCs w:val="18"/>
               </w:rPr>
-              <w:t xml:space="preserve">76</w:t>
+              <w:t>76</w:t>
             </w:r>
           </w:p>
         </w:tc>
@@ -5844,7 +6899,7 @@
                 <w:sz w:val="18"/>
                 <w:szCs w:val="18"/>
               </w:rPr>
-              <w:t xml:space="preserve">50</w:t>
+              <w:t>50</w:t>
             </w:r>
           </w:p>
         </w:tc>
@@ -5864,7 +6919,7 @@
                 <w:sz w:val="18"/>
                 <w:szCs w:val="18"/>
               </w:rPr>
-              <w:t xml:space="preserve">40</w:t>
+              <w:t>40</w:t>
             </w:r>
           </w:p>
         </w:tc>
@@ -5883,7 +6938,7 @@
                 <w:sz w:val="18"/>
                 <w:szCs w:val="18"/>
               </w:rPr>
-              <w:t xml:space="preserve">281</w:t>
+              <w:t>281</w:t>
             </w:r>
           </w:p>
         </w:tc>
@@ -5902,7 +6957,7 @@
                 <w:sz w:val="18"/>
                 <w:szCs w:val="18"/>
               </w:rPr>
-              <w:t xml:space="preserve">54</w:t>
+              <w:t>54</w:t>
             </w:r>
           </w:p>
         </w:tc>
@@ -5921,7 +6976,7 @@
                 <w:sz w:val="18"/>
                 <w:szCs w:val="18"/>
               </w:rPr>
-              <w:t xml:space="preserve">12</w:t>
+              <w:t>12</w:t>
             </w:r>
           </w:p>
         </w:tc>
@@ -5941,7 +6996,7 @@
                 <w:sz w:val="18"/>
                 <w:szCs w:val="18"/>
               </w:rPr>
-              <w:t xml:space="preserve">50</w:t>
+              <w:t>50</w:t>
             </w:r>
           </w:p>
         </w:tc>
@@ -5961,7 +7016,7 @@
                 <w:sz w:val="18"/>
                 <w:szCs w:val="18"/>
               </w:rPr>
-              <w:t xml:space="preserve">28</w:t>
+              <w:t>28</w:t>
             </w:r>
           </w:p>
         </w:tc>
@@ -5980,7 +7035,7 @@
                 <w:sz w:val="18"/>
                 <w:szCs w:val="18"/>
               </w:rPr>
-              <w:t xml:space="preserve">351</w:t>
+              <w:t>351</w:t>
             </w:r>
           </w:p>
         </w:tc>
@@ -5999,7 +7054,7 @@
                 <w:sz w:val="18"/>
                 <w:szCs w:val="18"/>
               </w:rPr>
-              <w:t xml:space="preserve">57</w:t>
+              <w:t>57</w:t>
             </w:r>
           </w:p>
         </w:tc>
@@ -6018,7 +7073,7 @@
                 <w:sz w:val="18"/>
                 <w:szCs w:val="18"/>
               </w:rPr>
-              <w:t xml:space="preserve">14</w:t>
+              <w:t>14</w:t>
             </w:r>
           </w:p>
         </w:tc>
@@ -6038,7 +7093,7 @@
                 <w:sz w:val="18"/>
                 <w:szCs w:val="18"/>
               </w:rPr>
-              <w:t xml:space="preserve">52</w:t>
+              <w:t>52</w:t>
             </w:r>
           </w:p>
         </w:tc>
@@ -6058,7 +7113,7 @@
                 <w:sz w:val="18"/>
                 <w:szCs w:val="18"/>
               </w:rPr>
-              <w:t xml:space="preserve">03</w:t>
+              <w:t>03</w:t>
             </w:r>
           </w:p>
         </w:tc>
@@ -6080,7 +7135,7 @@
                 <w:sz w:val="18"/>
                 <w:szCs w:val="18"/>
               </w:rPr>
-              <w:t xml:space="preserve">11</w:t>
+              <w:t>11</w:t>
             </w:r>
           </w:p>
         </w:tc>
@@ -6102,7 +7157,7 @@
                 <w:sz w:val="18"/>
                 <w:szCs w:val="18"/>
               </w:rPr>
-              <w:t xml:space="preserve">50</w:t>
+              <w:t>50</w:t>
             </w:r>
           </w:p>
         </w:tc>
@@ -6124,26 +7179,12 @@
                 <w:sz w:val="18"/>
                 <w:szCs w:val="18"/>
               </w:rPr>
-              <w:t xml:space="preserve">90</w:t>
+              <w:t>90</w:t>
             </w:r>
           </w:p>
         </w:tc>
       </w:tr>
     </w:tbl>
-    <w:p>
-      <w:pPr>
-        <w:spacing w:before="120" w:after="120"/>
-      </w:pPr>
-      <w:r>
-        <w:rPr>
-          <w:i/>
-          <w:iCs/>
-          <w:sz w:val="18"/>
-          <w:szCs w:val="18"/>
-        </w:rPr>
-        <w:t xml:space="preserve">V riadku I. je v zelenom stĺpci priemer z oboch polôh podľa vzorca (1), v riadku II. v modrom stĺpci smer zredukovaný na prvý bod podľa vzorca (3). Grády priemeru a redukcie sú rovnaké ako v príslušnom čítaní, preto sa nezapisujú.</w:t>
-      </w:r>
-    </w:p>
     <w:p>
       <w:pPr>
         <w:keepNext/>
@@ -6154,7 +7195,7 @@
           <w:b/>
           <w:bCs/>
         </w:rPr>
-        <w:t xml:space="preserve">Tab. 1  Kontrola polôh a výsledné vodorovné uhly</w:t>
+        <w:t>Tab. 1  Kontrola polôh a výsledné vodorovné uhly</w:t>
       </w:r>
     </w:p>
     <w:tbl>
@@ -6174,6 +7215,7 @@
           <w:left w:w="28" w:type="dxa"/>
           <w:right w:w="28" w:type="dxa"/>
         </w:tblCellMar>
+        <w:tblLook w:val="04A0" w:firstRow="1" w:lastRow="0" w:firstColumn="1" w:lastColumn="0" w:noHBand="0" w:noVBand="1"/>
       </w:tblPr>
       <w:tblGrid>
         <w:gridCol w:w="2600"/>
@@ -6187,6 +7229,7 @@
         <w:trPr>
           <w:cantSplit/>
           <w:tblHeader/>
+          <w:jc w:val="center"/>
         </w:trPr>
         <w:tc>
           <w:tcPr>
@@ -6205,7 +7248,7 @@
                 <w:sz w:val="18"/>
                 <w:szCs w:val="18"/>
               </w:rPr>
-              <w:t xml:space="preserve">Prístroj</w:t>
+              <w:t>Prístroj</w:t>
             </w:r>
           </w:p>
         </w:tc>
@@ -6226,7 +7269,7 @@
                 <w:sz w:val="18"/>
                 <w:szCs w:val="18"/>
               </w:rPr>
-              <w:t xml:space="preserve">Bod</w:t>
+              <w:t>Bod</w:t>
             </w:r>
           </w:p>
         </w:tc>
@@ -6247,7 +7290,7 @@
                 <w:sz w:val="18"/>
                 <w:szCs w:val="18"/>
               </w:rPr>
-              <w:t xml:space="preserve">2c – 1. sk. [cc]</w:t>
+              <w:t>2c – 1. sk. [cc]</w:t>
             </w:r>
           </w:p>
         </w:tc>
@@ -6268,7 +7311,7 @@
                 <w:sz w:val="18"/>
                 <w:szCs w:val="18"/>
               </w:rPr>
-              <w:t xml:space="preserve">2c – 2. sk. [cc]</w:t>
+              <w:t>2c – 2. sk. [cc]</w:t>
             </w:r>
           </w:p>
         </w:tc>
@@ -6289,7 +7332,7 @@
                 <w:sz w:val="18"/>
                 <w:szCs w:val="18"/>
               </w:rPr>
-              <w:t xml:space="preserve">2c – 3. sk. [cc]</w:t>
+              <w:t>2c – 3. sk. [cc]</w:t>
             </w:r>
           </w:p>
         </w:tc>
@@ -6310,7 +7353,7 @@
                 <w:sz w:val="18"/>
                 <w:szCs w:val="18"/>
               </w:rPr>
-              <w:t xml:space="preserve">Výsledný smer [gon]</w:t>
+              <w:t>Výsledný smer [gon]</w:t>
             </w:r>
           </w:p>
         </w:tc>
@@ -6318,6 +7361,7 @@
       <w:tr>
         <w:trPr>
           <w:cantSplit/>
+          <w:jc w:val="center"/>
         </w:trPr>
         <w:tc>
           <w:tcPr>
@@ -6335,7 +7379,7 @@
                 <w:sz w:val="18"/>
                 <w:szCs w:val="18"/>
               </w:rPr>
-              <w:t xml:space="preserve">Nivel System DT-2</w:t>
+              <w:t>Nivel System DT-2</w:t>
             </w:r>
           </w:p>
         </w:tc>
@@ -6354,7 +7398,7 @@
                 <w:sz w:val="18"/>
                 <w:szCs w:val="18"/>
               </w:rPr>
-              <w:t xml:space="preserve">1</w:t>
+              <w:t>1</w:t>
             </w:r>
           </w:p>
         </w:tc>
@@ -6373,7 +7417,7 @@
                 <w:sz w:val="18"/>
                 <w:szCs w:val="18"/>
               </w:rPr>
-              <w:t xml:space="preserve">+ 56</w:t>
+              <w:t>+ 56</w:t>
             </w:r>
           </w:p>
         </w:tc>
@@ -6392,7 +7436,7 @@
                 <w:sz w:val="18"/>
                 <w:szCs w:val="18"/>
               </w:rPr>
-              <w:t xml:space="preserve">− 96</w:t>
+              <w:t>− 96</w:t>
             </w:r>
           </w:p>
         </w:tc>
@@ -6411,7 +7455,7 @@
                 <w:sz w:val="18"/>
                 <w:szCs w:val="18"/>
               </w:rPr>
-              <w:t xml:space="preserve">+ 79</w:t>
+              <w:t>+ 79</w:t>
             </w:r>
           </w:p>
         </w:tc>
@@ -6432,7 +7476,7 @@
                 <w:sz w:val="18"/>
                 <w:szCs w:val="18"/>
               </w:rPr>
-              <w:t xml:space="preserve">0,0000</w:t>
+              <w:t>0,0000</w:t>
             </w:r>
           </w:p>
         </w:tc>
@@ -6440,6 +7484,7 @@
       <w:tr>
         <w:trPr>
           <w:cantSplit/>
+          <w:jc w:val="center"/>
         </w:trPr>
         <w:tc>
           <w:tcPr>
@@ -6469,7 +7514,7 @@
                 <w:sz w:val="18"/>
                 <w:szCs w:val="18"/>
               </w:rPr>
-              <w:t xml:space="preserve">2</w:t>
+              <w:t>2</w:t>
             </w:r>
           </w:p>
         </w:tc>
@@ -6488,7 +7533,7 @@
                 <w:sz w:val="18"/>
                 <w:szCs w:val="18"/>
               </w:rPr>
-              <w:t xml:space="preserve">− 24</w:t>
+              <w:t>− 24</w:t>
             </w:r>
           </w:p>
         </w:tc>
@@ -6507,7 +7552,7 @@
                 <w:sz w:val="18"/>
                 <w:szCs w:val="18"/>
               </w:rPr>
-              <w:t xml:space="preserve">+ 58</w:t>
+              <w:t>+ 58</w:t>
             </w:r>
           </w:p>
         </w:tc>
@@ -6526,7 +7571,7 @@
                 <w:sz w:val="18"/>
                 <w:szCs w:val="18"/>
               </w:rPr>
-              <w:t xml:space="preserve">+ 12</w:t>
+              <w:t>+ 12</w:t>
             </w:r>
           </w:p>
         </w:tc>
@@ -6547,7 +7592,7 @@
                 <w:sz w:val="18"/>
                 <w:szCs w:val="18"/>
               </w:rPr>
-              <w:t xml:space="preserve">11,4884</w:t>
+              <w:t>11,4884</w:t>
             </w:r>
           </w:p>
         </w:tc>
@@ -6555,6 +7600,7 @@
       <w:tr>
         <w:trPr>
           <w:cantSplit/>
+          <w:jc w:val="center"/>
         </w:trPr>
         <w:tc>
           <w:tcPr>
@@ -6574,7 +7620,7 @@
                 <w:sz w:val="18"/>
                 <w:szCs w:val="18"/>
               </w:rPr>
-              <w:t xml:space="preserve">Uhol ω (Nivel System DT-2)</w:t>
+              <w:t>Uhol ω (Nivel System DT-2)</w:t>
             </w:r>
           </w:p>
         </w:tc>
@@ -6596,7 +7642,7 @@
                 <w:sz w:val="18"/>
                 <w:szCs w:val="18"/>
               </w:rPr>
-              <w:t xml:space="preserve">11,4884 gon</w:t>
+              <w:t>11,4884 gon</w:t>
             </w:r>
           </w:p>
         </w:tc>
@@ -6604,6 +7650,7 @@
       <w:tr>
         <w:trPr>
           <w:cantSplit/>
+          <w:jc w:val="center"/>
         </w:trPr>
         <w:tc>
           <w:tcPr>
@@ -6621,7 +7668,7 @@
                 <w:sz w:val="18"/>
                 <w:szCs w:val="18"/>
               </w:rPr>
-              <w:t xml:space="preserve">Trimble C5</w:t>
+              <w:t>Trimble C5</w:t>
             </w:r>
           </w:p>
         </w:tc>
@@ -6640,7 +7687,7 @@
                 <w:sz w:val="18"/>
                 <w:szCs w:val="18"/>
               </w:rPr>
-              <w:t xml:space="preserve">1</w:t>
+              <w:t>1</w:t>
             </w:r>
           </w:p>
         </w:tc>
@@ -6659,7 +7706,7 @@
                 <w:sz w:val="18"/>
                 <w:szCs w:val="18"/>
               </w:rPr>
-              <w:t xml:space="preserve">+ 14</w:t>
+              <w:t>+ 14</w:t>
             </w:r>
           </w:p>
         </w:tc>
@@ -6678,7 +7725,7 @@
                 <w:sz w:val="18"/>
                 <w:szCs w:val="18"/>
               </w:rPr>
-              <w:t xml:space="preserve">− 44</w:t>
+              <w:t>− 44</w:t>
             </w:r>
           </w:p>
         </w:tc>
@@ -6697,7 +7744,7 @@
                 <w:sz w:val="18"/>
                 <w:szCs w:val="18"/>
               </w:rPr>
-              <w:t xml:space="preserve">+ 62</w:t>
+              <w:t>+ 62</w:t>
             </w:r>
           </w:p>
         </w:tc>
@@ -6718,7 +7765,7 @@
                 <w:sz w:val="18"/>
                 <w:szCs w:val="18"/>
               </w:rPr>
-              <w:t xml:space="preserve">0,0000</w:t>
+              <w:t>0,0000</w:t>
             </w:r>
           </w:p>
         </w:tc>
@@ -6726,6 +7773,7 @@
       <w:tr>
         <w:trPr>
           <w:cantSplit/>
+          <w:jc w:val="center"/>
         </w:trPr>
         <w:tc>
           <w:tcPr>
@@ -6755,7 +7803,7 @@
                 <w:sz w:val="18"/>
                 <w:szCs w:val="18"/>
               </w:rPr>
-              <w:t xml:space="preserve">2</w:t>
+              <w:t>2</w:t>
             </w:r>
           </w:p>
         </w:tc>
@@ -6774,7 +7822,7 @@
                 <w:sz w:val="18"/>
                 <w:szCs w:val="18"/>
               </w:rPr>
-              <w:t xml:space="preserve">− 63</w:t>
+              <w:t>− 63</w:t>
             </w:r>
           </w:p>
         </w:tc>
@@ -6793,7 +7841,7 @@
                 <w:sz w:val="18"/>
                 <w:szCs w:val="18"/>
               </w:rPr>
-              <w:t xml:space="preserve">− 64</w:t>
+              <w:t>− 64</w:t>
             </w:r>
           </w:p>
         </w:tc>
@@ -6812,7 +7860,7 @@
                 <w:sz w:val="18"/>
                 <w:szCs w:val="18"/>
               </w:rPr>
-              <w:t xml:space="preserve">− 84</w:t>
+              <w:t>− 84</w:t>
             </w:r>
           </w:p>
         </w:tc>
@@ -6833,7 +7881,7 @@
                 <w:sz w:val="18"/>
                 <w:szCs w:val="18"/>
               </w:rPr>
-              <w:t xml:space="preserve">11,5090</w:t>
+              <w:t>11,5090</w:t>
             </w:r>
           </w:p>
         </w:tc>
@@ -6841,6 +7889,7 @@
       <w:tr>
         <w:trPr>
           <w:cantSplit/>
+          <w:jc w:val="center"/>
         </w:trPr>
         <w:tc>
           <w:tcPr>
@@ -6860,7 +7909,7 @@
                 <w:sz w:val="18"/>
                 <w:szCs w:val="18"/>
               </w:rPr>
-              <w:t xml:space="preserve">Uhol ω (Trimble C5)</w:t>
+              <w:t>Uhol ω (Trimble C5)</w:t>
             </w:r>
           </w:p>
         </w:tc>
@@ -6882,12 +7931,13 @@
                 <w:sz w:val="18"/>
                 <w:szCs w:val="18"/>
               </w:rPr>
-              <w:t xml:space="preserve">11,5090 gon</w:t>
+              <w:t>11,5090 gon</w:t>
             </w:r>
           </w:p>
         </w:tc>
       </w:tr>
     </w:tbl>
+    <w:p/>
     <w:sectPr>
       <w:headerReference w:type="default" r:id="rId15"/>
       <w:footerReference w:type="default" r:id="rId16"/>
@@ -8122,4 +9172,16 @@
     </a:ext>
   </a:extLst>
 </a:theme>
+</file>
+
+<file path=customXml/item1.xml><?xml version="1.0" encoding="utf-8"?>
+<b:Sources xmlns:b="http://schemas.openxmlformats.org/officeDocument/2006/bibliography" xmlns="http://schemas.openxmlformats.org/officeDocument/2006/bibliography" SelectedStyle="\APASixthEditionOfficeOnline.xsl" StyleName="APA" Version="6"/>
+</file>
+
+<file path=customXml/itemProps1.xml><?xml version="1.0" encoding="utf-8"?>
+<ds:datastoreItem xmlns:ds="http://schemas.openxmlformats.org/officeDocument/2006/customXml" ds:itemID="{6BE4BB62-3800-4E13-935F-4B39107BECB9}">
+  <ds:schemaRefs>
+    <ds:schemaRef ds:uri="http://schemas.openxmlformats.org/officeDocument/2006/bibliography"/>
+  </ds:schemaRefs>
+</ds:datastoreItem>
 </file>
</xml_diff>